<commit_message>
NEW release 0.1.2 add new
</commit_message>
<xml_diff>
--- a/docs/ITSM_Admin_Guide.docx
+++ b/docs/ITSM_Admin_Guide.docx
@@ -2,7 +2,7 @@
 <file path=word/document.xml><?xml version="1.0" encoding="utf-8"?>
 <w:document xmlns:w="http://schemas.openxmlformats.org/wordprocessingml/2006/main" xmlns:m="http://schemas.openxmlformats.org/officeDocument/2006/math" xmlns:r="http://schemas.openxmlformats.org/officeDocument/2006/relationships" xmlns:o="urn:schemas-microsoft-com:office:office" xmlns:v="urn:schemas-microsoft-com:vml" xmlns:w10="urn:schemas-microsoft-com:office:word" xmlns:a="http://schemas.openxmlformats.org/drawingml/2006/main" xmlns:pic="http://schemas.openxmlformats.org/drawingml/2006/picture" xmlns:wp="http://schemas.openxmlformats.org/drawingml/2006/wordprocessingDrawing">
   <w:body>
-    <w:bookmarkStart w:id="40" w:name="гайд-адміністратора--itsm-system"/>
+    <w:bookmarkStart w:id="45" w:name="гайд-адміністратора--itsm-system"/>
     <w:p>
       <w:pPr>
         <w:pStyle w:val="Heading1"/>
@@ -20,7 +20,7 @@
           <w:iCs/>
           <w:i/>
         </w:rPr>
-        <w:t xml:space="preserve">Версія застосунку: 0.1.1</w:t>
+        <w:t xml:space="preserve">Версія застосунку: 0.1.2</w:t>
       </w:r>
     </w:p>
     <w:p>
@@ -893,19 +893,19 @@
     </w:p>
     <w:bookmarkEnd w:id="26"/>
     <w:bookmarkEnd w:id="27"/>
-    <w:bookmarkStart w:id="30" w:name="Xd3b5b55f0e4fb371b1719581a1ee8c3fa839a70"/>
+    <w:bookmarkStart w:id="31" w:name="X63b4c33a99a162e006c789420382f12ff5de7e4"/>
     <w:p>
       <w:pPr>
         <w:pStyle w:val="Heading2"/>
       </w:pPr>
       <w:r>
-        <w:t xml:space="preserve">4. Керування проєктами (</w:t>
+        <w:t xml:space="preserve">4. Блокування входу після невдалих спроб (</w:t>
       </w:r>
       <w:r>
         <w:rPr>
           <w:rStyle w:val="VerbatimChar"/>
         </w:rPr>
-        <w:t xml:space="preserve">Адмін-панель → Проєкти</w:t>
+        <w:t xml:space="preserve">Адмін-панель → Безпека входу</w:t>
       </w:r>
       <w:r>
         <w:t xml:space="preserve">)</w:t>
@@ -916,16 +916,29 @@
         <w:pStyle w:val="FirstParagraph"/>
       </w:pPr>
       <w:r>
-        <w:t xml:space="preserve">Тут — список усіх проєктів системи з кількістю відкритих задач і власником.</w:t>
-      </w:r>
-    </w:p>
-    <w:bookmarkStart w:id="28" w:name="зміна-видимості"/>
+        <w:t xml:space="preserve">Щоб ускладнити підбір пароля, система тимчасово блокує обліковий запис після декількох поспіль невдалих спроб входу. Блокування прив'язане</w:t>
+      </w:r>
+      <w:r>
+        <w:t xml:space="preserve"> </w:t>
+      </w:r>
+      <w:r>
+        <w:rPr>
+          <w:bCs/>
+          <w:b/>
+        </w:rPr>
+        <w:t xml:space="preserve">до конкретного користувача</w:t>
+      </w:r>
+      <w:r>
+        <w:t xml:space="preserve">, а не до IP-адреси чи браузера — якщо один співробітник кілька разів помилився з паролем, це ніяк не заважає іншим заходити в систему.</w:t>
+      </w:r>
+    </w:p>
+    <w:bookmarkStart w:id="28" w:name="налаштування"/>
     <w:p>
       <w:pPr>
         <w:pStyle w:val="Heading3"/>
       </w:pPr>
       <w:r>
-        <w:t xml:space="preserve">Зміна видимості</w:t>
+        <w:t xml:space="preserve">Налаштування</w:t>
       </w:r>
     </w:p>
     <w:p>
@@ -933,105 +946,22 @@
         <w:pStyle w:val="FirstParagraph"/>
       </w:pPr>
       <w:r>
-        <w:t xml:space="preserve">У стовпці</w:t>
-      </w:r>
-      <w:r>
-        <w:t xml:space="preserve"> </w:t>
-      </w:r>
-      <w:r>
-        <w:rPr>
-          <w:bCs/>
-          <w:b/>
-        </w:rPr>
-        <w:t xml:space="preserve">«Видимість»</w:t>
-      </w:r>
-      <w:r>
-        <w:t xml:space="preserve"> </w:t>
-      </w:r>
-      <w:r>
-        <w:t xml:space="preserve">оберіть потрібне значення зі списку — зміна застосовується одразу, без окремої кнопки «Зберегти». Доступні варіанти: публічний, приватний, обмежений доступ.</w:t>
-      </w:r>
-    </w:p>
-    <w:bookmarkEnd w:id="28"/>
-    <w:bookmarkStart w:id="29" w:name="видалення-проєкту"/>
-    <w:p>
-      <w:pPr>
-        <w:pStyle w:val="Heading3"/>
-      </w:pPr>
-      <w:r>
-        <w:t xml:space="preserve">Видалення проєкту</w:t>
-      </w:r>
-    </w:p>
-    <w:p>
-      <w:pPr>
-        <w:pStyle w:val="FirstParagraph"/>
-      </w:pPr>
-      <w:r>
-        <w:t xml:space="preserve">Це</w:t>
-      </w:r>
-      <w:r>
-        <w:t xml:space="preserve"> </w:t>
-      </w:r>
-      <w:r>
-        <w:rPr>
-          <w:bCs/>
-          <w:b/>
-        </w:rPr>
-        <w:t xml:space="preserve">повністю незворотна</w:t>
-      </w:r>
-      <w:r>
-        <w:t xml:space="preserve"> </w:t>
-      </w:r>
-      <w:r>
-        <w:t xml:space="preserve">дія: видаляються сам проєкт і</w:t>
-      </w:r>
-      <w:r>
-        <w:t xml:space="preserve"> </w:t>
-      </w:r>
-      <w:r>
-        <w:rPr>
-          <w:bCs/>
-          <w:b/>
-        </w:rPr>
-        <w:t xml:space="preserve">всі</w:t>
-      </w:r>
-      <w:r>
-        <w:t xml:space="preserve"> </w:t>
-      </w:r>
-      <w:r>
-        <w:t xml:space="preserve">пов'язані з ним задачі, коментарі, вкладення та записи обліку часу.</w:t>
-      </w:r>
-    </w:p>
-    <w:p>
-      <w:pPr>
-        <w:pStyle w:val="BodyText"/>
-      </w:pPr>
-      <w:r>
-        <w:t xml:space="preserve">Для захисту від випадкового натискання система вимагає ввести</w:t>
-      </w:r>
-      <w:r>
-        <w:t xml:space="preserve"> </w:t>
-      </w:r>
-      <w:r>
-        <w:rPr>
-          <w:bCs/>
-          <w:b/>
-        </w:rPr>
-        <w:t xml:space="preserve">точну назву проєкту</w:t>
-      </w:r>
-      <w:r>
-        <w:t xml:space="preserve"> </w:t>
-      </w:r>
-      <w:r>
-        <w:t xml:space="preserve">в полі підтвердження перед видаленням — без цього видалення не відбудеться.</w:t>
-      </w:r>
-    </w:p>
-    <w:p>
-      <w:pPr>
-        <w:pStyle w:val="BodyText"/>
-      </w:pPr>
-      <w:r>
-        <w:t xml:space="preserve">Перед видаленням проєкту переконайтеся, що:</w:t>
+        <w:t xml:space="preserve">На сторінці</w:t>
+      </w:r>
+      <w:r>
+        <w:t xml:space="preserve"> </w:t>
+      </w:r>
+      <w:r>
+        <w:rPr>
+          <w:rStyle w:val="VerbatimChar"/>
+        </w:rPr>
+        <w:t xml:space="preserve">/admin/security</w:t>
+      </w:r>
+      <w:r>
+        <w:t xml:space="preserve"> </w:t>
+      </w:r>
+      <w:r>
+        <w:t xml:space="preserve">вкажіть:</w:t>
       </w:r>
     </w:p>
     <w:p>
@@ -1043,7 +973,17 @@
         <w:pStyle w:val="Compact"/>
       </w:pPr>
       <w:r>
-        <w:t xml:space="preserve">всю потрібну звітність (облік часу, перелік задач) уже вивантажено, якщо вона знадобиться пізніше;</w:t>
+        <w:rPr>
+          <w:bCs/>
+          <w:b/>
+        </w:rPr>
+        <w:t xml:space="preserve">Кількість невдалих спроб до блокування</w:t>
+      </w:r>
+      <w:r>
+        <w:t xml:space="preserve"> </w:t>
+      </w:r>
+      <w:r>
+        <w:t xml:space="preserve">(від 1 до 20, за замовчуванням 5);</w:t>
       </w:r>
     </w:p>
     <w:p>
@@ -1055,7 +995,114 @@
         <w:pStyle w:val="Compact"/>
       </w:pPr>
       <w:r>
-        <w:t xml:space="preserve">проєкт справді більше не потрібен — окремої функції «Архівувати» замість видалення в інтерфейсі поки немає (див. розділ 11).</w:t>
+        <w:rPr>
+          <w:bCs/>
+          <w:b/>
+        </w:rPr>
+        <w:t xml:space="preserve">Тривалість блокування</w:t>
+      </w:r>
+      <w:r>
+        <w:t xml:space="preserve"> </w:t>
+      </w:r>
+      <w:r>
+        <w:t xml:space="preserve">в хвилинах (від 1 до 1440, тобто до доби; за замовчуванням 15).</w:t>
+      </w:r>
+    </w:p>
+    <w:p>
+      <w:pPr>
+        <w:pStyle w:val="FirstParagraph"/>
+      </w:pPr>
+      <w:r>
+        <w:t xml:space="preserve">Зміна застосовується одразу до всіх майбутніх спроб входу.</w:t>
+      </w:r>
+    </w:p>
+    <w:bookmarkEnd w:id="28"/>
+    <w:bookmarkStart w:id="29" w:name="як-це-виглядає-для-користувача"/>
+    <w:p>
+      <w:pPr>
+        <w:pStyle w:val="Heading3"/>
+      </w:pPr>
+      <w:r>
+        <w:t xml:space="preserve">Як це виглядає для користувача</w:t>
+      </w:r>
+    </w:p>
+    <w:p>
+      <w:pPr>
+        <w:pStyle w:val="FirstParagraph"/>
+      </w:pPr>
+      <w:r>
+        <w:t xml:space="preserve">Після кожної невдалої спроби форма входу показує, скільки спроб лишилось («Невірний email або пароль. Залишилось спроб до тимчасового блокування: 2»). Після вичерпання ліміту — повідомлення про блокування з часом очікування.</w:t>
+      </w:r>
+      <w:r>
+        <w:t xml:space="preserve"> </w:t>
+      </w:r>
+      <w:r>
+        <w:rPr>
+          <w:bCs/>
+          <w:b/>
+        </w:rPr>
+        <w:t xml:space="preserve">Поки блокування діє, навіть правильний пароль не приймається</w:t>
+      </w:r>
+      <w:r>
+        <w:t xml:space="preserve"> </w:t>
+      </w:r>
+      <w:r>
+        <w:t xml:space="preserve">— це очікувано, а не баг. Лічильник спроб автоматично скидається до нуля одразу після наступного вдалого входу.</w:t>
+      </w:r>
+    </w:p>
+    <w:bookmarkEnd w:id="29"/>
+    <w:bookmarkStart w:id="30" w:name="ручне-зняття-блокування"/>
+    <w:p>
+      <w:pPr>
+        <w:pStyle w:val="Heading3"/>
+      </w:pPr>
+      <w:r>
+        <w:t xml:space="preserve">Ручне зняття блокування</w:t>
+      </w:r>
+    </w:p>
+    <w:p>
+      <w:pPr>
+        <w:pStyle w:val="FirstParagraph"/>
+      </w:pPr>
+      <w:r>
+        <w:t xml:space="preserve">Якщо співробітнику потрібен негайний доступ, не чекаючи закінчення таймауту — на сторінці</w:t>
+      </w:r>
+      <w:r>
+        <w:t xml:space="preserve"> </w:t>
+      </w:r>
+      <w:r>
+        <w:rPr>
+          <w:bCs/>
+          <w:b/>
+        </w:rPr>
+        <w:t xml:space="preserve">«Користувачі»</w:t>
+      </w:r>
+      <w:r>
+        <w:t xml:space="preserve"> </w:t>
+      </w:r>
+      <w:r>
+        <w:t xml:space="preserve">заблокований обліковий запис позначений червоним бейджем «Заблоковано до ГГ:ХХ ДД.ММ», і поруч із ним з'являється кнопка</w:t>
+      </w:r>
+      <w:r>
+        <w:t xml:space="preserve"> </w:t>
+      </w:r>
+      <w:r>
+        <w:rPr>
+          <w:bCs/>
+          <w:b/>
+        </w:rPr>
+        <w:t xml:space="preserve">«Зняти блокування»</w:t>
+      </w:r>
+      <w:r>
+        <w:t xml:space="preserve">. Натискання одразу скидає і блокування, і лічильник невдалих спроб.</w:t>
+      </w:r>
+    </w:p>
+    <w:p>
+      <w:pPr>
+        <w:pStyle w:val="BlockText"/>
+      </w:pPr>
+      <w:r>
+        <w:t xml:space="preserve">Кожне автоматичне блокування, ручне розблокування адміністратором і зміна налаштувань фіксуються в журналі аудиту (розділ 8) — можна перевірити, хто і коли це робив.</w:t>
       </w:r>
     </w:p>
     <w:p>
@@ -1065,15 +1112,24 @@
         </w:pict>
       </w:r>
     </w:p>
-    <w:bookmarkEnd w:id="29"/>
     <w:bookmarkEnd w:id="30"/>
-    <w:bookmarkStart w:id="31" w:name="X9c98e13611c026e71c9fbf64a0df66e228a992d"/>
+    <w:bookmarkEnd w:id="31"/>
+    <w:bookmarkStart w:id="35" w:name="X3d8054a9a89b17e1d29b885a266aa29011fefde"/>
     <w:p>
       <w:pPr>
         <w:pStyle w:val="Heading2"/>
       </w:pPr>
       <w:r>
-        <w:t xml:space="preserve">5. Хто бачить проєкт чи тікет</w:t>
+        <w:t xml:space="preserve">5. Керування проєктами (</w:t>
+      </w:r>
+      <w:r>
+        <w:rPr>
+          <w:rStyle w:val="VerbatimChar"/>
+        </w:rPr>
+        <w:t xml:space="preserve">Адмін-панель → Проєкти</w:t>
+      </w:r>
+      <w:r>
+        <w:t xml:space="preserve">)</w:t>
       </w:r>
     </w:p>
     <w:p>
@@ -1081,41 +1137,74 @@
         <w:pStyle w:val="FirstParagraph"/>
       </w:pPr>
       <w:r>
-        <w:t xml:space="preserve">Це стосується</w:t>
-      </w:r>
-      <w:r>
-        <w:t xml:space="preserve"> </w:t>
-      </w:r>
-      <w:r>
-        <w:rPr>
-          <w:bCs/>
-          <w:b/>
-        </w:rPr>
-        <w:t xml:space="preserve">всіх</w:t>
-      </w:r>
-      <w:r>
-        <w:t xml:space="preserve"> </w:t>
-      </w:r>
-      <w:r>
-        <w:t xml:space="preserve">ролей, окрім адміністратора системи, який завжди бачить усе.</w:t>
-      </w:r>
-    </w:p>
-    <w:p>
-      <w:pPr>
-        <w:pStyle w:val="BodyText"/>
-      </w:pPr>
-      <w:r>
-        <w:rPr>
-          <w:bCs/>
-          <w:b/>
-        </w:rPr>
-        <w:t xml:space="preserve">Проєкт</w:t>
-      </w:r>
-      <w:r>
-        <w:t xml:space="preserve"> </w:t>
-      </w:r>
-      <w:r>
-        <w:t xml:space="preserve">видно лише:</w:t>
+        <w:t xml:space="preserve">Тут — список усіх проєктів системи з кількістю відкритих задач і власником.</w:t>
+      </w:r>
+    </w:p>
+    <w:bookmarkStart w:id="32" w:name="зміна-видимості"/>
+    <w:p>
+      <w:pPr>
+        <w:pStyle w:val="Heading3"/>
+      </w:pPr>
+      <w:r>
+        <w:t xml:space="preserve">Зміна видимості</w:t>
+      </w:r>
+    </w:p>
+    <w:p>
+      <w:pPr>
+        <w:pStyle w:val="FirstParagraph"/>
+      </w:pPr>
+      <w:r>
+        <w:t xml:space="preserve">У стовпці</w:t>
+      </w:r>
+      <w:r>
+        <w:t xml:space="preserve"> </w:t>
+      </w:r>
+      <w:r>
+        <w:rPr>
+          <w:bCs/>
+          <w:b/>
+        </w:rPr>
+        <w:t xml:space="preserve">«Видимість»</w:t>
+      </w:r>
+      <w:r>
+        <w:t xml:space="preserve"> </w:t>
+      </w:r>
+      <w:r>
+        <w:t xml:space="preserve">оберіть потрібне значення зі списку — зміна застосовується одразу, без окремої кнопки «Зберегти». Доступні варіанти: публічний, приватний, обмежений доступ.</w:t>
+      </w:r>
+    </w:p>
+    <w:bookmarkEnd w:id="32"/>
+    <w:bookmarkStart w:id="33" w:name="зміна-статусу-архівування"/>
+    <w:p>
+      <w:pPr>
+        <w:pStyle w:val="Heading3"/>
+      </w:pPr>
+      <w:r>
+        <w:t xml:space="preserve">Зміна статусу (архівування)</w:t>
+      </w:r>
+    </w:p>
+    <w:p>
+      <w:pPr>
+        <w:pStyle w:val="FirstParagraph"/>
+      </w:pPr>
+      <w:r>
+        <w:t xml:space="preserve">У стовпці</w:t>
+      </w:r>
+      <w:r>
+        <w:t xml:space="preserve"> </w:t>
+      </w:r>
+      <w:r>
+        <w:rPr>
+          <w:bCs/>
+          <w:b/>
+        </w:rPr>
+        <w:t xml:space="preserve">«Статус»</w:t>
+      </w:r>
+      <w:r>
+        <w:t xml:space="preserve"> </w:t>
+      </w:r>
+      <w:r>
+        <w:t xml:space="preserve">так само оберіть зі списку — застосовується одразу. Три варіанти:</w:t>
       </w:r>
     </w:p>
     <w:p>
@@ -1127,7 +1216,17 @@
         <w:pStyle w:val="Compact"/>
       </w:pPr>
       <w:r>
-        <w:t xml:space="preserve">тому, хто його створив;</w:t>
+        <w:rPr>
+          <w:bCs/>
+          <w:b/>
+        </w:rPr>
+        <w:t xml:space="preserve">Активний</w:t>
+      </w:r>
+      <w:r>
+        <w:t xml:space="preserve"> </w:t>
+      </w:r>
+      <w:r>
+        <w:t xml:space="preserve">(зелений) — звичайний робочий стан;</w:t>
       </w:r>
     </w:p>
     <w:p>
@@ -1139,7 +1238,17 @@
         <w:pStyle w:val="Compact"/>
       </w:pPr>
       <w:r>
-        <w:t xml:space="preserve">відповідальному за проєкт (призначається в п. 6 нижче);</w:t>
+        <w:rPr>
+          <w:bCs/>
+          <w:b/>
+        </w:rPr>
+        <w:t xml:space="preserve">Архівний</w:t>
+      </w:r>
+      <w:r>
+        <w:t xml:space="preserve"> </w:t>
+      </w:r>
+      <w:r>
+        <w:t xml:space="preserve">(сірий) — для завершених чи призупинених проєктів, які варто зберегти, але прибрати з активної роботи;</w:t>
       </w:r>
     </w:p>
     <w:p>
@@ -1151,7 +1260,51 @@
         <w:pStyle w:val="Compact"/>
       </w:pPr>
       <w:r>
-        <w:t xml:space="preserve">адміністратору системи.</w:t>
+        <w:rPr>
+          <w:bCs/>
+          <w:b/>
+        </w:rPr>
+        <w:t xml:space="preserve">Закритий</w:t>
+      </w:r>
+      <w:r>
+        <w:t xml:space="preserve"> </w:t>
+      </w:r>
+      <w:r>
+        <w:t xml:space="preserve">(чорний) — остаточно завершений проєкт.</w:t>
+      </w:r>
+    </w:p>
+    <w:p>
+      <w:pPr>
+        <w:pStyle w:val="BlockText"/>
+      </w:pPr>
+      <w:r>
+        <w:t xml:space="preserve">Зміна статусу</w:t>
+      </w:r>
+      <w:r>
+        <w:t xml:space="preserve"> </w:t>
+      </w:r>
+      <w:r>
+        <w:rPr>
+          <w:bCs/>
+          <w:b/>
+        </w:rPr>
+        <w:t xml:space="preserve">нічого не приховує й не видаляє</w:t>
+      </w:r>
+      <w:r>
+        <w:t xml:space="preserve"> </w:t>
+      </w:r>
+      <w:r>
+        <w:t xml:space="preserve">— це лише позначка. Сам проєкт, його задачі та історія лишаються доступними так само, як і раніше (з урахуванням звичайних правил видимості, розділ 6). Якщо потрібно повністю прибрати проєкт — див. «Видалення проєкту» нижче.</w:t>
+      </w:r>
+    </w:p>
+    <w:bookmarkEnd w:id="33"/>
+    <w:bookmarkStart w:id="34" w:name="видалення-проєкту"/>
+    <w:p>
+      <w:pPr>
+        <w:pStyle w:val="Heading3"/>
+      </w:pPr>
+      <w:r>
+        <w:t xml:space="preserve">Видалення проєкту</w:t>
       </w:r>
     </w:p>
     <w:p>
@@ -1159,34 +1312,39 @@
         <w:pStyle w:val="FirstParagraph"/>
       </w:pPr>
       <w:r>
-        <w:t xml:space="preserve">Усі інші користувачі не побачать проєкт ні в списку</w:t>
-      </w:r>
-      <w:r>
-        <w:t xml:space="preserve"> </w:t>
-      </w:r>
-      <w:r>
-        <w:rPr>
-          <w:rStyle w:val="VerbatimChar"/>
-        </w:rPr>
-        <w:t xml:space="preserve">/projects</w:t>
-      </w:r>
-      <w:r>
-        <w:t xml:space="preserve">, ні за прямим посиланням (система покаже «Доступ обмежено»). Це стосується й задач усередині такого проєкту — переглянути задачу, залишити коментар, змінити статус чи побачити її на сторінці</w:t>
-      </w:r>
-      <w:r>
-        <w:t xml:space="preserve"> </w:t>
-      </w:r>
-      <w:r>
-        <w:rPr>
-          <w:rStyle w:val="VerbatimChar"/>
-        </w:rPr>
-        <w:t xml:space="preserve">/tasks</w:t>
-      </w:r>
-      <w:r>
-        <w:t xml:space="preserve"> </w:t>
-      </w:r>
-      <w:r>
-        <w:t xml:space="preserve">(загальний список відкритих задач) можуть лише ті самі люди.</w:t>
+        <w:t xml:space="preserve">Це</w:t>
+      </w:r>
+      <w:r>
+        <w:t xml:space="preserve"> </w:t>
+      </w:r>
+      <w:r>
+        <w:rPr>
+          <w:bCs/>
+          <w:b/>
+        </w:rPr>
+        <w:t xml:space="preserve">повністю незворотна</w:t>
+      </w:r>
+      <w:r>
+        <w:t xml:space="preserve"> </w:t>
+      </w:r>
+      <w:r>
+        <w:t xml:space="preserve">дія: видаляються сам проєкт і</w:t>
+      </w:r>
+      <w:r>
+        <w:t xml:space="preserve"> </w:t>
+      </w:r>
+      <w:r>
+        <w:rPr>
+          <w:bCs/>
+          <w:b/>
+        </w:rPr>
+        <w:t xml:space="preserve">всі</w:t>
+      </w:r>
+      <w:r>
+        <w:t xml:space="preserve"> </w:t>
+      </w:r>
+      <w:r>
+        <w:t xml:space="preserve">пов'язані з ним задачі, коментарі, вкладення та записи обліку часу.</w:t>
       </w:r>
     </w:p>
     <w:p>
@@ -1194,17 +1352,31 @@
         <w:pStyle w:val="BodyText"/>
       </w:pPr>
       <w:r>
-        <w:rPr>
-          <w:bCs/>
-          <w:b/>
-        </w:rPr>
-        <w:t xml:space="preserve">Тікет</w:t>
-      </w:r>
-      <w:r>
-        <w:t xml:space="preserve"> </w:t>
-      </w:r>
-      <w:r>
-        <w:t xml:space="preserve">видно лише:</w:t>
+        <w:t xml:space="preserve">Для захисту від випадкового натискання система вимагає ввести</w:t>
+      </w:r>
+      <w:r>
+        <w:t xml:space="preserve"> </w:t>
+      </w:r>
+      <w:r>
+        <w:rPr>
+          <w:bCs/>
+          <w:b/>
+        </w:rPr>
+        <w:t xml:space="preserve">точну назву проєкту</w:t>
+      </w:r>
+      <w:r>
+        <w:t xml:space="preserve"> </w:t>
+      </w:r>
+      <w:r>
+        <w:t xml:space="preserve">в полі підтвердження перед видаленням — без цього видалення не відбудеться.</w:t>
+      </w:r>
+    </w:p>
+    <w:p>
+      <w:pPr>
+        <w:pStyle w:val="BodyText"/>
+      </w:pPr>
+      <w:r>
+        <w:t xml:space="preserve">Перед видаленням проєкту переконайтеся, що:</w:t>
       </w:r>
     </w:p>
     <w:p>
@@ -1216,7 +1388,7 @@
         <w:pStyle w:val="Compact"/>
       </w:pPr>
       <w:r>
-        <w:t xml:space="preserve">заявнику (хто його створив);</w:t>
+        <w:t xml:space="preserve">всю потрібну звітність (облік часу, перелік задач) уже вивантажено, якщо вона знадобиться пізніше;</w:t>
       </w:r>
     </w:p>
     <w:p>
@@ -1228,45 +1400,7 @@
         <w:pStyle w:val="Compact"/>
       </w:pPr>
       <w:r>
-        <w:t xml:space="preserve">призначеному оператору;</w:t>
-      </w:r>
-    </w:p>
-    <w:p>
-      <w:pPr>
-        <w:numPr>
-          <w:ilvl w:val="0"/>
-          <w:numId w:val="1007"/>
-        </w:numPr>
-        <w:pStyle w:val="Compact"/>
-      </w:pPr>
-      <w:r>
-        <w:t xml:space="preserve">адміністратору системи.</w:t>
-      </w:r>
-    </w:p>
-    <w:p>
-      <w:pPr>
-        <w:pStyle w:val="BlockText"/>
-      </w:pPr>
-      <w:r>
-        <w:rPr>
-          <w:bCs/>
-          <w:b/>
-        </w:rPr>
-        <w:t xml:space="preserve">Важливий наслідок:</w:t>
-      </w:r>
-      <w:r>
-        <w:t xml:space="preserve"> </w:t>
-      </w:r>
-      <w:r>
-        <w:t xml:space="preserve">оператор служби підтримки чи керівник ІТ-підрозділу (якщо не адміністратор) не бачать чергу непризначених тікетів — лише ті, що вже стосуються їх особисто. Призначити оператора на новий тікет наразі може лише адміністратор системи (розділ 8), оскільки лише він бачить усі тікети одразу.</w:t>
-      </w:r>
-    </w:p>
-    <w:p>
-      <w:pPr>
-        <w:pStyle w:val="FirstParagraph"/>
-      </w:pPr>
-      <w:r>
-        <w:t xml:space="preserve">Якщо потрібна для когось особливий доступ до проєкту чи тікета — призначте цю людину відповідальним/оператором (розділ 8).</w:t>
+        <w:t xml:space="preserve">проєкт справді більше не потрібен назавжди — якщо є сумнів, краще позначити його «Архівний» (див. вище), а не видаляти.</w:t>
       </w:r>
     </w:p>
     <w:p>
@@ -1276,14 +1410,15 @@
         </w:pict>
       </w:r>
     </w:p>
-    <w:bookmarkEnd w:id="31"/>
-    <w:bookmarkStart w:id="32" w:name="X081fc389be571e22e95828e36233cfd1b412819"/>
+    <w:bookmarkEnd w:id="34"/>
+    <w:bookmarkEnd w:id="35"/>
+    <w:bookmarkStart w:id="36" w:name="X4b7ded1955befdfabf08dca47056cc183b5d38e"/>
     <w:p>
       <w:pPr>
         <w:pStyle w:val="Heading2"/>
       </w:pPr>
       <w:r>
-        <w:t xml:space="preserve">6. Створення звичайних проєктів і задач</w:t>
+        <w:t xml:space="preserve">6. Хто бачить проєкт чи тікет</w:t>
       </w:r>
     </w:p>
     <w:p>
@@ -1291,20 +1426,85 @@
         <w:pStyle w:val="FirstParagraph"/>
       </w:pPr>
       <w:r>
-        <w:t xml:space="preserve">Як адміністратор, ви також бачите звичайний інтерфейс (пункт меню</w:t>
-      </w:r>
-      <w:r>
-        <w:t xml:space="preserve"> </w:t>
-      </w:r>
-      <w:r>
-        <w:rPr>
-          <w:bCs/>
-          <w:b/>
-        </w:rPr>
-        <w:t xml:space="preserve">«Проєкти»</w:t>
-      </w:r>
-      <w:r>
-        <w:t xml:space="preserve">) — там само створюються проєкти й задачі, як описано в</w:t>
+        <w:t xml:space="preserve">Це стосується</w:t>
+      </w:r>
+      <w:r>
+        <w:t xml:space="preserve"> </w:t>
+      </w:r>
+      <w:r>
+        <w:rPr>
+          <w:bCs/>
+          <w:b/>
+        </w:rPr>
+        <w:t xml:space="preserve">всіх</w:t>
+      </w:r>
+      <w:r>
+        <w:t xml:space="preserve"> </w:t>
+      </w:r>
+      <w:r>
+        <w:t xml:space="preserve">ролей, окрім адміністратора системи, який завжди бачить усе.</w:t>
+      </w:r>
+    </w:p>
+    <w:p>
+      <w:pPr>
+        <w:pStyle w:val="BodyText"/>
+      </w:pPr>
+      <w:r>
+        <w:rPr>
+          <w:bCs/>
+          <w:b/>
+        </w:rPr>
+        <w:t xml:space="preserve">Проєкт</w:t>
+      </w:r>
+      <w:r>
+        <w:t xml:space="preserve"> </w:t>
+      </w:r>
+      <w:r>
+        <w:t xml:space="preserve">видно лише:</w:t>
+      </w:r>
+    </w:p>
+    <w:p>
+      <w:pPr>
+        <w:numPr>
+          <w:ilvl w:val="0"/>
+          <w:numId w:val="1008"/>
+        </w:numPr>
+        <w:pStyle w:val="Compact"/>
+      </w:pPr>
+      <w:r>
+        <w:t xml:space="preserve">тому, хто його створив;</w:t>
+      </w:r>
+    </w:p>
+    <w:p>
+      <w:pPr>
+        <w:numPr>
+          <w:ilvl w:val="0"/>
+          <w:numId w:val="1008"/>
+        </w:numPr>
+        <w:pStyle w:val="Compact"/>
+      </w:pPr>
+      <w:r>
+        <w:t xml:space="preserve">відповідальному за проєкт (призначається в розділі 9 нижче);</w:t>
+      </w:r>
+    </w:p>
+    <w:p>
+      <w:pPr>
+        <w:numPr>
+          <w:ilvl w:val="0"/>
+          <w:numId w:val="1008"/>
+        </w:numPr>
+        <w:pStyle w:val="Compact"/>
+      </w:pPr>
+      <w:r>
+        <w:t xml:space="preserve">адміністратору системи.</w:t>
+      </w:r>
+    </w:p>
+    <w:p>
+      <w:pPr>
+        <w:pStyle w:val="FirstParagraph"/>
+      </w:pPr>
+      <w:r>
+        <w:t xml:space="preserve">Усі інші користувачі не побачать проєкт ні в списку</w:t>
       </w:r>
       <w:r>
         <w:t xml:space="preserve"> </w:t>
@@ -1313,10 +1513,10 @@
         <w:rPr>
           <w:rStyle w:val="VerbatimChar"/>
         </w:rPr>
-        <w:t xml:space="preserve">docs/USER_GUIDE.md</w:t>
-      </w:r>
-      <w:r>
-        <w:t xml:space="preserve">. Права на створення проєкту мають ролі «Адміністратор системи» та «Керівник ІТ-підрозділу». На сторінці кожного проєкту доступні канбан-дошка («📋 Канбан-дошка», перетягування задач між статусами), діаграма Ганта («📊 Діаграма Ганта», терміни та залежності задач з можливістю перетягування) та дорожня карта («🗺️ Дорожня карта», етапи/контрольні точки з прогрес-баром на основі прив'язаних задач — створювати й видаляти етапи можуть лише ролі admin/it_manager, змінювати статус етапу — будь-хто з доступом до проєкту) — детальніше в</w:t>
+        <w:t xml:space="preserve">/projects</w:t>
+      </w:r>
+      <w:r>
+        <w:t xml:space="preserve">, ні за прямим посиланням (система покаже «Доступ обмежено»). Це стосується й задач усередині такого проєкту — переглянути задачу, залишити коментар, змінити статус чи побачити її на сторінці</w:t>
       </w:r>
       <w:r>
         <w:t xml:space="preserve"> </w:t>
@@ -1325,10 +1525,93 @@
         <w:rPr>
           <w:rStyle w:val="VerbatimChar"/>
         </w:rPr>
-        <w:t xml:space="preserve">docs/USER_GUIDE.md</w:t>
-      </w:r>
-      <w:r>
-        <w:t xml:space="preserve">, розділи 4.5–4.7.</w:t>
+        <w:t xml:space="preserve">/tasks</w:t>
+      </w:r>
+      <w:r>
+        <w:t xml:space="preserve"> </w:t>
+      </w:r>
+      <w:r>
+        <w:t xml:space="preserve">(загальний список відкритих задач) можуть лише ті самі люди.</w:t>
+      </w:r>
+    </w:p>
+    <w:p>
+      <w:pPr>
+        <w:pStyle w:val="BodyText"/>
+      </w:pPr>
+      <w:r>
+        <w:rPr>
+          <w:bCs/>
+          <w:b/>
+        </w:rPr>
+        <w:t xml:space="preserve">Тікет</w:t>
+      </w:r>
+      <w:r>
+        <w:t xml:space="preserve"> </w:t>
+      </w:r>
+      <w:r>
+        <w:t xml:space="preserve">видно лише:</w:t>
+      </w:r>
+    </w:p>
+    <w:p>
+      <w:pPr>
+        <w:numPr>
+          <w:ilvl w:val="0"/>
+          <w:numId w:val="1009"/>
+        </w:numPr>
+        <w:pStyle w:val="Compact"/>
+      </w:pPr>
+      <w:r>
+        <w:t xml:space="preserve">заявнику (хто його створив);</w:t>
+      </w:r>
+    </w:p>
+    <w:p>
+      <w:pPr>
+        <w:numPr>
+          <w:ilvl w:val="0"/>
+          <w:numId w:val="1009"/>
+        </w:numPr>
+        <w:pStyle w:val="Compact"/>
+      </w:pPr>
+      <w:r>
+        <w:t xml:space="preserve">призначеному оператору;</w:t>
+      </w:r>
+    </w:p>
+    <w:p>
+      <w:pPr>
+        <w:numPr>
+          <w:ilvl w:val="0"/>
+          <w:numId w:val="1009"/>
+        </w:numPr>
+        <w:pStyle w:val="Compact"/>
+      </w:pPr>
+      <w:r>
+        <w:t xml:space="preserve">адміністратору системи.</w:t>
+      </w:r>
+    </w:p>
+    <w:p>
+      <w:pPr>
+        <w:pStyle w:val="BlockText"/>
+      </w:pPr>
+      <w:r>
+        <w:rPr>
+          <w:bCs/>
+          <w:b/>
+        </w:rPr>
+        <w:t xml:space="preserve">Важливий наслідок:</w:t>
+      </w:r>
+      <w:r>
+        <w:t xml:space="preserve"> </w:t>
+      </w:r>
+      <w:r>
+        <w:t xml:space="preserve">оператор служби підтримки чи керівник ІТ-підрозділу (якщо не адміністратор) не бачать чергу непризначених тікетів — лише ті, що вже стосуються їх особисто. Призначити оператора на новий тікет наразі може лише адміністратор системи (розділ 9), оскільки лише він бачить усі тікети одразу.</w:t>
+      </w:r>
+    </w:p>
+    <w:p>
+      <w:pPr>
+        <w:pStyle w:val="FirstParagraph"/>
+      </w:pPr>
+      <w:r>
+        <w:t xml:space="preserve">Якщо потрібна для когось особливий доступ до проєкту чи тікета — призначте цю людину відповідальним/оператором (розділ 9).</w:t>
       </w:r>
     </w:p>
     <w:p>
@@ -1338,359 +1621,59 @@
         </w:pict>
       </w:r>
     </w:p>
-    <w:bookmarkEnd w:id="32"/>
-    <w:bookmarkStart w:id="33" w:name="Xa0a9a690c08647492a566647eda498d63f4b624"/>
+    <w:bookmarkEnd w:id="36"/>
+    <w:bookmarkStart w:id="37" w:name="X6f99d05fbb3938bbf742239907e4d810e2aabe3"/>
     <w:p>
       <w:pPr>
         <w:pStyle w:val="Heading2"/>
       </w:pPr>
       <w:r>
-        <w:t xml:space="preserve">7. Загальний огляд по всій системі (</w:t>
+        <w:t xml:space="preserve">7. Створення звичайних проєктів і задач</w:t>
+      </w:r>
+    </w:p>
+    <w:p>
+      <w:pPr>
+        <w:pStyle w:val="FirstParagraph"/>
+      </w:pPr>
+      <w:r>
+        <w:t xml:space="preserve">Як адміністратор, ви також бачите звичайний інтерфейс (пункт меню</w:t>
+      </w:r>
+      <w:r>
+        <w:t xml:space="preserve"> </w:t>
+      </w:r>
+      <w:r>
+        <w:rPr>
+          <w:bCs/>
+          <w:b/>
+        </w:rPr>
+        <w:t xml:space="preserve">«Проєкти»</w:t>
+      </w:r>
+      <w:r>
+        <w:t xml:space="preserve">) — там само створюються проєкти й задачі, як описано в</w:t>
+      </w:r>
+      <w:r>
+        <w:t xml:space="preserve"> </w:t>
       </w:r>
       <w:r>
         <w:rPr>
           <w:rStyle w:val="VerbatimChar"/>
         </w:rPr>
-        <w:t xml:space="preserve">Адмін-панель → Канбан / Гант / Облік часу — усі проєкти</w:t>
-      </w:r>
-      <w:r>
-        <w:t xml:space="preserve">)</w:t>
-      </w:r>
-    </w:p>
-    <w:p>
-      <w:pPr>
-        <w:pStyle w:val="FirstParagraph"/>
-      </w:pPr>
-      <w:r>
-        <w:t xml:space="preserve">На відміну від звичайних канбан-дошки й діаграми Ганта (розділ 6), які показують задачі лише</w:t>
-      </w:r>
-      <w:r>
-        <w:t xml:space="preserve"> </w:t>
-      </w:r>
-      <w:r>
-        <w:rPr>
-          <w:bCs/>
-          <w:b/>
-        </w:rPr>
-        <w:t xml:space="preserve">одного</w:t>
-      </w:r>
-      <w:r>
-        <w:t xml:space="preserve"> </w:t>
-      </w:r>
-      <w:r>
-        <w:t xml:space="preserve">проєкту, ці сторінки на головній адмін-панелі об'єднують дані</w:t>
-      </w:r>
-      <w:r>
-        <w:t xml:space="preserve"> </w:t>
-      </w:r>
-      <w:r>
-        <w:rPr>
-          <w:bCs/>
-          <w:b/>
-        </w:rPr>
-        <w:t xml:space="preserve">з усіх проєктів одразу</w:t>
-      </w:r>
-      <w:r>
-        <w:t xml:space="preserve"> </w:t>
-      </w:r>
-      <w:r>
-        <w:t xml:space="preserve">— зручно, щоб оцінити загальне навантаження, не переходячи по кожному проєкту окремо. Доступ — лише роль «Адміністратор системи»; інші ролі отримають помилку доступу навіть якщо спробують перейти за прямим посиланням.</w:t>
-      </w:r>
-    </w:p>
-    <w:p>
-      <w:pPr>
-        <w:numPr>
-          <w:ilvl w:val="0"/>
-          <w:numId w:val="1008"/>
-        </w:numPr>
-        <w:pStyle w:val="Compact"/>
-      </w:pPr>
-      <w:r>
-        <w:rPr>
-          <w:bCs/>
-          <w:b/>
-        </w:rPr>
-        <w:t xml:space="preserve">«📋 Канбан — усі проєкти»</w:t>
-      </w:r>
-      <w:r>
-        <w:t xml:space="preserve"> </w:t>
-      </w:r>
-      <w:r>
-        <w:t xml:space="preserve">(</w:t>
+        <w:t xml:space="preserve">docs/USER_GUIDE.md</w:t>
+      </w:r>
+      <w:r>
+        <w:t xml:space="preserve">. Права на створення проєкту мають ролі «Адміністратор системи» та «Керівник ІТ-підрозділу». На сторінці кожного проєкту доступні канбан-дошка («📋 Канбан-дошка», перетягування задач між статусами), діаграма Ганта («📊 Діаграма Ганта», терміни та залежності задач з можливістю перетягування) та дорожня карта («🗺️ Дорожня карта», етапи/контрольні точки з прогрес-баром на основі прив'язаних задач — створювати й видаляти етапи можуть лише ролі admin/it_manager, змінювати статус етапу — будь-хто з доступом до проєкту) — детальніше в</w:t>
+      </w:r>
+      <w:r>
+        <w:t xml:space="preserve"> </w:t>
       </w:r>
       <w:r>
         <w:rPr>
           <w:rStyle w:val="VerbatimChar"/>
         </w:rPr>
-        <w:t xml:space="preserve">/admin/board</w:t>
-      </w:r>
-      <w:r>
-        <w:t xml:space="preserve">) — та сама логіка колонок за статусом, що й на дошці проєкту, але кожна картка додатково позначена бейджем з назвою свого проєкту, а текст на картках дрібніший, ніж на дошці одного проєкту — тут карток одночасно набагато більше, тож компактніший вигляд дає побачити більше без прокрутки. Перетягування між колонками працює так само.</w:t>
-      </w:r>
-    </w:p>
-    <w:p>
-      <w:pPr>
-        <w:numPr>
-          <w:ilvl w:val="0"/>
-          <w:numId w:val="1008"/>
-        </w:numPr>
-        <w:pStyle w:val="Compact"/>
-      </w:pPr>
-      <w:r>
-        <w:rPr>
-          <w:bCs/>
-          <w:b/>
-        </w:rPr>
-        <w:t xml:space="preserve">«📊 Гант — усі проєкти»</w:t>
-      </w:r>
-      <w:r>
-        <w:t xml:space="preserve"> </w:t>
-      </w:r>
-      <w:r>
-        <w:t xml:space="preserve">(</w:t>
-      </w:r>
-      <w:r>
-        <w:rPr>
-          <w:rStyle w:val="VerbatimChar"/>
-        </w:rPr>
-        <w:t xml:space="preserve">/admin/gantt</w:t>
-      </w:r>
-      <w:r>
-        <w:t xml:space="preserve">) — та сама діаграма, але назва кожної смуги починається з назви проєкту (наприклад, «[Мій проєкт] #12 Назва задачі»). При відкритті сторінки діаграма прокручується так, щоб</w:t>
-      </w:r>
-      <w:r>
-        <w:t xml:space="preserve"> </w:t>
-      </w:r>
-      <w:r>
-        <w:rPr>
-          <w:bCs/>
-          <w:b/>
-        </w:rPr>
-        <w:t xml:space="preserve">«сьогодні» було ліворуч</w:t>
-      </w:r>
-      <w:r>
-        <w:t xml:space="preserve">, а не по центру, як зазвичай, — щоб одразу бачити все майбутнє навантаження, не гортаючи вліво. Перетягування смуги так само зберігає нові дати.</w:t>
-      </w:r>
-    </w:p>
-    <w:p>
-      <w:pPr>
-        <w:numPr>
-          <w:ilvl w:val="0"/>
-          <w:numId w:val="1008"/>
-        </w:numPr>
-        <w:pStyle w:val="Compact"/>
-      </w:pPr>
-      <w:r>
-        <w:rPr>
-          <w:bCs/>
-          <w:b/>
-        </w:rPr>
-        <w:t xml:space="preserve">Додавання нової залежності між задачами тут недоступне</w:t>
-      </w:r>
-      <w:r>
-        <w:t xml:space="preserve"> </w:t>
-      </w:r>
-      <w:r>
-        <w:t xml:space="preserve">— це свідомо, оскільки залежність технічно можлива лише між задачами одного проєкту; щоб додати чи відредагувати зв'язок, відкрийте діаграму Ганта потрібного проєкту (розділ 6). Уже створені залежності на загальній діаграмі показуються стрілками як завжди.</w:t>
-      </w:r>
-    </w:p>
-    <w:p>
-      <w:pPr>
-        <w:numPr>
-          <w:ilvl w:val="0"/>
-          <w:numId w:val="1008"/>
-        </w:numPr>
-        <w:pStyle w:val="Compact"/>
-      </w:pPr>
-      <w:r>
-        <w:rPr>
-          <w:bCs/>
-          <w:b/>
-        </w:rPr>
-        <w:t xml:space="preserve">«⏱️ Облік часу — усі проєкти»</w:t>
-      </w:r>
-      <w:r>
-        <w:t xml:space="preserve"> </w:t>
-      </w:r>
-      <w:r>
-        <w:t xml:space="preserve">(</w:t>
-      </w:r>
-      <w:r>
-        <w:rPr>
-          <w:rStyle w:val="VerbatimChar"/>
-        </w:rPr>
-        <w:t xml:space="preserve">/admin/time</w:t>
-      </w:r>
-      <w:r>
-        <w:t xml:space="preserve">) — на відміну від проєктної версії сторінки (розділ 4.8</w:t>
-      </w:r>
-      <w:r>
-        <w:t xml:space="preserve"> </w:t>
-      </w:r>
-      <w:r>
-        <w:rPr>
-          <w:rStyle w:val="VerbatimChar"/>
-        </w:rPr>
         <w:t xml:space="preserve">docs/USER_GUIDE.md</w:t>
       </w:r>
       <w:r>
-        <w:t xml:space="preserve">), тут вкладки «По днях / По тижнях (ISO 8601) / По місяцях» показують у кожній</w:t>
-      </w:r>
-      <w:r>
-        <w:t xml:space="preserve"> </w:t>
-      </w:r>
-      <w:r>
-        <w:rPr>
-          <w:bCs/>
-          <w:b/>
-        </w:rPr>
-        <w:t xml:space="preserve">три</w:t>
-      </w:r>
-      <w:r>
-        <w:t xml:space="preserve"> </w:t>
-      </w:r>
-      <w:r>
-        <w:t xml:space="preserve">таблиці одразу: загальна сума за період, розбивка по користувачах за той самий період, і розбивка</w:t>
-      </w:r>
-      <w:r>
-        <w:t xml:space="preserve"> </w:t>
-      </w:r>
-      <w:r>
-        <w:rPr>
-          <w:bCs/>
-          <w:b/>
-        </w:rPr>
-        <w:t xml:space="preserve">по проєктах</w:t>
-      </w:r>
-      <w:r>
-        <w:t xml:space="preserve"> </w:t>
-      </w:r>
-      <w:r>
-        <w:t xml:space="preserve">за той самий період (з посиланням на власну сторінку обліку часу кожного) — саме останньої колонки немає на проєктній версії, бо там і так усі записи вже одного проєкту. Нижче — розбивка по учасниках і по проєктах за весь час без прив'язки до періоду. Список</w:t>
-      </w:r>
-      <w:r>
-        <w:t xml:space="preserve"> </w:t>
-      </w:r>
-      <w:r>
-        <w:rPr>
-          <w:bCs/>
-          <w:b/>
-        </w:rPr>
-        <w:t xml:space="preserve">«Усі записи»</w:t>
-      </w:r>
-      <w:r>
-        <w:t xml:space="preserve"> </w:t>
-      </w:r>
-      <w:r>
-        <w:t xml:space="preserve">внизу згорнутий під спойлер за замовчуванням (щоб не займати весь екран) — натисніть на нього, щоб розгорнути повний список.</w:t>
-      </w:r>
-      <w:r>
-        <w:t xml:space="preserve"> </w:t>
-      </w:r>
-      <w:r>
-        <w:rPr>
-          <w:bCs/>
-          <w:b/>
-        </w:rPr>
-        <w:t xml:space="preserve">Клікніть на будь-яку дату/тиждень/місяць</w:t>
-      </w:r>
-      <w:r>
-        <w:t xml:space="preserve"> </w:t>
-      </w:r>
-      <w:r>
-        <w:t xml:space="preserve">у будь-якій з трьох таблиць вище — спойлер розгорнеться сам і покаже лише записи цього періоду; кнопка «Скинути» поруч повертає повний список.</w:t>
-      </w:r>
-    </w:p>
-    <w:p>
-      <w:pPr>
-        <w:numPr>
-          <w:ilvl w:val="0"/>
-          <w:numId w:val="1008"/>
-        </w:numPr>
-        <w:pStyle w:val="Compact"/>
-      </w:pPr>
-      <w:r>
-        <w:rPr>
-          <w:bCs/>
-          <w:b/>
-        </w:rPr>
-        <w:t xml:space="preserve">Кнопка «📄 Сформувати звіт»</w:t>
-      </w:r>
-      <w:r>
-        <w:t xml:space="preserve"> </w:t>
-      </w:r>
-      <w:r>
-        <w:t xml:space="preserve">(на сторінках обліку часу — розділ 4.8</w:t>
-      </w:r>
-      <w:r>
-        <w:t xml:space="preserve"> </w:t>
-      </w:r>
-      <w:r>
-        <w:rPr>
-          <w:rStyle w:val="VerbatimChar"/>
-        </w:rPr>
-        <w:t xml:space="preserve">docs/USER_GUIDE.md</w:t>
-      </w:r>
-      <w:r>
-        <w:t xml:space="preserve"> </w:t>
-      </w:r>
-      <w:r>
-        <w:t xml:space="preserve">для проєкту, і тут-таки на</w:t>
-      </w:r>
-      <w:r>
-        <w:t xml:space="preserve"> </w:t>
-      </w:r>
-      <w:r>
-        <w:rPr>
-          <w:rStyle w:val="VerbatimChar"/>
-        </w:rPr>
-        <w:t xml:space="preserve">/admin/time</w:t>
-      </w:r>
-      <w:r>
-        <w:t xml:space="preserve"> </w:t>
-      </w:r>
-      <w:r>
-        <w:t xml:space="preserve">для всієї системи; веде на</w:t>
-      </w:r>
-      <w:r>
-        <w:t xml:space="preserve"> </w:t>
-      </w:r>
-      <w:r>
-        <w:rPr>
-          <w:rStyle w:val="VerbatimChar"/>
-        </w:rPr>
-        <w:t xml:space="preserve">/reports</w:t>
-      </w:r>
-      <w:r>
-        <w:t xml:space="preserve">, детально в</w:t>
-      </w:r>
-      <w:r>
-        <w:t xml:space="preserve"> </w:t>
-      </w:r>
-      <w:r>
-        <w:rPr>
-          <w:rStyle w:val="VerbatimChar"/>
-        </w:rPr>
-        <w:t xml:space="preserve">docs/USER_GUIDE.md</w:t>
-      </w:r>
-      <w:r>
-        <w:t xml:space="preserve">, розділ 6) доступна</w:t>
-      </w:r>
-      <w:r>
-        <w:t xml:space="preserve"> </w:t>
-      </w:r>
-      <w:r>
-        <w:rPr>
-          <w:bCs/>
-          <w:b/>
-        </w:rPr>
-        <w:t xml:space="preserve">усім</w:t>
-      </w:r>
-      <w:r>
-        <w:t xml:space="preserve"> </w:t>
-      </w:r>
-      <w:r>
-        <w:t xml:space="preserve">користувачам, не лише адміністратору — але результат так само обмежений видимістю: адміністратор може вибрати в фільтрі будь-який проєкт системи, решта — лише ті, де вони автор чи відповідальний.</w:t>
+        <w:t xml:space="preserve">, розділи 4.5–4.7.</w:t>
       </w:r>
     </w:p>
     <w:p>
@@ -1700,14 +1683,23 @@
         </w:pict>
       </w:r>
     </w:p>
-    <w:bookmarkEnd w:id="33"/>
-    <w:bookmarkStart w:id="34" w:name="X76f7f42a041a330cf0ca6c2acd59c77c7e14770"/>
+    <w:bookmarkEnd w:id="37"/>
+    <w:bookmarkStart w:id="38" w:name="Xfae608f43757c4a7a7f345c96c09ccd74fab72d"/>
     <w:p>
       <w:pPr>
         <w:pStyle w:val="Heading2"/>
       </w:pPr>
       <w:r>
-        <w:t xml:space="preserve">8. Призначення виконавців (проєкти, задачі, тікети)</w:t>
+        <w:t xml:space="preserve">8. Загальний огляд по всій системі (</w:t>
+      </w:r>
+      <w:r>
+        <w:rPr>
+          <w:rStyle w:val="VerbatimChar"/>
+        </w:rPr>
+        <w:t xml:space="preserve">Адмін-панель → Канбан / Гант / Облік часу / Журнал аудиту — усі проєкти</w:t>
+      </w:r>
+      <w:r>
+        <w:t xml:space="preserve">)</w:t>
       </w:r>
     </w:p>
     <w:p>
@@ -1715,147 +1707,39 @@
         <w:pStyle w:val="FirstParagraph"/>
       </w:pPr>
       <w:r>
-        <w:t xml:space="preserve">У всіх трьох сутностях виконавця можна обрати</w:t>
-      </w:r>
-      <w:r>
-        <w:t xml:space="preserve"> </w:t>
-      </w:r>
-      <w:r>
-        <w:rPr>
-          <w:bCs/>
-          <w:b/>
-        </w:rPr>
-        <w:t xml:space="preserve">з наявних користувачів системи</w:t>
-      </w:r>
-      <w:r>
-        <w:t xml:space="preserve"> </w:t>
-      </w:r>
-      <w:r>
-        <w:t xml:space="preserve">— окремої реєстрації чи запрошення не потрібно.</w:t>
-      </w:r>
-    </w:p>
-    <w:p>
-      <w:pPr>
-        <w:numPr>
-          <w:ilvl w:val="0"/>
-          <w:numId w:val="1009"/>
-        </w:numPr>
-        <w:pStyle w:val="Compact"/>
-      </w:pPr>
-      <w:r>
-        <w:rPr>
-          <w:bCs/>
-          <w:b/>
-        </w:rPr>
-        <w:t xml:space="preserve">Проєкт</w:t>
-      </w:r>
-      <w:r>
-        <w:t xml:space="preserve"> </w:t>
-      </w:r>
-      <w:r>
-        <w:t xml:space="preserve">— поле «Відповідальний за проєкт» доступне при створенні проєкту, а також окремою формою на сторінці самого проєкту. Змінювати відповідального можуть ролі «Адміністратор системи» та «Керівник ІТ-підрозділу».</w:t>
-      </w:r>
-    </w:p>
-    <w:p>
-      <w:pPr>
-        <w:numPr>
-          <w:ilvl w:val="0"/>
-          <w:numId w:val="1009"/>
-        </w:numPr>
-        <w:pStyle w:val="Compact"/>
-      </w:pPr>
-      <w:r>
-        <w:rPr>
-          <w:bCs/>
-          <w:b/>
-        </w:rPr>
-        <w:t xml:space="preserve">Задача</w:t>
-      </w:r>
-      <w:r>
-        <w:t xml:space="preserve"> </w:t>
-      </w:r>
-      <w:r>
-        <w:t xml:space="preserve">— поле «Виконавець» доступне при створенні задачі, а також формою на сторінці задачі («Призначити»). Перепризначити задачу може будь-який залогінений користувач — це свідомо не обмежено, за аналогією з іншими таск-трекерами, де учасники команди самі розподіляють роботу між собою.</w:t>
-      </w:r>
-    </w:p>
-    <w:p>
-      <w:pPr>
-        <w:numPr>
-          <w:ilvl w:val="0"/>
-          <w:numId w:val="1009"/>
-        </w:numPr>
-        <w:pStyle w:val="Compact"/>
-      </w:pPr>
-      <w:r>
-        <w:rPr>
-          <w:bCs/>
-          <w:b/>
-        </w:rPr>
-        <w:t xml:space="preserve">Тікет</w:t>
-      </w:r>
-      <w:r>
-        <w:t xml:space="preserve"> </w:t>
-      </w:r>
-      <w:r>
-        <w:t xml:space="preserve">— поле «Оператор (виконавець тікета)» на сторінці тікета.</w:t>
-      </w:r>
-      <w:r>
-        <w:t xml:space="preserve"> </w:t>
-      </w:r>
-      <w:r>
-        <w:rPr>
-          <w:bCs/>
-          <w:b/>
-        </w:rPr>
-        <w:t xml:space="preserve">Призначати оператора можуть лише</w:t>
-      </w:r>
-      <w:r>
-        <w:t xml:space="preserve"> </w:t>
-      </w:r>
-      <w:r>
-        <w:t xml:space="preserve">«Адміністратор системи», «Керівник ІТ-підрозділу» та «Оператор служби підтримки» — звичайний заявник не може призначити оператора (ні собі, ні комусь іншому), бачить лише інформацію, хто вже призначений.</w:t>
-      </w:r>
-    </w:p>
-    <w:p>
-      <w:pPr>
-        <w:pStyle w:val="FirstParagraph"/>
-      </w:pPr>
-      <w:r>
-        <w:t xml:space="preserve">У всіх трьох випадках можна також обрати «— не призначено —», щоб зняти призначення.</w:t>
-      </w:r>
-    </w:p>
-    <w:bookmarkEnd w:id="34"/>
-    <w:bookmarkStart w:id="35" w:name="X79a586c96c007ea4a0f91bc878b3f04bb20c468"/>
-    <w:p>
-      <w:pPr>
-        <w:pStyle w:val="Heading2"/>
-      </w:pPr>
-      <w:r>
-        <w:t xml:space="preserve">9. Робота з тікетами (базова версія)</w:t>
-      </w:r>
-    </w:p>
-    <w:p>
-      <w:pPr>
-        <w:pStyle w:val="FirstParagraph"/>
-      </w:pPr>
-      <w:r>
-        <w:t xml:space="preserve">Пункт меню</w:t>
-      </w:r>
-      <w:r>
-        <w:t xml:space="preserve"> </w:t>
-      </w:r>
-      <w:r>
-        <w:rPr>
-          <w:bCs/>
-          <w:b/>
-        </w:rPr>
-        <w:t xml:space="preserve">«Тікети»</w:t>
-      </w:r>
-      <w:r>
-        <w:t xml:space="preserve"> </w:t>
-      </w:r>
-      <w:r>
-        <w:t xml:space="preserve">доступний усім залогіненим користувачам:</w:t>
+        <w:t xml:space="preserve">На відміну від звичайних канбан-дошки й діаграми Ганта (розділ 7), які показують задачі лише</w:t>
+      </w:r>
+      <w:r>
+        <w:t xml:space="preserve"> </w:t>
+      </w:r>
+      <w:r>
+        <w:rPr>
+          <w:bCs/>
+          <w:b/>
+        </w:rPr>
+        <w:t xml:space="preserve">одного</w:t>
+      </w:r>
+      <w:r>
+        <w:t xml:space="preserve"> </w:t>
+      </w:r>
+      <w:r>
+        <w:t xml:space="preserve">проєкту, ці сторінки на головній адмін-панелі об'єднують дані</w:t>
+      </w:r>
+      <w:r>
+        <w:t xml:space="preserve"> </w:t>
+      </w:r>
+      <w:r>
+        <w:rPr>
+          <w:bCs/>
+          <w:b/>
+        </w:rPr>
+        <w:t xml:space="preserve">з усіх проєктів одразу</w:t>
+      </w:r>
+      <w:r>
+        <w:t xml:space="preserve"> </w:t>
+      </w:r>
+      <w:r>
+        <w:t xml:space="preserve">— зручно, щоб оцінити загальне навантаження, не переходячи по кожному проєкту окремо. Доступ — лише роль «Адміністратор системи»; інші ролі отримають помилку доступу навіть якщо спробують перейти за прямим посиланням.</w:t>
       </w:r>
     </w:p>
     <w:p>
@@ -1871,13 +1755,22 @@
           <w:bCs/>
           <w:b/>
         </w:rPr>
-        <w:t xml:space="preserve">«+ Нове звернення»</w:t>
-      </w:r>
-      <w:r>
-        <w:t xml:space="preserve"> </w:t>
-      </w:r>
-      <w:r>
-        <w:t xml:space="preserve">— будь-хто може створити тікет (черга, тема, опис).</w:t>
+        <w:t xml:space="preserve">«📋 Канбан — усі проєкти»</w:t>
+      </w:r>
+      <w:r>
+        <w:t xml:space="preserve"> </w:t>
+      </w:r>
+      <w:r>
+        <w:t xml:space="preserve">(</w:t>
+      </w:r>
+      <w:r>
+        <w:rPr>
+          <w:rStyle w:val="VerbatimChar"/>
+        </w:rPr>
+        <w:t xml:space="preserve">/admin/board</w:t>
+      </w:r>
+      <w:r>
+        <w:t xml:space="preserve">) — та сама логіка колонок за статусом, що й на дошці проєкту, але кожна картка додатково позначена бейджем з назвою свого проєкту, а текст на картках дрібніший, ніж на дошці одного проєкту — тут карток одночасно набагато більше, тож компактніший вигляд дає побачити більше без прокрутки. Перетягування між колонками працює так само.</w:t>
       </w:r>
     </w:p>
     <w:p>
@@ -1889,7 +1782,39 @@
         <w:pStyle w:val="Compact"/>
       </w:pPr>
       <w:r>
-        <w:t xml:space="preserve">На сторінці тікета — призначення оператора (див. розділ 8), зміна статусу (Новий → В роботі → Очікує відповіді заявника → Вирішено → Закрито) та листування (коментарі).</w:t>
+        <w:rPr>
+          <w:bCs/>
+          <w:b/>
+        </w:rPr>
+        <w:t xml:space="preserve">«📊 Гант — усі проєкти»</w:t>
+      </w:r>
+      <w:r>
+        <w:t xml:space="preserve"> </w:t>
+      </w:r>
+      <w:r>
+        <w:t xml:space="preserve">(</w:t>
+      </w:r>
+      <w:r>
+        <w:rPr>
+          <w:rStyle w:val="VerbatimChar"/>
+        </w:rPr>
+        <w:t xml:space="preserve">/admin/gantt</w:t>
+      </w:r>
+      <w:r>
+        <w:t xml:space="preserve">) — та сама діаграма, але назва кожної смуги починається з назви проєкту (наприклад, «[Мій проєкт] #12 Назва задачі»). При відкритті сторінки діаграма прокручується так, щоб</w:t>
+      </w:r>
+      <w:r>
+        <w:t xml:space="preserve"> </w:t>
+      </w:r>
+      <w:r>
+        <w:rPr>
+          <w:bCs/>
+          <w:b/>
+        </w:rPr>
+        <w:t xml:space="preserve">«сьогодні» було ліворуч</w:t>
+      </w:r>
+      <w:r>
+        <w:t xml:space="preserve">, а не по центру, як зазвичай, — щоб одразу бачити все майбутнє навантаження, не гортаючи вліво. Перетягування смуги так само зберігає нові дати.</w:t>
       </w:r>
     </w:p>
     <w:p>
@@ -1901,15 +1826,263 @@
         <w:pStyle w:val="Compact"/>
       </w:pPr>
       <w:r>
-        <w:t xml:space="preserve">Час першої відповіді оператора та час вирішення фіксуються автоматично в базі даних (для майбутньої SLA-звітності — окремого звіту в інтерфейсі поки немає).</w:t>
-      </w:r>
-    </w:p>
-    <w:p>
-      <w:pPr>
-        <w:pStyle w:val="BlockText"/>
-      </w:pPr>
-      <w:r>
-        <w:t xml:space="preserve">Це базова версія модуля: повноцінний портал самообслуговування для співробітників без облікового запису, автоматична маршрутизація за SLA, email-повідомлення — заплановані наступні кроки (див. розділ 11).</w:t>
+        <w:rPr>
+          <w:bCs/>
+          <w:b/>
+        </w:rPr>
+        <w:t xml:space="preserve">Додавання нової залежності між задачами тут недоступне</w:t>
+      </w:r>
+      <w:r>
+        <w:t xml:space="preserve"> </w:t>
+      </w:r>
+      <w:r>
+        <w:t xml:space="preserve">— це свідомо, оскільки залежність технічно можлива лише між задачами одного проєкту; щоб додати чи відредагувати зв'язок, відкрийте діаграму Ганта потрібного проєкту (розділ 7). Уже створені залежності на загальній діаграмі показуються стрілками як завжди.</w:t>
+      </w:r>
+    </w:p>
+    <w:p>
+      <w:pPr>
+        <w:numPr>
+          <w:ilvl w:val="0"/>
+          <w:numId w:val="1010"/>
+        </w:numPr>
+        <w:pStyle w:val="Compact"/>
+      </w:pPr>
+      <w:r>
+        <w:rPr>
+          <w:bCs/>
+          <w:b/>
+        </w:rPr>
+        <w:t xml:space="preserve">«⏱️ Облік часу — усі проєкти»</w:t>
+      </w:r>
+      <w:r>
+        <w:t xml:space="preserve"> </w:t>
+      </w:r>
+      <w:r>
+        <w:t xml:space="preserve">(</w:t>
+      </w:r>
+      <w:r>
+        <w:rPr>
+          <w:rStyle w:val="VerbatimChar"/>
+        </w:rPr>
+        <w:t xml:space="preserve">/admin/time</w:t>
+      </w:r>
+      <w:r>
+        <w:t xml:space="preserve">) — на відміну від проєктної версії сторінки (розділ 4.8</w:t>
+      </w:r>
+      <w:r>
+        <w:t xml:space="preserve"> </w:t>
+      </w:r>
+      <w:r>
+        <w:rPr>
+          <w:rStyle w:val="VerbatimChar"/>
+        </w:rPr>
+        <w:t xml:space="preserve">docs/USER_GUIDE.md</w:t>
+      </w:r>
+      <w:r>
+        <w:t xml:space="preserve">), тут вкладки «По днях / По тижнях (ISO 8601) / По місяцях» показують у кожній</w:t>
+      </w:r>
+      <w:r>
+        <w:t xml:space="preserve"> </w:t>
+      </w:r>
+      <w:r>
+        <w:rPr>
+          <w:bCs/>
+          <w:b/>
+        </w:rPr>
+        <w:t xml:space="preserve">три</w:t>
+      </w:r>
+      <w:r>
+        <w:t xml:space="preserve"> </w:t>
+      </w:r>
+      <w:r>
+        <w:t xml:space="preserve">таблиці одразу: загальна сума за період, розбивка по користувачах за той самий період, і розбивка</w:t>
+      </w:r>
+      <w:r>
+        <w:t xml:space="preserve"> </w:t>
+      </w:r>
+      <w:r>
+        <w:rPr>
+          <w:bCs/>
+          <w:b/>
+        </w:rPr>
+        <w:t xml:space="preserve">по проєктах</w:t>
+      </w:r>
+      <w:r>
+        <w:t xml:space="preserve"> </w:t>
+      </w:r>
+      <w:r>
+        <w:t xml:space="preserve">за той самий період (з посиланням на власну сторінку обліку часу кожного) — саме останньої колонки немає на проєктній версії, бо там і так усі записи вже одного проєкту. Нижче — розбивка по учасниках і по проєктах за весь час без прив'язки до періоду. Список</w:t>
+      </w:r>
+      <w:r>
+        <w:t xml:space="preserve"> </w:t>
+      </w:r>
+      <w:r>
+        <w:rPr>
+          <w:bCs/>
+          <w:b/>
+        </w:rPr>
+        <w:t xml:space="preserve">«Усі записи»</w:t>
+      </w:r>
+      <w:r>
+        <w:t xml:space="preserve"> </w:t>
+      </w:r>
+      <w:r>
+        <w:t xml:space="preserve">внизу згорнутий під спойлер за замовчуванням (щоб не займати весь екран) — натисніть на нього, щоб розгорнути повний список.</w:t>
+      </w:r>
+      <w:r>
+        <w:t xml:space="preserve"> </w:t>
+      </w:r>
+      <w:r>
+        <w:rPr>
+          <w:bCs/>
+          <w:b/>
+        </w:rPr>
+        <w:t xml:space="preserve">Клікніть на будь-яку дату/тиждень/місяць</w:t>
+      </w:r>
+      <w:r>
+        <w:t xml:space="preserve"> </w:t>
+      </w:r>
+      <w:r>
+        <w:t xml:space="preserve">у будь-якій з трьох таблиць вище — спойлер розгорнеться сам і покаже лише записи цього періоду; кнопка «Скинути» поруч повертає повний список.</w:t>
+      </w:r>
+    </w:p>
+    <w:p>
+      <w:pPr>
+        <w:numPr>
+          <w:ilvl w:val="0"/>
+          <w:numId w:val="1010"/>
+        </w:numPr>
+        <w:pStyle w:val="Compact"/>
+      </w:pPr>
+      <w:r>
+        <w:rPr>
+          <w:bCs/>
+          <w:b/>
+        </w:rPr>
+        <w:t xml:space="preserve">Кнопка «📄 Сформувати звіт»</w:t>
+      </w:r>
+      <w:r>
+        <w:t xml:space="preserve"> </w:t>
+      </w:r>
+      <w:r>
+        <w:t xml:space="preserve">(на сторінках обліку часу — розділ 4.8</w:t>
+      </w:r>
+      <w:r>
+        <w:t xml:space="preserve"> </w:t>
+      </w:r>
+      <w:r>
+        <w:rPr>
+          <w:rStyle w:val="VerbatimChar"/>
+        </w:rPr>
+        <w:t xml:space="preserve">docs/USER_GUIDE.md</w:t>
+      </w:r>
+      <w:r>
+        <w:t xml:space="preserve"> </w:t>
+      </w:r>
+      <w:r>
+        <w:t xml:space="preserve">для проєкту, і тут-таки на</w:t>
+      </w:r>
+      <w:r>
+        <w:t xml:space="preserve"> </w:t>
+      </w:r>
+      <w:r>
+        <w:rPr>
+          <w:rStyle w:val="VerbatimChar"/>
+        </w:rPr>
+        <w:t xml:space="preserve">/admin/time</w:t>
+      </w:r>
+      <w:r>
+        <w:t xml:space="preserve"> </w:t>
+      </w:r>
+      <w:r>
+        <w:t xml:space="preserve">для всієї системи; веде на</w:t>
+      </w:r>
+      <w:r>
+        <w:t xml:space="preserve"> </w:t>
+      </w:r>
+      <w:r>
+        <w:rPr>
+          <w:rStyle w:val="VerbatimChar"/>
+        </w:rPr>
+        <w:t xml:space="preserve">/reports</w:t>
+      </w:r>
+      <w:r>
+        <w:t xml:space="preserve">, детально в</w:t>
+      </w:r>
+      <w:r>
+        <w:t xml:space="preserve"> </w:t>
+      </w:r>
+      <w:r>
+        <w:rPr>
+          <w:rStyle w:val="VerbatimChar"/>
+        </w:rPr>
+        <w:t xml:space="preserve">docs/USER_GUIDE.md</w:t>
+      </w:r>
+      <w:r>
+        <w:t xml:space="preserve">, розділ 6) доступна</w:t>
+      </w:r>
+      <w:r>
+        <w:t xml:space="preserve"> </w:t>
+      </w:r>
+      <w:r>
+        <w:rPr>
+          <w:bCs/>
+          <w:b/>
+        </w:rPr>
+        <w:t xml:space="preserve">усім</w:t>
+      </w:r>
+      <w:r>
+        <w:t xml:space="preserve"> </w:t>
+      </w:r>
+      <w:r>
+        <w:t xml:space="preserve">користувачам, не лише адміністратору — але результат так само обмежений видимістю: адміністратор може вибрати в фільтрі будь-який проєкт системи, решта — лише ті, де вони автор чи відповідальний.</w:t>
+      </w:r>
+    </w:p>
+    <w:p>
+      <w:pPr>
+        <w:numPr>
+          <w:ilvl w:val="0"/>
+          <w:numId w:val="1010"/>
+        </w:numPr>
+        <w:pStyle w:val="Compact"/>
+      </w:pPr>
+      <w:r>
+        <w:rPr>
+          <w:bCs/>
+          <w:b/>
+        </w:rPr>
+        <w:t xml:space="preserve">«📜 Журнал аудиту»</w:t>
+      </w:r>
+      <w:r>
+        <w:t xml:space="preserve"> </w:t>
+      </w:r>
+      <w:r>
+        <w:t xml:space="preserve">(</w:t>
+      </w:r>
+      <w:r>
+        <w:rPr>
+          <w:rStyle w:val="VerbatimChar"/>
+        </w:rPr>
+        <w:t xml:space="preserve">/admin/audit</w:t>
+      </w:r>
+      <w:r>
+        <w:t xml:space="preserve">, на відміну від решти сторінок цього розділу — доступна</w:t>
+      </w:r>
+      <w:r>
+        <w:t xml:space="preserve"> </w:t>
+      </w:r>
+      <w:r>
+        <w:rPr>
+          <w:bCs/>
+          <w:b/>
+        </w:rPr>
+        <w:t xml:space="preserve">лише</w:t>
+      </w:r>
+      <w:r>
+        <w:t xml:space="preserve"> </w:t>
+      </w:r>
+      <w:r>
+        <w:t xml:space="preserve">адміністратору, навіть за прямим посиланням) — повний список дій у системі (хто, що і коли змінював у проєктах, задачах, тікетах, етапах, чергах). Фільтри зверху: тип сутності (у списку — українською: «Проєкт», «Задача», «Тікет» тощо, формується з реально наявних у журналі значень), автор дії, діапазон дат. Колонка «Сутність» — номер і коротка назва (перші 2 слова) самої задачі/проєкту/тікета, з посиланням на неї там, де для цього є окрема сторінка; якщо сутність згодом видалили — лишається тільки номер, без назви. Колонка «Деталі» перекладена українською й, де це можливо, показує не технічний ID, а реальну назву (наприклад, не «status_id: 3», а «Статус: В роботі») — окремим запитом одразу для всіх записів на сторінці, а не по одному на рядок. Список розбитий на сторінки по 50 записів.</w:t>
       </w:r>
     </w:p>
     <w:p>
@@ -1919,23 +2092,14 @@
         </w:pict>
       </w:r>
     </w:p>
-    <w:bookmarkEnd w:id="35"/>
-    <w:bookmarkStart w:id="37" w:name="X3476f70a72dce48cd65eae0d541ab23a568bb3f"/>
+    <w:bookmarkEnd w:id="38"/>
+    <w:bookmarkStart w:id="39" w:name="Xa06dd7c8bb03a805d421defef0e2d2a29c04e64"/>
     <w:p>
       <w:pPr>
         <w:pStyle w:val="Heading2"/>
       </w:pPr>
       <w:r>
-        <w:t xml:space="preserve">10. Керування чергами тікетів (</w:t>
-      </w:r>
-      <w:r>
-        <w:rPr>
-          <w:rStyle w:val="VerbatimChar"/>
-        </w:rPr>
-        <w:t xml:space="preserve">Адмін-панель → Черги тікетів</w:t>
-      </w:r>
-      <w:r>
-        <w:t xml:space="preserve">)</w:t>
+        <w:t xml:space="preserve">9. Призначення виконавців (проєкти, задачі, тікети)</w:t>
       </w:r>
     </w:p>
     <w:p>
@@ -1943,16 +2107,23 @@
         <w:pStyle w:val="FirstParagraph"/>
       </w:pPr>
       <w:r>
-        <w:t xml:space="preserve">Черги — це категорії, за якими розподіляються звернення (наприклад, «Загальна підтримка», «Мережева підтримка», «Бухгалтерські системи»). При створенні тікета користувач обирає чергу зі списку.</w:t>
-      </w:r>
-    </w:p>
-    <w:bookmarkStart w:id="36" w:name="створення-нової-черги"/>
-    <w:p>
-      <w:pPr>
-        <w:pStyle w:val="Heading3"/>
-      </w:pPr>
-      <w:r>
-        <w:t xml:space="preserve">Створення нової черги</w:t>
+        <w:t xml:space="preserve">У всіх трьох сутностях виконавця можна обрати</w:t>
+      </w:r>
+      <w:r>
+        <w:t xml:space="preserve"> </w:t>
+      </w:r>
+      <w:r>
+        <w:rPr>
+          <w:bCs/>
+          <w:b/>
+        </w:rPr>
+        <w:t xml:space="preserve">з наявних користувачів системи</w:t>
+      </w:r>
+      <w:r>
+        <w:t xml:space="preserve"> </w:t>
+      </w:r>
+      <w:r>
+        <w:t xml:space="preserve">— окремої реєстрації чи запрошення не потрібно.</w:t>
       </w:r>
     </w:p>
     <w:p>
@@ -1964,20 +2135,17 @@
         <w:pStyle w:val="Compact"/>
       </w:pPr>
       <w:r>
-        <w:t xml:space="preserve">Натисніть</w:t>
-      </w:r>
-      <w:r>
-        <w:t xml:space="preserve"> </w:t>
-      </w:r>
-      <w:r>
-        <w:rPr>
-          <w:bCs/>
-          <w:b/>
-        </w:rPr>
-        <w:t xml:space="preserve">«+ Нова черга»</w:t>
-      </w:r>
-      <w:r>
-        <w:t xml:space="preserve">.</w:t>
+        <w:rPr>
+          <w:bCs/>
+          <w:b/>
+        </w:rPr>
+        <w:t xml:space="preserve">Проєкт</w:t>
+      </w:r>
+      <w:r>
+        <w:t xml:space="preserve"> </w:t>
+      </w:r>
+      <w:r>
+        <w:t xml:space="preserve">— поле «Відповідальний за проєкт» доступне при створенні проєкту, а також окремою формою на сторінці самого проєкту. Змінювати відповідального можуть ролі «Адміністратор системи» та «Керівник ІТ-підрозділу».</w:t>
       </w:r>
     </w:p>
     <w:p>
@@ -1989,7 +2157,17 @@
         <w:pStyle w:val="Compact"/>
       </w:pPr>
       <w:r>
-        <w:t xml:space="preserve">Вкажіть назву (обов'язково, має бути унікальною — система не дозволить створити чергу з назвою, що вже існує) та опис (необов'язково — коротко, для яких звернень призначена ця черга).</w:t>
+        <w:rPr>
+          <w:bCs/>
+          <w:b/>
+        </w:rPr>
+        <w:t xml:space="preserve">Задача</w:t>
+      </w:r>
+      <w:r>
+        <w:t xml:space="preserve"> </w:t>
+      </w:r>
+      <w:r>
+        <w:t xml:space="preserve">— поле «Виконавець» доступне при створенні задачі, а також формою на сторінці задачі («Призначити»). Перепризначити задачу може будь-який залогінений користувач — це свідомо не обмежено, за аналогією з іншими таск-трекерами, де учасники команди самі розподіляють роботу між собою.</w:t>
       </w:r>
     </w:p>
     <w:p>
@@ -2001,20 +2179,33 @@
         <w:pStyle w:val="Compact"/>
       </w:pPr>
       <w:r>
-        <w:t xml:space="preserve">Натисніть</w:t>
-      </w:r>
-      <w:r>
-        <w:t xml:space="preserve"> </w:t>
-      </w:r>
-      <w:r>
-        <w:rPr>
-          <w:bCs/>
-          <w:b/>
-        </w:rPr>
-        <w:t xml:space="preserve">«Створити чергу»</w:t>
-      </w:r>
-      <w:r>
-        <w:t xml:space="preserve">.</w:t>
+        <w:rPr>
+          <w:bCs/>
+          <w:b/>
+        </w:rPr>
+        <w:t xml:space="preserve">Тікет</w:t>
+      </w:r>
+      <w:r>
+        <w:t xml:space="preserve"> </w:t>
+      </w:r>
+      <w:r>
+        <w:t xml:space="preserve">— поле «Оператор (виконавець тікета)» на сторінці тікета.</w:t>
+      </w:r>
+      <w:r>
+        <w:t xml:space="preserve"> </w:t>
+      </w:r>
+      <w:r>
+        <w:rPr>
+          <w:bCs/>
+          <w:b/>
+        </w:rPr>
+        <w:t xml:space="preserve">Призначати оператора можуть лише</w:t>
+      </w:r>
+      <w:r>
+        <w:t xml:space="preserve"> </w:t>
+      </w:r>
+      <w:r>
+        <w:t xml:space="preserve">«Адміністратор системи», «Керівник ІТ-підрозділу» та «Оператор служби підтримки» — звичайний заявник не може призначити оператора (ні собі, ні комусь іншому), бачить лише інформацію, хто вже призначений.</w:t>
       </w:r>
     </w:p>
     <w:p>
@@ -2022,7 +2213,87 @@
         <w:pStyle w:val="FirstParagraph"/>
       </w:pPr>
       <w:r>
-        <w:t xml:space="preserve">Нова черга одразу з'являється у випадаючому списку на сторінці створення тікета — жодних додаткових дій не потрібно.</w:t>
+        <w:t xml:space="preserve">У всіх трьох випадках можна також обрати «— не призначено —», щоб зняти призначення.</w:t>
+      </w:r>
+    </w:p>
+    <w:bookmarkEnd w:id="39"/>
+    <w:bookmarkStart w:id="40" w:name="Xabb48b602696d4744d66b80d465a4de026a7727"/>
+    <w:p>
+      <w:pPr>
+        <w:pStyle w:val="Heading2"/>
+      </w:pPr>
+      <w:r>
+        <w:t xml:space="preserve">10. Робота з тікетами (базова версія)</w:t>
+      </w:r>
+    </w:p>
+    <w:p>
+      <w:pPr>
+        <w:pStyle w:val="FirstParagraph"/>
+      </w:pPr>
+      <w:r>
+        <w:t xml:space="preserve">Пункт меню</w:t>
+      </w:r>
+      <w:r>
+        <w:t xml:space="preserve"> </w:t>
+      </w:r>
+      <w:r>
+        <w:rPr>
+          <w:bCs/>
+          <w:b/>
+        </w:rPr>
+        <w:t xml:space="preserve">«Тікети»</w:t>
+      </w:r>
+      <w:r>
+        <w:t xml:space="preserve"> </w:t>
+      </w:r>
+      <w:r>
+        <w:t xml:space="preserve">доступний усім залогіненим користувачам:</w:t>
+      </w:r>
+    </w:p>
+    <w:p>
+      <w:pPr>
+        <w:numPr>
+          <w:ilvl w:val="0"/>
+          <w:numId w:val="1012"/>
+        </w:numPr>
+        <w:pStyle w:val="Compact"/>
+      </w:pPr>
+      <w:r>
+        <w:rPr>
+          <w:bCs/>
+          <w:b/>
+        </w:rPr>
+        <w:t xml:space="preserve">«+ Нове звернення»</w:t>
+      </w:r>
+      <w:r>
+        <w:t xml:space="preserve"> </w:t>
+      </w:r>
+      <w:r>
+        <w:t xml:space="preserve">— будь-хто може створити тікет (черга, тема, опис).</w:t>
+      </w:r>
+    </w:p>
+    <w:p>
+      <w:pPr>
+        <w:numPr>
+          <w:ilvl w:val="0"/>
+          <w:numId w:val="1012"/>
+        </w:numPr>
+        <w:pStyle w:val="Compact"/>
+      </w:pPr>
+      <w:r>
+        <w:t xml:space="preserve">На сторінці тікета — призначення оператора (див. розділ 9), зміна статусу (Новий → В роботі → Очікує відповіді заявника → Вирішено → Закрито) та листування (коментарі).</w:t>
+      </w:r>
+    </w:p>
+    <w:p>
+      <w:pPr>
+        <w:numPr>
+          <w:ilvl w:val="0"/>
+          <w:numId w:val="1012"/>
+        </w:numPr>
+        <w:pStyle w:val="Compact"/>
+      </w:pPr>
+      <w:r>
+        <w:t xml:space="preserve">Час першої відповіді оператора та час вирішення фіксуються автоматично в базі даних (для майбутньої SLA-звітності — окремого звіту в інтерфейсі поки немає).</w:t>
       </w:r>
     </w:p>
     <w:p>
@@ -2030,7 +2301,7 @@
         <w:pStyle w:val="BlockText"/>
       </w:pPr>
       <w:r>
-        <w:t xml:space="preserve">Наразі немає окремої функції редагування чи видалення черги через інтерфейс (щоб уникнути ситуації, коли черга видаляється, а вже створені тікети лишаються без черги). За потреби перейменувати чи прибрати чергу — зверніться до розробника.</w:t>
+        <w:t xml:space="preserve">Це базова версія модуля: повноцінний портал самообслуговування для співробітників без облікового запису, автоматична маршрутизація за SLA, email-повідомлення — заплановані наступні кроки (див. розділ 12).</w:t>
       </w:r>
     </w:p>
     <w:p>
@@ -2040,15 +2311,23 @@
         </w:pict>
       </w:r>
     </w:p>
-    <w:bookmarkEnd w:id="36"/>
-    <w:bookmarkEnd w:id="37"/>
-    <w:bookmarkStart w:id="38" w:name="X97bd7d46b8cfaed9ab16b912a50a81873523ea1"/>
+    <w:bookmarkEnd w:id="40"/>
+    <w:bookmarkStart w:id="42" w:name="Xfd3b571dc2ba161e01d4de304ef5647943b2305"/>
     <w:p>
       <w:pPr>
         <w:pStyle w:val="Heading2"/>
       </w:pPr>
       <w:r>
-        <w:t xml:space="preserve">11. Чого в системі поки немає (щоб не шукати даремно)</w:t>
+        <w:t xml:space="preserve">11. Керування чергами тікетів (</w:t>
+      </w:r>
+      <w:r>
+        <w:rPr>
+          <w:rStyle w:val="VerbatimChar"/>
+        </w:rPr>
+        <w:t xml:space="preserve">Адмін-панель → Черги тікетів</w:t>
+      </w:r>
+      <w:r>
+        <w:t xml:space="preserve">)</w:t>
       </w:r>
     </w:p>
     <w:p>
@@ -2056,88 +2335,94 @@
         <w:pStyle w:val="FirstParagraph"/>
       </w:pPr>
       <w:r>
-        <w:t xml:space="preserve">На поточному етапі відсутні (заплановані на наступні ітерації):</w:t>
+        <w:t xml:space="preserve">Черги — це категорії, за якими розподіляються звернення (наприклад, «Загальна підтримка», «Мережева підтримка», «Бухгалтерські системи»). При створенні тікета користувач обирає чергу зі списку.</w:t>
+      </w:r>
+    </w:p>
+    <w:bookmarkStart w:id="41" w:name="створення-нової-черги"/>
+    <w:p>
+      <w:pPr>
+        <w:pStyle w:val="Heading3"/>
+      </w:pPr>
+      <w:r>
+        <w:t xml:space="preserve">Створення нової черги</w:t>
       </w:r>
     </w:p>
     <w:p>
       <w:pPr>
         <w:numPr>
           <w:ilvl w:val="0"/>
-          <w:numId w:val="1012"/>
-        </w:numPr>
-        <w:pStyle w:val="Compact"/>
-      </w:pPr>
-      <w:r>
-        <w:t xml:space="preserve">Портал самообслуговування для заявників без облікового запису основного функціоналу, email-to-ticket, SLA-ескалація, оцінка CSAT (базова версія тікетів — створення/перегляд/призначення оператора/коментарі/статус — вже працює для користувачів, які мають обліковий запис).</w:t>
+          <w:numId w:val="1013"/>
+        </w:numPr>
+        <w:pStyle w:val="Compact"/>
+      </w:pPr>
+      <w:r>
+        <w:t xml:space="preserve">Натисніть</w:t>
+      </w:r>
+      <w:r>
+        <w:t xml:space="preserve"> </w:t>
+      </w:r>
+      <w:r>
+        <w:rPr>
+          <w:bCs/>
+          <w:b/>
+        </w:rPr>
+        <w:t xml:space="preserve">«+ Нова черга»</w:t>
+      </w:r>
+      <w:r>
+        <w:t xml:space="preserve">.</w:t>
       </w:r>
     </w:p>
     <w:p>
       <w:pPr>
         <w:numPr>
           <w:ilvl w:val="0"/>
-          <w:numId w:val="1012"/>
-        </w:numPr>
-        <w:pStyle w:val="Compact"/>
-      </w:pPr>
-      <w:r>
-        <w:t xml:space="preserve">Інтеграція з Active Directory (автоматична синхронізація користувачів, SSO).</w:t>
+          <w:numId w:val="1013"/>
+        </w:numPr>
+        <w:pStyle w:val="Compact"/>
+      </w:pPr>
+      <w:r>
+        <w:t xml:space="preserve">Вкажіть назву (обов'язково, має бути унікальною — система не дозволить створити чергу з назвою, що вже існує) та опис (необов'язково — коротко, для яких звернень призначена ця черга).</w:t>
       </w:r>
     </w:p>
     <w:p>
       <w:pPr>
         <w:numPr>
           <w:ilvl w:val="0"/>
-          <w:numId w:val="1012"/>
-        </w:numPr>
-        <w:pStyle w:val="Compact"/>
-      </w:pPr>
-      <w:r>
-        <w:t xml:space="preserve">Wiki, форуми, файлові документи як окремий модуль.</w:t>
-      </w:r>
-    </w:p>
-    <w:p>
-      <w:pPr>
-        <w:numPr>
-          <w:ilvl w:val="0"/>
-          <w:numId w:val="1012"/>
-        </w:numPr>
-        <w:pStyle w:val="Compact"/>
-      </w:pPr>
-      <w:r>
-        <w:t xml:space="preserve">Email-сповіщення, вебхуки, REST API.</w:t>
-      </w:r>
-    </w:p>
-    <w:p>
-      <w:pPr>
-        <w:numPr>
-          <w:ilvl w:val="0"/>
-          <w:numId w:val="1012"/>
-        </w:numPr>
-        <w:pStyle w:val="Compact"/>
-      </w:pPr>
-      <w:r>
-        <w:t xml:space="preserve">Перегляд журналу аудиту (</w:t>
-      </w:r>
-      <w:r>
-        <w:rPr>
-          <w:rStyle w:val="VerbatimChar"/>
-        </w:rPr>
-        <w:t xml:space="preserve">audit_log</w:t>
-      </w:r>
-      <w:r>
-        <w:t xml:space="preserve">) через веб-інтерфейс — записи ведуться, але подивитися їх поки можна лише напряму в базі даних.</w:t>
-      </w:r>
-    </w:p>
-    <w:p>
-      <w:pPr>
-        <w:numPr>
-          <w:ilvl w:val="0"/>
-          <w:numId w:val="1012"/>
-        </w:numPr>
-        <w:pStyle w:val="Compact"/>
-      </w:pPr>
-      <w:r>
-        <w:t xml:space="preserve">Архівування проєкту через інтерфейс (без видалення) — статус проєкту (активний/архівний/закритий) поки змінюється лише напряму в базі даних, кнопки в UI немає.</w:t>
+          <w:numId w:val="1013"/>
+        </w:numPr>
+        <w:pStyle w:val="Compact"/>
+      </w:pPr>
+      <w:r>
+        <w:t xml:space="preserve">Натисніть</w:t>
+      </w:r>
+      <w:r>
+        <w:t xml:space="preserve"> </w:t>
+      </w:r>
+      <w:r>
+        <w:rPr>
+          <w:bCs/>
+          <w:b/>
+        </w:rPr>
+        <w:t xml:space="preserve">«Створити чергу»</w:t>
+      </w:r>
+      <w:r>
+        <w:t xml:space="preserve">.</w:t>
+      </w:r>
+    </w:p>
+    <w:p>
+      <w:pPr>
+        <w:pStyle w:val="FirstParagraph"/>
+      </w:pPr>
+      <w:r>
+        <w:t xml:space="preserve">Нова черга одразу з'являється у випадаючому списку на сторінці створення тікета — жодних додаткових дій не потрібно.</w:t>
+      </w:r>
+    </w:p>
+    <w:p>
+      <w:pPr>
+        <w:pStyle w:val="BlockText"/>
+      </w:pPr>
+      <w:r>
+        <w:t xml:space="preserve">Наразі немає окремої функції редагування чи видалення черги через інтерфейс (щоб уникнути ситуації, коли черга видаляється, а вже створені тікети лишаються без черги). За потреби перейменувати чи прибрати чергу — зверніться до розробника.</w:t>
       </w:r>
     </w:p>
     <w:p>
@@ -2147,14 +2432,15 @@
         </w:pict>
       </w:r>
     </w:p>
-    <w:bookmarkEnd w:id="38"/>
-    <w:bookmarkStart w:id="39" w:name="Xbe7e7c72ca5405e648fa03bf646d89068951b6a"/>
+    <w:bookmarkEnd w:id="41"/>
+    <w:bookmarkEnd w:id="42"/>
+    <w:bookmarkStart w:id="43" w:name="X1c091a7ac5073a7af3d36fe571c8ef570adddd9"/>
     <w:p>
       <w:pPr>
         <w:pStyle w:val="Heading2"/>
       </w:pPr>
       <w:r>
-        <w:t xml:space="preserve">12. Типові адміністративні сценарії</w:t>
+        <w:t xml:space="preserve">12. Чого в системі поки немає (щоб не шукати даремно)</w:t>
       </w:r>
     </w:p>
     <w:p>
@@ -2162,6 +2448,79 @@
         <w:pStyle w:val="FirstParagraph"/>
       </w:pPr>
       <w:r>
+        <w:t xml:space="preserve">На поточному етапі відсутні (заплановані на наступні ітерації):</w:t>
+      </w:r>
+    </w:p>
+    <w:p>
+      <w:pPr>
+        <w:numPr>
+          <w:ilvl w:val="0"/>
+          <w:numId w:val="1014"/>
+        </w:numPr>
+        <w:pStyle w:val="Compact"/>
+      </w:pPr>
+      <w:r>
+        <w:t xml:space="preserve">Портал самообслуговування для заявників без облікового запису основного функціоналу, email-to-ticket, SLA-ескалація, оцінка CSAT (базова версія тікетів — створення/перегляд/призначення оператора/коментарі/статус — вже працює для користувачів, які мають обліковий запис).</w:t>
+      </w:r>
+    </w:p>
+    <w:p>
+      <w:pPr>
+        <w:numPr>
+          <w:ilvl w:val="0"/>
+          <w:numId w:val="1014"/>
+        </w:numPr>
+        <w:pStyle w:val="Compact"/>
+      </w:pPr>
+      <w:r>
+        <w:t xml:space="preserve">Інтеграція з Active Directory (автоматична синхронізація користувачів, SSO).</w:t>
+      </w:r>
+    </w:p>
+    <w:p>
+      <w:pPr>
+        <w:numPr>
+          <w:ilvl w:val="0"/>
+          <w:numId w:val="1014"/>
+        </w:numPr>
+        <w:pStyle w:val="Compact"/>
+      </w:pPr>
+      <w:r>
+        <w:t xml:space="preserve">Wiki, форуми, файлові документи як окремий модуль.</w:t>
+      </w:r>
+    </w:p>
+    <w:p>
+      <w:pPr>
+        <w:numPr>
+          <w:ilvl w:val="0"/>
+          <w:numId w:val="1014"/>
+        </w:numPr>
+        <w:pStyle w:val="Compact"/>
+      </w:pPr>
+      <w:r>
+        <w:t xml:space="preserve">Email-сповіщення, вебхуки, REST API.</w:t>
+      </w:r>
+    </w:p>
+    <w:p>
+      <w:r>
+        <w:pict>
+          <v:rect style="width:0;height:1.5pt" o:hralign="center" o:hrstd="t" o:hr="t"/>
+        </w:pict>
+      </w:r>
+    </w:p>
+    <w:bookmarkEnd w:id="43"/>
+    <w:bookmarkStart w:id="44" w:name="X15f096bb48513ce1d1cd2a2553b582badd399ba"/>
+    <w:p>
+      <w:pPr>
+        <w:pStyle w:val="Heading2"/>
+      </w:pPr>
+      <w:r>
+        <w:t xml:space="preserve">13. Типові адміністративні сценарії</w:t>
+      </w:r>
+    </w:p>
+    <w:p>
+      <w:pPr>
+        <w:pStyle w:val="FirstParagraph"/>
+      </w:pPr>
+      <w:r>
         <w:rPr>
           <w:bCs/>
           <w:b/>
@@ -2208,7 +2567,7 @@
         <w:t xml:space="preserve"> </w:t>
       </w:r>
       <w:r>
-        <w:t xml:space="preserve">Можна безпечно видалити (п. 4) — оскільки в ньому ще немає важливих даних.</w:t>
+        <w:t xml:space="preserve">Можна безпечно видалити («Видалення проєкту», розділ 5) — оскільки в ньому ще немає важливих даних.</w:t>
       </w:r>
     </w:p>
     <w:p>
@@ -2226,11 +2585,11 @@
         <w:t xml:space="preserve"> </w:t>
       </w:r>
       <w:r>
-        <w:t xml:space="preserve">Не видаляйте — краще залиште проєкт як є. Зміна статусу проєкту на «Архівний» через інтерфейс поки не реалізована (див. розділ 11) — за потреби зверніться до розробника для зміни статусу напряму в базі даних.</w:t>
-      </w:r>
-    </w:p>
-    <w:bookmarkEnd w:id="39"/>
-    <w:bookmarkEnd w:id="40"/>
+        <w:t xml:space="preserve">Не видаляйте — позначте статус «Архівний» замість цього (розділ 5, «Зміна статусу (архівування)»). Дані, задачі й історія лишаються доступними, але проєкт більше не виглядає активним у списках.</w:t>
+      </w:r>
+    </w:p>
+    <w:bookmarkEnd w:id="44"/>
+    <w:bookmarkEnd w:id="45"/>
     <w:sectPr/>
   </w:body>
 </w:document>
@@ -2586,6 +2945,12 @@
     <w:abstractNumId w:val="991"/>
   </w:num>
   <w:num w:numId="1011">
+    <w:abstractNumId w:val="991"/>
+  </w:num>
+  <w:num w:numId="1012">
+    <w:abstractNumId w:val="991"/>
+  </w:num>
+  <w:num w:numId="1013">
     <w:abstractNumId w:val="99411"/>
     <w:lvlOverride w:ilvl="0">
       <w:startOverride w:val="1"/>
@@ -2615,7 +2980,7 @@
       <w:startOverride w:val="1"/>
     </w:lvlOverride>
   </w:num>
-  <w:num w:numId="1012">
+  <w:num w:numId="1014">
     <w:abstractNumId w:val="991"/>
   </w:num>
 </w:numbering>

</xml_diff>

<commit_message>
release 0.1.3 add SLA
</commit_message>
<xml_diff>
--- a/docs/ITSM_Admin_Guide.docx
+++ b/docs/ITSM_Admin_Guide.docx
@@ -2,7 +2,7 @@
 <file path=word/document.xml><?xml version="1.0" encoding="utf-8"?>
 <w:document xmlns:w="http://schemas.openxmlformats.org/wordprocessingml/2006/main" xmlns:m="http://schemas.openxmlformats.org/officeDocument/2006/math" xmlns:r="http://schemas.openxmlformats.org/officeDocument/2006/relationships" xmlns:o="urn:schemas-microsoft-com:office:office" xmlns:v="urn:schemas-microsoft-com:vml" xmlns:w10="urn:schemas-microsoft-com:office:word" xmlns:a="http://schemas.openxmlformats.org/drawingml/2006/main" xmlns:pic="http://schemas.openxmlformats.org/drawingml/2006/picture" xmlns:wp="http://schemas.openxmlformats.org/drawingml/2006/wordprocessingDrawing">
   <w:body>
-    <w:bookmarkStart w:id="49" w:name="гайд-адміністратора--itsm-system"/>
+    <w:bookmarkStart w:id="50" w:name="гайд-адміністратора--itsm-system"/>
     <w:p>
       <w:pPr>
         <w:pStyle w:val="Heading1"/>
@@ -2865,22 +2865,7 @@
         <w:pStyle w:val="FirstParagraph"/>
       </w:pPr>
       <w:r>
-        <w:t xml:space="preserve">Кожна черга тікетів має нормативи в таблиці</w:t>
-      </w:r>
-      <w:r>
-        <w:t xml:space="preserve"> </w:t>
-      </w:r>
-      <w:r>
-        <w:rPr>
-          <w:rStyle w:val="VerbatimChar"/>
-        </w:rPr>
-        <w:t xml:space="preserve">sla_policies</w:t>
-      </w:r>
-      <w:r>
-        <w:t xml:space="preserve"> </w:t>
-      </w:r>
-      <w:r>
-        <w:t xml:space="preserve">(час першої відповіді й час вирішення, у хвилинах — редагуються напряму в базі даних, окремої сторінки в інтерфейсі поки немає). Коли норматив прострочено, це показується:</w:t>
+        <w:t xml:space="preserve">Кожна черга тікетів має нормативи SLA (час першої відповіді й час вирішення, у хвилинах) — редагуються в Адмін-панель → Черги тікетів (розділ 11). Коли норматив прострочено, це показується:</w:t>
       </w:r>
     </w:p>
     <w:p>
@@ -2949,7 +2934,7 @@
     </w:p>
     <w:bookmarkEnd w:id="43"/>
     <w:bookmarkEnd w:id="44"/>
-    <w:bookmarkStart w:id="46" w:name="Xfd3b571dc2ba161e01d4de304ef5647943b2305"/>
+    <w:bookmarkStart w:id="47" w:name="Xfd3b571dc2ba161e01d4de304ef5647943b2305"/>
     <w:p>
       <w:pPr>
         <w:pStyle w:val="Heading2"/>
@@ -3052,6 +3037,129 @@
       </w:pPr>
       <w:r>
         <w:t xml:space="preserve">Нова черга одразу з'являється у випадаючому списку на сторінці створення тікета — жодних додаткових дій не потрібно.</w:t>
+      </w:r>
+    </w:p>
+    <w:bookmarkEnd w:id="45"/>
+    <w:bookmarkStart w:id="46" w:name="sla-нормативи-черги"/>
+    <w:p>
+      <w:pPr>
+        <w:pStyle w:val="Heading3"/>
+      </w:pPr>
+      <w:r>
+        <w:t xml:space="preserve">SLA-нормативи черги</w:t>
+      </w:r>
+    </w:p>
+    <w:p>
+      <w:pPr>
+        <w:pStyle w:val="FirstParagraph"/>
+      </w:pPr>
+      <w:r>
+        <w:t xml:space="preserve">У таблиці черг, у стовпці</w:t>
+      </w:r>
+      <w:r>
+        <w:t xml:space="preserve"> </w:t>
+      </w:r>
+      <w:r>
+        <w:rPr>
+          <w:bCs/>
+          <w:b/>
+        </w:rPr>
+        <w:t xml:space="preserve">«SLA: перша відповідь / вирішення (хв)»</w:t>
+      </w:r>
+      <w:r>
+        <w:t xml:space="preserve">, для кожної черги є два поля: норматив першої відповіді оператора й норматив вирішення, обидва в хвилинах (наприклад, 60 і 480 = година на першу відповідь, 8 годин на вирішення). Змініть значення й натисніть</w:t>
+      </w:r>
+      <w:r>
+        <w:t xml:space="preserve"> </w:t>
+      </w:r>
+      <w:r>
+        <w:rPr>
+          <w:bCs/>
+          <w:b/>
+        </w:rPr>
+        <w:t xml:space="preserve">«Зберегти»</w:t>
+      </w:r>
+      <w:r>
+        <w:t xml:space="preserve"> </w:t>
+      </w:r>
+      <w:r>
+        <w:t xml:space="preserve">— нові нормативи діють одразу для всіх незакритих тікетів цієї черги, включно з уже створеними.</w:t>
+      </w:r>
+    </w:p>
+    <w:p>
+      <w:pPr>
+        <w:numPr>
+          <w:ilvl w:val="0"/>
+          <w:numId w:val="1017"/>
+        </w:numPr>
+        <w:pStyle w:val="Compact"/>
+      </w:pPr>
+      <w:r>
+        <w:t xml:space="preserve">Норматив першої відповіді</w:t>
+      </w:r>
+      <w:r>
+        <w:t xml:space="preserve"> </w:t>
+      </w:r>
+      <w:r>
+        <w:rPr>
+          <w:bCs/>
+          <w:b/>
+        </w:rPr>
+        <w:t xml:space="preserve">не може перевищувати</w:t>
+      </w:r>
+      <w:r>
+        <w:t xml:space="preserve"> </w:t>
+      </w:r>
+      <w:r>
+        <w:t xml:space="preserve">норматив вирішення, обидва мають бути більшими за нуль — інакше система відхилить збереження з поясненням.</w:t>
+      </w:r>
+    </w:p>
+    <w:p>
+      <w:pPr>
+        <w:numPr>
+          <w:ilvl w:val="0"/>
+          <w:numId w:val="1017"/>
+        </w:numPr>
+        <w:pStyle w:val="Compact"/>
+      </w:pPr>
+      <w:r>
+        <w:t xml:space="preserve">У новоствореної черги нормативу ще немає — під полями буде жовте попередження, а прострочення для такої черги не рахується. Заповніть обидва поля й збережіть, щоб увімкнути SLA для неї.</w:t>
+      </w:r>
+    </w:p>
+    <w:p>
+      <w:pPr>
+        <w:numPr>
+          <w:ilvl w:val="0"/>
+          <w:numId w:val="1017"/>
+        </w:numPr>
+        <w:pStyle w:val="Compact"/>
+      </w:pPr>
+      <w:r>
+        <w:t xml:space="preserve">Кожна зміна нормативу записується в журнал аудиту («Тип: Черга тікетів», дія</w:t>
+      </w:r>
+      <w:r>
+        <w:t xml:space="preserve"> </w:t>
+      </w:r>
+      <w:r>
+        <w:rPr>
+          <w:rStyle w:val="VerbatimChar"/>
+        </w:rPr>
+        <w:t xml:space="preserve">sla_policy_updated</w:t>
+      </w:r>
+      <w:r>
+        <w:t xml:space="preserve">, у деталях — нові значення).</w:t>
+      </w:r>
+    </w:p>
+    <w:p>
+      <w:pPr>
+        <w:numPr>
+          <w:ilvl w:val="0"/>
+          <w:numId w:val="1017"/>
+        </w:numPr>
+        <w:pStyle w:val="Compact"/>
+      </w:pPr>
+      <w:r>
+        <w:t xml:space="preserve">Змінені нормативи не «переписують історію»: закриті тікети прострочення не показують за жодних нормативів.</w:t>
       </w:r>
     </w:p>
     <w:p>
@@ -3069,9 +3177,9 @@
         </w:pict>
       </w:r>
     </w:p>
-    <w:bookmarkEnd w:id="45"/>
     <w:bookmarkEnd w:id="46"/>
-    <w:bookmarkStart w:id="47" w:name="X1c091a7ac5073a7af3d36fe571c8ef570adddd9"/>
+    <w:bookmarkEnd w:id="47"/>
+    <w:bookmarkStart w:id="48" w:name="X1c091a7ac5073a7af3d36fe571c8ef570adddd9"/>
     <w:p>
       <w:pPr>
         <w:pStyle w:val="Heading2"/>
@@ -3092,7 +3200,7 @@
       <w:pPr>
         <w:numPr>
           <w:ilvl w:val="0"/>
-          <w:numId w:val="1017"/>
+          <w:numId w:val="1018"/>
         </w:numPr>
         <w:pStyle w:val="Compact"/>
       </w:pPr>
@@ -3104,7 +3212,7 @@
       <w:pPr>
         <w:numPr>
           <w:ilvl w:val="0"/>
-          <w:numId w:val="1017"/>
+          <w:numId w:val="1018"/>
         </w:numPr>
         <w:pStyle w:val="Compact"/>
       </w:pPr>
@@ -3116,7 +3224,7 @@
       <w:pPr>
         <w:numPr>
           <w:ilvl w:val="0"/>
-          <w:numId w:val="1017"/>
+          <w:numId w:val="1018"/>
         </w:numPr>
         <w:pStyle w:val="Compact"/>
       </w:pPr>
@@ -3128,7 +3236,7 @@
       <w:pPr>
         <w:numPr>
           <w:ilvl w:val="0"/>
-          <w:numId w:val="1017"/>
+          <w:numId w:val="1018"/>
         </w:numPr>
         <w:pStyle w:val="Compact"/>
       </w:pPr>
@@ -3143,8 +3251,8 @@
         </w:pict>
       </w:r>
     </w:p>
-    <w:bookmarkEnd w:id="47"/>
-    <w:bookmarkStart w:id="48" w:name="X15f096bb48513ce1d1cd2a2553b582badd399ba"/>
+    <w:bookmarkEnd w:id="48"/>
+    <w:bookmarkStart w:id="49" w:name="X15f096bb48513ce1d1cd2a2553b582badd399ba"/>
     <w:p>
       <w:pPr>
         <w:pStyle w:val="Heading2"/>
@@ -3225,8 +3333,8 @@
         <w:t xml:space="preserve">Не видаляйте — позначте статус «Архівний» замість цього (розділ 5, «Зміна статусу (архівування)»). Дані, задачі й історія лишаються доступними, але проєкт більше не виглядає активним у списках.</w:t>
       </w:r>
     </w:p>
-    <w:bookmarkEnd w:id="48"/>
     <w:bookmarkEnd w:id="49"/>
+    <w:bookmarkEnd w:id="50"/>
     <w:sectPr/>
   </w:body>
 </w:document>
@@ -3627,6 +3735,9 @@
     </w:lvlOverride>
   </w:num>
   <w:num w:numId="1017">
+    <w:abstractNumId w:val="991"/>
+  </w:num>
+  <w:num w:numId="1018">
     <w:abstractNumId w:val="991"/>
   </w:num>
 </w:numbering>

</xml_diff>

<commit_message>
release 0.1.3 add mail checker
</commit_message>
<xml_diff>
--- a/docs/ITSM_Admin_Guide.docx
+++ b/docs/ITSM_Admin_Guide.docx
@@ -2,7 +2,7 @@
 <file path=word/document.xml><?xml version="1.0" encoding="utf-8"?>
 <w:document xmlns:w="http://schemas.openxmlformats.org/wordprocessingml/2006/main" xmlns:m="http://schemas.openxmlformats.org/officeDocument/2006/math" xmlns:r="http://schemas.openxmlformats.org/officeDocument/2006/relationships" xmlns:o="urn:schemas-microsoft-com:office:office" xmlns:v="urn:schemas-microsoft-com:vml" xmlns:w10="urn:schemas-microsoft-com:office:word" xmlns:a="http://schemas.openxmlformats.org/drawingml/2006/main" xmlns:pic="http://schemas.openxmlformats.org/drawingml/2006/picture" xmlns:wp="http://schemas.openxmlformats.org/drawingml/2006/wordprocessingDrawing">
   <w:body>
-    <w:bookmarkStart w:id="50" w:name="гайд-адміністратора--itsm-system"/>
+    <w:bookmarkStart w:id="51" w:name="гайд-адміністратора--itsm-system"/>
     <w:p>
       <w:pPr>
         <w:pStyle w:val="Heading1"/>
@@ -2635,7 +2635,7 @@
       </w:r>
     </w:p>
     <w:bookmarkEnd w:id="41"/>
-    <w:bookmarkStart w:id="44" w:name="Xabb48b602696d4744d66b80d465a4de026a7727"/>
+    <w:bookmarkStart w:id="45" w:name="Xabb48b602696d4744d66b80d465a4de026a7727"/>
     <w:p>
       <w:pPr>
         <w:pStyle w:val="Heading2"/>
@@ -2847,7 +2847,7 @@
         <w:pStyle w:val="BlockText"/>
       </w:pPr>
       <w:r>
-        <w:t xml:space="preserve">Це розширює базову версію модуля: email-to-ticket (створення тікета з вхідного листа) — запланований наступний крок (див. розділ 12). SLA-ескалація вже реалізована — дивіться нижче.</w:t>
+        <w:t xml:space="preserve">Це розширює базову версію модуля. SLA-ескалація та створення тікетів із пошти (email-to-ticket) описані нижче.</w:t>
       </w:r>
     </w:p>
     <w:bookmarkEnd w:id="42"/>
@@ -2923,6 +2923,684 @@
       </w:pPr>
       <w:r>
         <w:t xml:space="preserve">Прострочення першої відповіді знімається, щойно оператор залишає коментар на тікеті. Обидва прапорці зникають, як тільки тікет переходить у статус «Вирішено» чи «Закрито» — минулі прострочення заднім числом не показуються.</w:t>
+      </w:r>
+    </w:p>
+    <w:bookmarkEnd w:id="43"/>
+    <w:bookmarkStart w:id="44" w:name="email-to-ticket-тікети-з-пошти"/>
+    <w:p>
+      <w:pPr>
+        <w:pStyle w:val="Heading3"/>
+      </w:pPr>
+      <w:r>
+        <w:t xml:space="preserve">Email-to-ticket (тікети з пошти)</w:t>
+      </w:r>
+    </w:p>
+    <w:p>
+      <w:pPr>
+        <w:pStyle w:val="FirstParagraph"/>
+      </w:pPr>
+      <w:r>
+        <w:t xml:space="preserve">Листи, що надходять у поштову скриньку підтримки, автоматично стають тікетами. Налаштовується в</w:t>
+      </w:r>
+      <w:r>
+        <w:t xml:space="preserve"> </w:t>
+      </w:r>
+      <w:r>
+        <w:rPr>
+          <w:bCs/>
+          <w:b/>
+        </w:rPr>
+        <w:t xml:space="preserve">Адмін-панель → «📧 Пошта → тікети»</w:t>
+      </w:r>
+      <w:r>
+        <w:t xml:space="preserve">.</w:t>
+      </w:r>
+    </w:p>
+    <w:p>
+      <w:pPr>
+        <w:pStyle w:val="BodyText"/>
+      </w:pPr>
+      <w:r>
+        <w:rPr>
+          <w:bCs/>
+          <w:b/>
+        </w:rPr>
+        <w:t xml:space="preserve">Як увімкнути (один раз):</w:t>
+      </w:r>
+    </w:p>
+    <w:p>
+      <w:pPr>
+        <w:numPr>
+          <w:ilvl w:val="0"/>
+          <w:numId w:val="1016"/>
+        </w:numPr>
+        <w:pStyle w:val="Compact"/>
+      </w:pPr>
+      <w:r>
+        <w:t xml:space="preserve">У файлі</w:t>
+      </w:r>
+      <w:r>
+        <w:t xml:space="preserve"> </w:t>
+      </w:r>
+      <w:r>
+        <w:rPr>
+          <w:rStyle w:val="VerbatimChar"/>
+        </w:rPr>
+        <w:t xml:space="preserve">.env</w:t>
+      </w:r>
+      <w:r>
+        <w:t xml:space="preserve"> </w:t>
+      </w:r>
+      <w:r>
+        <w:t xml:space="preserve">на сервері (поруч із</w:t>
+      </w:r>
+      <w:r>
+        <w:t xml:space="preserve"> </w:t>
+      </w:r>
+      <w:r>
+        <w:rPr>
+          <w:rStyle w:val="VerbatimChar"/>
+        </w:rPr>
+        <w:t xml:space="preserve">app/</w:t>
+      </w:r>
+      <w:r>
+        <w:t xml:space="preserve">,</w:t>
+      </w:r>
+      <w:r>
+        <w:t xml:space="preserve"> </w:t>
+      </w:r>
+      <w:r>
+        <w:rPr>
+          <w:rStyle w:val="VerbatimChar"/>
+        </w:rPr>
+        <w:t xml:space="preserve">public/</w:t>
+      </w:r>
+      <w:r>
+        <w:t xml:space="preserve">) додайте підключення до скриньки — пароль зберігається лише тут, в інтерфейсі та в БД його немає:</w:t>
+      </w:r>
+    </w:p>
+    <w:p>
+      <w:pPr>
+        <w:numPr>
+          <w:ilvl w:val="0"/>
+          <w:numId w:val="1000"/>
+        </w:numPr>
+        <w:pStyle w:val="SourceCode"/>
+      </w:pPr>
+      <w:r>
+        <w:rPr>
+          <w:rStyle w:val="VerbatimChar"/>
+        </w:rPr>
+        <w:t xml:space="preserve">MAIL_IMAP_HOST=imap.example.org</w:t>
+      </w:r>
+      <w:r>
+        <w:br/>
+      </w:r>
+      <w:r>
+        <w:rPr>
+          <w:rStyle w:val="VerbatimChar"/>
+        </w:rPr>
+        <w:t xml:space="preserve">MAIL_IMAP_PORT=993</w:t>
+      </w:r>
+      <w:r>
+        <w:br/>
+      </w:r>
+      <w:r>
+        <w:rPr>
+          <w:rStyle w:val="VerbatimChar"/>
+        </w:rPr>
+        <w:t xml:space="preserve">MAIL_IMAP_ENCRYPTION=ssl</w:t>
+      </w:r>
+      <w:r>
+        <w:br/>
+      </w:r>
+      <w:r>
+        <w:rPr>
+          <w:rStyle w:val="VerbatimChar"/>
+        </w:rPr>
+        <w:t xml:space="preserve">MAIL_IMAP_USERNAME=support@example.org</w:t>
+      </w:r>
+      <w:r>
+        <w:br/>
+      </w:r>
+      <w:r>
+        <w:rPr>
+          <w:rStyle w:val="VerbatimChar"/>
+        </w:rPr>
+        <w:t xml:space="preserve">MAIL_IMAP_PASSWORD=пароль</w:t>
+      </w:r>
+      <w:r>
+        <w:br/>
+      </w:r>
+      <w:r>
+        <w:rPr>
+          <w:rStyle w:val="VerbatimChar"/>
+        </w:rPr>
+        <w:t xml:space="preserve">MAIL_IMAP_FOLDER=INBOX</w:t>
+      </w:r>
+    </w:p>
+    <w:p>
+      <w:pPr>
+        <w:numPr>
+          <w:ilvl w:val="0"/>
+          <w:numId w:val="1000"/>
+        </w:numPr>
+        <w:pStyle w:val="Compact"/>
+      </w:pPr>
+      <w:r>
+        <w:rPr>
+          <w:rStyle w:val="VerbatimChar"/>
+        </w:rPr>
+        <w:t xml:space="preserve">MAIL_IMAP_ENCRYPTION</w:t>
+      </w:r>
+      <w:r>
+        <w:t xml:space="preserve">:</w:t>
+      </w:r>
+      <w:r>
+        <w:t xml:space="preserve"> </w:t>
+      </w:r>
+      <w:r>
+        <w:rPr>
+          <w:rStyle w:val="VerbatimChar"/>
+        </w:rPr>
+        <w:t xml:space="preserve">ssl</w:t>
+      </w:r>
+      <w:r>
+        <w:t xml:space="preserve"> </w:t>
+      </w:r>
+      <w:r>
+        <w:t xml:space="preserve">(порт 993),</w:t>
+      </w:r>
+      <w:r>
+        <w:t xml:space="preserve"> </w:t>
+      </w:r>
+      <w:r>
+        <w:rPr>
+          <w:rStyle w:val="VerbatimChar"/>
+        </w:rPr>
+        <w:t xml:space="preserve">tls</w:t>
+      </w:r>
+      <w:r>
+        <w:t xml:space="preserve"> </w:t>
+      </w:r>
+      <w:r>
+        <w:t xml:space="preserve">(STARTTLS, порт 143) або</w:t>
+      </w:r>
+      <w:r>
+        <w:t xml:space="preserve"> </w:t>
+      </w:r>
+      <w:r>
+        <w:rPr>
+          <w:rStyle w:val="VerbatimChar"/>
+        </w:rPr>
+        <w:t xml:space="preserve">none</w:t>
+      </w:r>
+      <w:r>
+        <w:t xml:space="preserve">. Порт можна не вказувати — він підставиться за типом шифрування. Для внутрішнього сервера з власним (самопідписаним) сертифікатом додайте</w:t>
+      </w:r>
+      <w:r>
+        <w:t xml:space="preserve"> </w:t>
+      </w:r>
+      <w:r>
+        <w:rPr>
+          <w:rStyle w:val="VerbatimChar"/>
+        </w:rPr>
+        <w:t xml:space="preserve">MAIL_IMAP_VERIFY_CERT=false</w:t>
+      </w:r>
+      <w:r>
+        <w:t xml:space="preserve">. Значення береться як є: пробіли та</w:t>
+      </w:r>
+      <w:r>
+        <w:t xml:space="preserve"> </w:t>
+      </w:r>
+      <w:r>
+        <w:rPr>
+          <w:rStyle w:val="VerbatimChar"/>
+        </w:rPr>
+        <w:t xml:space="preserve">#</w:t>
+      </w:r>
+      <w:r>
+        <w:t xml:space="preserve"> </w:t>
+      </w:r>
+      <w:r>
+        <w:t xml:space="preserve">усередині пароля допустимі, лапки навколо значення необов'язкові (відкидається одна парна обгортка). Коментарі в</w:t>
+      </w:r>
+      <w:r>
+        <w:t xml:space="preserve"> </w:t>
+      </w:r>
+      <w:r>
+        <w:rPr>
+          <w:rStyle w:val="VerbatimChar"/>
+        </w:rPr>
+        <w:t xml:space="preserve">.env</w:t>
+      </w:r>
+      <w:r>
+        <w:t xml:space="preserve"> </w:t>
+      </w:r>
+      <w:r>
+        <w:t xml:space="preserve">— лише окремими рядками, не в кінці рядка зі значенням.</w:t>
+      </w:r>
+    </w:p>
+    <w:p>
+      <w:pPr>
+        <w:numPr>
+          <w:ilvl w:val="0"/>
+          <w:numId w:val="1016"/>
+        </w:numPr>
+        <w:pStyle w:val="Compact"/>
+      </w:pPr>
+      <w:r>
+        <w:t xml:space="preserve">Відкрийте сторінку «Пошта → тікети» й натисніть</w:t>
+      </w:r>
+      <w:r>
+        <w:t xml:space="preserve"> </w:t>
+      </w:r>
+      <w:r>
+        <w:rPr>
+          <w:bCs/>
+          <w:b/>
+        </w:rPr>
+        <w:t xml:space="preserve">«Перевірити з'єднання»</w:t>
+      </w:r>
+      <w:r>
+        <w:t xml:space="preserve"> </w:t>
+      </w:r>
+      <w:r>
+        <w:t xml:space="preserve">— система підключиться, залогінюється й покаже, скільки листів у скриньці. Помилки пояснюються прямо (наприклад, «сертифікат не пройшов перевірку… вкажіть MAIL_IMAP_VERIFY_CERT=false» або «порт 993 потребує ssl, порт 143 — tls чи none»).</w:t>
+      </w:r>
+    </w:p>
+    <w:p>
+      <w:pPr>
+        <w:numPr>
+          <w:ilvl w:val="0"/>
+          <w:numId w:val="1016"/>
+        </w:numPr>
+        <w:pStyle w:val="Compact"/>
+      </w:pPr>
+      <w:r>
+        <w:t xml:space="preserve">Оберіть</w:t>
+      </w:r>
+      <w:r>
+        <w:t xml:space="preserve"> </w:t>
+      </w:r>
+      <w:r>
+        <w:rPr>
+          <w:bCs/>
+          <w:b/>
+        </w:rPr>
+        <w:t xml:space="preserve">чергу</w:t>
+      </w:r>
+      <w:r>
+        <w:t xml:space="preserve">, у яку потраплятимуть тікети з пошти, поставте галочку</w:t>
+      </w:r>
+      <w:r>
+        <w:t xml:space="preserve"> </w:t>
+      </w:r>
+      <w:r>
+        <w:rPr>
+          <w:bCs/>
+          <w:b/>
+        </w:rPr>
+        <w:t xml:space="preserve">«Автоматично обробляти пошту»</w:t>
+      </w:r>
+      <w:r>
+        <w:t xml:space="preserve"> </w:t>
+      </w:r>
+      <w:r>
+        <w:t xml:space="preserve">й збережіть.</w:t>
+      </w:r>
+    </w:p>
+    <w:p>
+      <w:pPr>
+        <w:numPr>
+          <w:ilvl w:val="0"/>
+          <w:numId w:val="1016"/>
+        </w:numPr>
+        <w:pStyle w:val="Compact"/>
+      </w:pPr>
+      <w:r>
+        <w:t xml:space="preserve">Додайте запуск за розкладом у cron сервера (рядок із вашим реальним шляхом показано на цій самій сторінці), наприклад кожні 5 хвилин від імені користувача веб-сервера:</w:t>
+      </w:r>
+    </w:p>
+    <w:p>
+      <w:pPr>
+        <w:numPr>
+          <w:ilvl w:val="0"/>
+          <w:numId w:val="1000"/>
+        </w:numPr>
+        <w:pStyle w:val="SourceCode"/>
+      </w:pPr>
+      <w:r>
+        <w:rPr>
+          <w:rStyle w:val="VerbatimChar"/>
+        </w:rPr>
+        <w:t xml:space="preserve">*/5 * * * *  www-data  php /var/www/itsm-system/bin/fetch-mail.php &gt;&gt; /var/log/itsm-mail.log 2&gt;&amp;1</w:t>
+      </w:r>
+    </w:p>
+    <w:p>
+      <w:pPr>
+        <w:numPr>
+          <w:ilvl w:val="0"/>
+          <w:numId w:val="1000"/>
+        </w:numPr>
+        <w:pStyle w:val="Compact"/>
+      </w:pPr>
+      <w:r>
+        <w:t xml:space="preserve">Без cron кнопка</w:t>
+      </w:r>
+      <w:r>
+        <w:t xml:space="preserve"> </w:t>
+      </w:r>
+      <w:r>
+        <w:rPr>
+          <w:bCs/>
+          <w:b/>
+        </w:rPr>
+        <w:t xml:space="preserve">«Забрати пошту зараз»</w:t>
+      </w:r>
+      <w:r>
+        <w:t xml:space="preserve"> </w:t>
+      </w:r>
+      <w:r>
+        <w:t xml:space="preserve">(працює незалежно від галочки) обробить пошту вручну. Із командного рядка:</w:t>
+      </w:r>
+      <w:r>
+        <w:t xml:space="preserve"> </w:t>
+      </w:r>
+      <w:r>
+        <w:rPr>
+          <w:rStyle w:val="VerbatimChar"/>
+        </w:rPr>
+        <w:t xml:space="preserve">php bin/fetch-mail.php --test</w:t>
+      </w:r>
+      <w:r>
+        <w:t xml:space="preserve"> </w:t>
+      </w:r>
+      <w:r>
+        <w:t xml:space="preserve">(лише перевірка підключення) і</w:t>
+      </w:r>
+      <w:r>
+        <w:t xml:space="preserve"> </w:t>
+      </w:r>
+      <w:r>
+        <w:rPr>
+          <w:rStyle w:val="VerbatimChar"/>
+        </w:rPr>
+        <w:t xml:space="preserve">--force</w:t>
+      </w:r>
+      <w:r>
+        <w:t xml:space="preserve"> </w:t>
+      </w:r>
+      <w:r>
+        <w:t xml:space="preserve">(обробити, навіть якщо галочку вимкнено).</w:t>
+      </w:r>
+    </w:p>
+    <w:p>
+      <w:pPr>
+        <w:pStyle w:val="FirstParagraph"/>
+      </w:pPr>
+      <w:r>
+        <w:rPr>
+          <w:bCs/>
+          <w:b/>
+        </w:rPr>
+        <w:t xml:space="preserve">Що з кожним листом:</w:t>
+      </w:r>
+    </w:p>
+    <w:p>
+      <w:pPr>
+        <w:numPr>
+          <w:ilvl w:val="0"/>
+          <w:numId w:val="1017"/>
+        </w:numPr>
+        <w:pStyle w:val="Compact"/>
+      </w:pPr>
+      <w:r>
+        <w:rPr>
+          <w:bCs/>
+          <w:b/>
+        </w:rPr>
+        <w:t xml:space="preserve">Новий тікет</w:t>
+      </w:r>
+      <w:r>
+        <w:t xml:space="preserve"> </w:t>
+      </w:r>
+      <w:r>
+        <w:t xml:space="preserve">— тема листа → тема тікета (префікси «Re:», «Fwd:», «Відп:» прибираються), текст → опис, відправник → заявник. Якщо адреса відправника збігається з активним користувачем системи, тікет прив'язується до нього й з'являється в його особистому списку «Тікети».</w:t>
+      </w:r>
+    </w:p>
+    <w:p>
+      <w:pPr>
+        <w:numPr>
+          <w:ilvl w:val="0"/>
+          <w:numId w:val="1017"/>
+        </w:numPr>
+        <w:pStyle w:val="Compact"/>
+      </w:pPr>
+      <w:r>
+        <w:rPr>
+          <w:bCs/>
+          <w:b/>
+        </w:rPr>
+        <w:t xml:space="preserve">Відповідь у наявній гілці</w:t>
+      </w:r>
+      <w:r>
+        <w:t xml:space="preserve"> </w:t>
+      </w:r>
+      <w:r>
+        <w:t xml:space="preserve">→ коментар до вже створеного тікета, а не новий тікет. Відповідь розпізнається за заголовками листування (In-Reply-To/References — працює для будь-кого з гілки, напр. колеги в копії; тоді на початку коментаря додається «Від: ім'я &lt;адреса&gt;»), або за міткою</w:t>
+      </w:r>
+      <w:r>
+        <w:t xml:space="preserve"> </w:t>
+      </w:r>
+      <w:r>
+        <w:rPr>
+          <w:rStyle w:val="VerbatimChar"/>
+        </w:rPr>
+        <w:t xml:space="preserve">[#123]</w:t>
+      </w:r>
+      <w:r>
+        <w:t xml:space="preserve"> </w:t>
+      </w:r>
+      <w:r>
+        <w:t xml:space="preserve">у темі (лише від заявника цього тікета). Процитований попередній лист («пн, 28 вер. … пише:», «On … wrote:», блок «From/Sent» Outlook) з коментаря відрізається.</w:t>
+      </w:r>
+    </w:p>
+    <w:p>
+      <w:pPr>
+        <w:numPr>
+          <w:ilvl w:val="0"/>
+          <w:numId w:val="1017"/>
+        </w:numPr>
+        <w:pStyle w:val="Compact"/>
+      </w:pPr>
+      <w:r>
+        <w:rPr>
+          <w:bCs/>
+          <w:b/>
+        </w:rPr>
+        <w:t xml:space="preserve">Пропускаються</w:t>
+      </w:r>
+      <w:r>
+        <w:t xml:space="preserve"> </w:t>
+      </w:r>
+      <w:r>
+        <w:t xml:space="preserve">(з причиною в журналі): автовідповіді (Auto-Submitted), розсилки (Precedence: bulk/list, List-Id), повідомлення про недоставку, листи від самої скриньки (захист від циклів), порожні листи, листи без коректної адреси відправника й листи понад 10 МБ.</w:t>
+      </w:r>
+    </w:p>
+    <w:p>
+      <w:pPr>
+        <w:numPr>
+          <w:ilvl w:val="0"/>
+          <w:numId w:val="1017"/>
+        </w:numPr>
+        <w:pStyle w:val="Compact"/>
+      </w:pPr>
+      <w:r>
+        <w:t xml:space="preserve">Один і той самий лист</w:t>
+      </w:r>
+      <w:r>
+        <w:t xml:space="preserve"> </w:t>
+      </w:r>
+      <w:r>
+        <w:rPr>
+          <w:bCs/>
+          <w:b/>
+        </w:rPr>
+        <w:t xml:space="preserve">ніколи не обробляється двічі</w:t>
+      </w:r>
+      <w:r>
+        <w:t xml:space="preserve"> </w:t>
+      </w:r>
+      <w:r>
+        <w:t xml:space="preserve">— навіть якщо його позначили непрочитаним удруге.</w:t>
+      </w:r>
+    </w:p>
+    <w:p>
+      <w:pPr>
+        <w:numPr>
+          <w:ilvl w:val="0"/>
+          <w:numId w:val="1017"/>
+        </w:numPr>
+        <w:pStyle w:val="Compact"/>
+      </w:pPr>
+      <w:r>
+        <w:t xml:space="preserve">Лист позначається прочитаним лише після успішної обробки; якщо обробка не вдалась (наприклад, збій БД), він лишається непрочитаним і буде повторений наступного разу.</w:t>
+      </w:r>
+    </w:p>
+    <w:p>
+      <w:pPr>
+        <w:pStyle w:val="FirstParagraph"/>
+      </w:pPr>
+      <w:r>
+        <w:rPr>
+          <w:bCs/>
+          <w:b/>
+        </w:rPr>
+        <w:t xml:space="preserve">Журнал обробки</w:t>
+      </w:r>
+      <w:r>
+        <w:t xml:space="preserve"> </w:t>
+      </w:r>
+      <w:r>
+        <w:t xml:space="preserve">на тій самій сторінці показує останні 50 листів — і створені, і пропущені, із причиною. Якщо хтось скаржиться, що його лист не став тікетом, дивіться сюди першим.</w:t>
+      </w:r>
+    </w:p>
+    <w:p>
+      <w:pPr>
+        <w:pStyle w:val="BodyText"/>
+      </w:pPr>
+      <w:r>
+        <w:rPr>
+          <w:bCs/>
+          <w:b/>
+        </w:rPr>
+        <w:t xml:space="preserve">Обмеження, про які варто знати:</w:t>
+      </w:r>
+    </w:p>
+    <w:p>
+      <w:pPr>
+        <w:numPr>
+          <w:ilvl w:val="0"/>
+          <w:numId w:val="1018"/>
+        </w:numPr>
+        <w:pStyle w:val="Compact"/>
+      </w:pPr>
+      <w:r>
+        <w:rPr>
+          <w:bCs/>
+          <w:b/>
+        </w:rPr>
+        <w:t xml:space="preserve">Вкладення не зберігаються</w:t>
+      </w:r>
+      <w:r>
+        <w:t xml:space="preserve"> </w:t>
+      </w:r>
+      <w:r>
+        <w:t xml:space="preserve">(модуля файлів ще немає) — у тікеті лише їх перелік: «[Вкладення не збережено в системі: …]».</w:t>
+      </w:r>
+    </w:p>
+    <w:p>
+      <w:pPr>
+        <w:numPr>
+          <w:ilvl w:val="0"/>
+          <w:numId w:val="1018"/>
+        </w:numPr>
+        <w:pStyle w:val="Compact"/>
+      </w:pPr>
+      <w:r>
+        <w:t xml:space="preserve">Текст понад 20 000 символів скорочується (з приміткою).</w:t>
+      </w:r>
+    </w:p>
+    <w:p>
+      <w:pPr>
+        <w:numPr>
+          <w:ilvl w:val="0"/>
+          <w:numId w:val="1018"/>
+        </w:numPr>
+        <w:pStyle w:val="Compact"/>
+      </w:pPr>
+      <w:r>
+        <w:rPr>
+          <w:bCs/>
+          <w:b/>
+        </w:rPr>
+        <w:t xml:space="preserve">Заявник без облікового запису не отримує посилання для відстеження</w:t>
+      </w:r>
+      <w:r>
+        <w:t xml:space="preserve"> </w:t>
+      </w:r>
+      <w:r>
+        <w:t xml:space="preserve">— система поки нічого не надсилає поштою (це окремий наступний крок: email-сповіщення). Оператору варто відповісти йому іншим каналом.</w:t>
+      </w:r>
+    </w:p>
+    <w:p>
+      <w:pPr>
+        <w:numPr>
+          <w:ilvl w:val="0"/>
+          <w:numId w:val="1018"/>
+        </w:numPr>
+        <w:pStyle w:val="Compact"/>
+      </w:pPr>
+      <w:r>
+        <w:rPr>
+          <w:bCs/>
+          <w:b/>
+        </w:rPr>
+        <w:t xml:space="preserve">Справжність відправника не перевіряється</w:t>
+      </w:r>
+      <w:r>
+        <w:t xml:space="preserve"> </w:t>
+      </w:r>
+      <w:r>
+        <w:t xml:space="preserve">(SPF/DKIM не аналізуються): будь-хто може написати від імені співробітника. Спирайтесь на антиспам- та SPF-фільтрацію самого поштового сервера. Дописування в тікети за міткою</w:t>
+      </w:r>
+      <w:r>
+        <w:t xml:space="preserve"> </w:t>
+      </w:r>
+      <w:r>
+        <w:rPr>
+          <w:rStyle w:val="VerbatimChar"/>
+        </w:rPr>
+        <w:t xml:space="preserve">[#N]</w:t>
+      </w:r>
+      <w:r>
+        <w:t xml:space="preserve"> </w:t>
+      </w:r>
+      <w:r>
+        <w:t xml:space="preserve">від сторонніх адрес система відхиляє, а лист «від оператора» завжди записується як коментар заявника — підроблений відправник не зачепить SLA.</w:t>
+      </w:r>
+    </w:p>
+    <w:p>
+      <w:pPr>
+        <w:numPr>
+          <w:ilvl w:val="0"/>
+          <w:numId w:val="1018"/>
+        </w:numPr>
+        <w:pStyle w:val="Compact"/>
+      </w:pPr>
+      <w:r>
+        <w:t xml:space="preserve">За один запуск обробляється до 50 листів; решта — наступного разу.</w:t>
       </w:r>
     </w:p>
     <w:p>
@@ -2932,9 +3610,9 @@
         </w:pict>
       </w:r>
     </w:p>
-    <w:bookmarkEnd w:id="43"/>
     <w:bookmarkEnd w:id="44"/>
-    <w:bookmarkStart w:id="47" w:name="Xfd3b571dc2ba161e01d4de304ef5647943b2305"/>
+    <w:bookmarkEnd w:id="45"/>
+    <w:bookmarkStart w:id="48" w:name="Xfd3b571dc2ba161e01d4de304ef5647943b2305"/>
     <w:p>
       <w:pPr>
         <w:pStyle w:val="Heading2"/>
@@ -2960,7 +3638,7 @@
         <w:t xml:space="preserve">Черги — це категорії, за якими розподіляються звернення (наприклад, «Загальна підтримка», «Мережева підтримка», «Бухгалтерські системи»). При створенні тікета користувач обирає чергу зі списку.</w:t>
       </w:r>
     </w:p>
-    <w:bookmarkStart w:id="45" w:name="створення-нової-черги"/>
+    <w:bookmarkStart w:id="46" w:name="створення-нової-черги"/>
     <w:p>
       <w:pPr>
         <w:pStyle w:val="Heading3"/>
@@ -2973,7 +3651,7 @@
       <w:pPr>
         <w:numPr>
           <w:ilvl w:val="0"/>
-          <w:numId w:val="1016"/>
+          <w:numId w:val="1019"/>
         </w:numPr>
         <w:pStyle w:val="Compact"/>
       </w:pPr>
@@ -2998,7 +3676,7 @@
       <w:pPr>
         <w:numPr>
           <w:ilvl w:val="0"/>
-          <w:numId w:val="1016"/>
+          <w:numId w:val="1019"/>
         </w:numPr>
         <w:pStyle w:val="Compact"/>
       </w:pPr>
@@ -3010,7 +3688,7 @@
       <w:pPr>
         <w:numPr>
           <w:ilvl w:val="0"/>
-          <w:numId w:val="1016"/>
+          <w:numId w:val="1019"/>
         </w:numPr>
         <w:pStyle w:val="Compact"/>
       </w:pPr>
@@ -3039,8 +3717,8 @@
         <w:t xml:space="preserve">Нова черга одразу з'являється у випадаючому списку на сторінці створення тікета — жодних додаткових дій не потрібно.</w:t>
       </w:r>
     </w:p>
-    <w:bookmarkEnd w:id="45"/>
-    <w:bookmarkStart w:id="46" w:name="sla-нормативи-черги"/>
+    <w:bookmarkEnd w:id="46"/>
+    <w:bookmarkStart w:id="47" w:name="sla-нормативи-черги"/>
     <w:p>
       <w:pPr>
         <w:pStyle w:val="Heading3"/>
@@ -3090,7 +3768,7 @@
       <w:pPr>
         <w:numPr>
           <w:ilvl w:val="0"/>
-          <w:numId w:val="1017"/>
+          <w:numId w:val="1020"/>
         </w:numPr>
         <w:pStyle w:val="Compact"/>
       </w:pPr>
@@ -3118,7 +3796,7 @@
       <w:pPr>
         <w:numPr>
           <w:ilvl w:val="0"/>
-          <w:numId w:val="1017"/>
+          <w:numId w:val="1020"/>
         </w:numPr>
         <w:pStyle w:val="Compact"/>
       </w:pPr>
@@ -3130,7 +3808,7 @@
       <w:pPr>
         <w:numPr>
           <w:ilvl w:val="0"/>
-          <w:numId w:val="1017"/>
+          <w:numId w:val="1020"/>
         </w:numPr>
         <w:pStyle w:val="Compact"/>
       </w:pPr>
@@ -3154,7 +3832,7 @@
       <w:pPr>
         <w:numPr>
           <w:ilvl w:val="0"/>
-          <w:numId w:val="1017"/>
+          <w:numId w:val="1020"/>
         </w:numPr>
         <w:pStyle w:val="Compact"/>
       </w:pPr>
@@ -3177,9 +3855,9 @@
         </w:pict>
       </w:r>
     </w:p>
-    <w:bookmarkEnd w:id="46"/>
     <w:bookmarkEnd w:id="47"/>
-    <w:bookmarkStart w:id="48" w:name="X1c091a7ac5073a7af3d36fe571c8ef570adddd9"/>
+    <w:bookmarkEnd w:id="48"/>
+    <w:bookmarkStart w:id="49" w:name="X1c091a7ac5073a7af3d36fe571c8ef570adddd9"/>
     <w:p>
       <w:pPr>
         <w:pStyle w:val="Heading2"/>
@@ -3200,19 +3878,19 @@
       <w:pPr>
         <w:numPr>
           <w:ilvl w:val="0"/>
-          <w:numId w:val="1018"/>
-        </w:numPr>
-        <w:pStyle w:val="Compact"/>
-      </w:pPr>
-      <w:r>
-        <w:t xml:space="preserve">Email-to-ticket (створення тікета з вхідного листа); подання без облікового запису, оцінка CSAT і SLA-ескалація вже реалізовані (розділ 10).</w:t>
-      </w:r>
-    </w:p>
-    <w:p>
-      <w:pPr>
-        <w:numPr>
-          <w:ilvl w:val="0"/>
-          <w:numId w:val="1018"/>
+          <w:numId w:val="1021"/>
+        </w:numPr>
+        <w:pStyle w:val="Compact"/>
+      </w:pPr>
+      <w:r>
+        <w:t xml:space="preserve">Збереження вкладень (у тікетах з пошти та в порталі): наразі лише перелік імен; подання без облікового запису, оцінка CSAT, SLA-ескалація та email-to-ticket вже реалізовані (розділ 10).</w:t>
+      </w:r>
+    </w:p>
+    <w:p>
+      <w:pPr>
+        <w:numPr>
+          <w:ilvl w:val="0"/>
+          <w:numId w:val="1021"/>
         </w:numPr>
         <w:pStyle w:val="Compact"/>
       </w:pPr>
@@ -3224,7 +3902,7 @@
       <w:pPr>
         <w:numPr>
           <w:ilvl w:val="0"/>
-          <w:numId w:val="1018"/>
+          <w:numId w:val="1021"/>
         </w:numPr>
         <w:pStyle w:val="Compact"/>
       </w:pPr>
@@ -3236,12 +3914,12 @@
       <w:pPr>
         <w:numPr>
           <w:ilvl w:val="0"/>
-          <w:numId w:val="1018"/>
-        </w:numPr>
-        <w:pStyle w:val="Compact"/>
-      </w:pPr>
-      <w:r>
-        <w:t xml:space="preserve">Email-сповіщення, вебхуки, REST API.</w:t>
+          <w:numId w:val="1021"/>
+        </w:numPr>
+        <w:pStyle w:val="Compact"/>
+      </w:pPr>
+      <w:r>
+        <w:t xml:space="preserve">Email-сповіщення (зокрема автовідповідь із посиланням для відстеження), вебхуки, REST API.</w:t>
       </w:r>
     </w:p>
     <w:p>
@@ -3251,8 +3929,8 @@
         </w:pict>
       </w:r>
     </w:p>
-    <w:bookmarkEnd w:id="48"/>
-    <w:bookmarkStart w:id="49" w:name="X15f096bb48513ce1d1cd2a2553b582badd399ba"/>
+    <w:bookmarkEnd w:id="49"/>
+    <w:bookmarkStart w:id="50" w:name="X15f096bb48513ce1d1cd2a2553b582badd399ba"/>
     <w:p>
       <w:pPr>
         <w:pStyle w:val="Heading2"/>
@@ -3333,8 +4011,8 @@
         <w:t xml:space="preserve">Не видаляйте — позначте статус «Архівний» замість цього (розділ 5, «Зміна статусу (архівування)»). Дані, задачі й історія лишаються доступними, але проєкт більше не виглядає активним у списках.</w:t>
       </w:r>
     </w:p>
-    <w:bookmarkEnd w:id="49"/>
     <w:bookmarkEnd w:id="50"/>
+    <w:bookmarkEnd w:id="51"/>
     <w:sectPr/>
   </w:body>
 </w:document>
@@ -3738,6 +4416,42 @@
     <w:abstractNumId w:val="991"/>
   </w:num>
   <w:num w:numId="1018">
+    <w:abstractNumId w:val="991"/>
+  </w:num>
+  <w:num w:numId="1019">
+    <w:abstractNumId w:val="99411"/>
+    <w:lvlOverride w:ilvl="0">
+      <w:startOverride w:val="1"/>
+    </w:lvlOverride>
+    <w:lvlOverride w:ilvl="1">
+      <w:startOverride w:val="1"/>
+    </w:lvlOverride>
+    <w:lvlOverride w:ilvl="2">
+      <w:startOverride w:val="1"/>
+    </w:lvlOverride>
+    <w:lvlOverride w:ilvl="3">
+      <w:startOverride w:val="1"/>
+    </w:lvlOverride>
+    <w:lvlOverride w:ilvl="4">
+      <w:startOverride w:val="1"/>
+    </w:lvlOverride>
+    <w:lvlOverride w:ilvl="5">
+      <w:startOverride w:val="1"/>
+    </w:lvlOverride>
+    <w:lvlOverride w:ilvl="6">
+      <w:startOverride w:val="1"/>
+    </w:lvlOverride>
+    <w:lvlOverride w:ilvl="7">
+      <w:startOverride w:val="1"/>
+    </w:lvlOverride>
+    <w:lvlOverride w:ilvl="8">
+      <w:startOverride w:val="1"/>
+    </w:lvlOverride>
+  </w:num>
+  <w:num w:numId="1020">
+    <w:abstractNumId w:val="991"/>
+  </w:num>
+  <w:num w:numId="1021">
     <w:abstractNumId w:val="991"/>
   </w:num>
 </w:numbering>

</xml_diff>

<commit_message>
release 0.2.0 add new features
</commit_message>
<xml_diff>
--- a/docs/ITSM_Admin_Guide.docx
+++ b/docs/ITSM_Admin_Guide.docx
@@ -2,7 +2,7 @@
 <file path=word/document.xml><?xml version="1.0" encoding="utf-8"?>
 <w:document xmlns:w="http://schemas.openxmlformats.org/wordprocessingml/2006/main" xmlns:m="http://schemas.openxmlformats.org/officeDocument/2006/math" xmlns:r="http://schemas.openxmlformats.org/officeDocument/2006/relationships" xmlns:o="urn:schemas-microsoft-com:office:office" xmlns:v="urn:schemas-microsoft-com:vml" xmlns:w10="urn:schemas-microsoft-com:office:word" xmlns:a="http://schemas.openxmlformats.org/drawingml/2006/main" xmlns:pic="http://schemas.openxmlformats.org/drawingml/2006/picture" xmlns:wp="http://schemas.openxmlformats.org/drawingml/2006/wordprocessingDrawing">
   <w:body>
-    <w:bookmarkStart w:id="51" w:name="гайд-адміністратора--itsm-system"/>
+    <w:bookmarkStart w:id="53" w:name="гайд-адміністратора--itsm-system"/>
     <w:p>
       <w:pPr>
         <w:pStyle w:val="Heading1"/>
@@ -20,7 +20,7 @@
           <w:iCs/>
           <w:i/>
         </w:rPr>
-        <w:t xml:space="preserve">Версія застосунку: 0.1.3</w:t>
+        <w:t xml:space="preserve">Версія застосунку: 0.2.0</w:t>
       </w:r>
     </w:p>
     <w:p>
@@ -1235,7 +1235,22 @@
         <w:t xml:space="preserve"> </w:t>
       </w:r>
       <w:r>
-        <w:t xml:space="preserve">проєкту підпроєкти показуються картками вгорі сторінки (над описом).</w:t>
+        <w:t xml:space="preserve">проєкту підпроєкти показуються картками вгорі сторінки (над описом). Картка основного проєкту в головному списку</w:t>
+      </w:r>
+      <w:r>
+        <w:t xml:space="preserve"> </w:t>
+      </w:r>
+      <w:r>
+        <w:rPr>
+          <w:rStyle w:val="VerbatimChar"/>
+        </w:rPr>
+        <w:t xml:space="preserve">/projects</w:t>
+      </w:r>
+      <w:r>
+        <w:t xml:space="preserve"> </w:t>
+      </w:r>
+      <w:r>
+        <w:t xml:space="preserve">показує кількість підпроєктів бейджем («📁 3 підпроєкти»), якщо вони є — рахуються лише незакриті.</w:t>
       </w:r>
     </w:p>
     <w:p>
@@ -1307,6 +1322,47 @@
       </w:r>
       <w:r>
         <w:t xml:space="preserve">— лише основні проєкти, щоб не перевантажувати список; підпроєкт відкривається з картки на сторінці свого основного проєкту.</w:t>
+      </w:r>
+      <w:r>
+        <w:t xml:space="preserve"> </w:t>
+      </w:r>
+      <w:r>
+        <w:rPr>
+          <w:bCs/>
+          <w:b/>
+        </w:rPr>
+        <w:t xml:space="preserve">Закриті</w:t>
+      </w:r>
+      <w:r>
+        <w:t xml:space="preserve"> </w:t>
+      </w:r>
+      <w:r>
+        <w:t xml:space="preserve">проєкти (і основні, і підпроєкти) також прибрані з обох списків і з карток підпроєктів на сторінці основного проєкту — вони зібрані окремо на сторінці</w:t>
+      </w:r>
+      <w:r>
+        <w:t xml:space="preserve"> </w:t>
+      </w:r>
+      <w:r>
+        <w:rPr>
+          <w:bCs/>
+          <w:b/>
+        </w:rPr>
+        <w:t xml:space="preserve">«Архів»</w:t>
+      </w:r>
+      <w:r>
+        <w:t xml:space="preserve"> </w:t>
+      </w:r>
+      <w:r>
+        <w:t xml:space="preserve">(</w:t>
+      </w:r>
+      <w:r>
+        <w:rPr>
+          <w:rStyle w:val="VerbatimChar"/>
+        </w:rPr>
+        <w:t xml:space="preserve">/archive</w:t>
+      </w:r>
+      <w:r>
+        <w:t xml:space="preserve">, посилання в навігації), разом із закритими тікетами й задачами; видимість там та сама, що й у звичайних списках.</w:t>
       </w:r>
     </w:p>
     <w:p>
@@ -2635,7 +2691,7 @@
       </w:r>
     </w:p>
     <w:bookmarkEnd w:id="41"/>
-    <w:bookmarkStart w:id="45" w:name="Xabb48b602696d4744d66b80d465a4de026a7727"/>
+    <w:bookmarkStart w:id="47" w:name="Xabb48b602696d4744d66b80d465a4de026a7727"/>
     <w:p>
       <w:pPr>
         <w:pStyle w:val="Heading2"/>
@@ -2740,6 +2796,74 @@
       </w:pPr>
       <w:r>
         <w:t xml:space="preserve">Час першої відповіді оператора та час вирішення фіксуються автоматично в базі даних (для майбутньої SLA-звітності — окремого звіту в інтерфейсі поки немає).</w:t>
+      </w:r>
+    </w:p>
+    <w:p>
+      <w:pPr>
+        <w:numPr>
+          <w:ilvl w:val="0"/>
+          <w:numId w:val="1014"/>
+        </w:numPr>
+        <w:pStyle w:val="Compact"/>
+      </w:pPr>
+      <w:r>
+        <w:t xml:space="preserve">Тікети зі статусом</w:t>
+      </w:r>
+      <w:r>
+        <w:t xml:space="preserve"> </w:t>
+      </w:r>
+      <w:r>
+        <w:rPr>
+          <w:bCs/>
+          <w:b/>
+        </w:rPr>
+        <w:t xml:space="preserve">«Закрито»</w:t>
+      </w:r>
+      <w:r>
+        <w:t xml:space="preserve"> </w:t>
+      </w:r>
+      <w:r>
+        <w:t xml:space="preserve">прибрані зі списку</w:t>
+      </w:r>
+      <w:r>
+        <w:t xml:space="preserve"> </w:t>
+      </w:r>
+      <w:r>
+        <w:rPr>
+          <w:rStyle w:val="VerbatimChar"/>
+        </w:rPr>
+        <w:t xml:space="preserve">/tickets</w:t>
+      </w:r>
+      <w:r>
+        <w:t xml:space="preserve"> </w:t>
+      </w:r>
+      <w:r>
+        <w:t xml:space="preserve">(статус «Вирішено» лишається видимим) — зібрані окремо на сторінці</w:t>
+      </w:r>
+      <w:r>
+        <w:t xml:space="preserve"> </w:t>
+      </w:r>
+      <w:r>
+        <w:rPr>
+          <w:bCs/>
+          <w:b/>
+        </w:rPr>
+        <w:t xml:space="preserve">«Архів»</w:t>
+      </w:r>
+      <w:r>
+        <w:t xml:space="preserve"> </w:t>
+      </w:r>
+      <w:r>
+        <w:t xml:space="preserve">(</w:t>
+      </w:r>
+      <w:r>
+        <w:rPr>
+          <w:rStyle w:val="VerbatimChar"/>
+        </w:rPr>
+        <w:t xml:space="preserve">/archive</w:t>
+      </w:r>
+      <w:r>
+        <w:t xml:space="preserve">), разом із закритими проєктами й задачами.</w:t>
       </w:r>
     </w:p>
     <w:bookmarkStart w:id="42" w:name="X195d8fcf4c05567695203c9ab936e1a6884a274"/>
@@ -3541,17 +3665,7 @@
         <w:pStyle w:val="Compact"/>
       </w:pPr>
       <w:r>
-        <w:rPr>
-          <w:bCs/>
-          <w:b/>
-        </w:rPr>
-        <w:t xml:space="preserve">Заявник без облікового запису не отримує посилання для відстеження</w:t>
-      </w:r>
-      <w:r>
-        <w:t xml:space="preserve"> </w:t>
-      </w:r>
-      <w:r>
-        <w:t xml:space="preserve">— система поки нічого не надсилає поштою (це окремий наступний крок: email-сповіщення). Оператору варто відповісти йому іншим каналом.</w:t>
+        <w:t xml:space="preserve">Раніше заявник без облікового запису не отримував посилання для відстеження поштою — тепер це вирішує автовідповідь (SMTP), описана нижче.</w:t>
       </w:r>
     </w:p>
     <w:p>
@@ -3601,6 +3715,757 @@
       </w:pPr>
       <w:r>
         <w:t xml:space="preserve">За один запуск обробляється до 50 листів; решта — наступного разу.</w:t>
+      </w:r>
+    </w:p>
+    <w:bookmarkEnd w:id="44"/>
+    <w:bookmarkStart w:id="45" w:name="автовідповідь-заявнику-smtp"/>
+    <w:p>
+      <w:pPr>
+        <w:pStyle w:val="Heading3"/>
+      </w:pPr>
+      <w:r>
+        <w:t xml:space="preserve">Автовідповідь заявнику (SMTP)</w:t>
+      </w:r>
+    </w:p>
+    <w:p>
+      <w:pPr>
+        <w:pStyle w:val="FirstParagraph"/>
+      </w:pPr>
+      <w:r>
+        <w:t xml:space="preserve">Коли лист створює новий тікет, заявнику можна надіслати автоматичну відповідь із посиланням для відстеження статусу — це закриває обмеження вище: тепер заявник без облікового запису теж отримує спосіб повернутись до свого звернення.</w:t>
+      </w:r>
+    </w:p>
+    <w:p>
+      <w:pPr>
+        <w:pStyle w:val="BodyText"/>
+      </w:pPr>
+      <w:r>
+        <w:rPr>
+          <w:bCs/>
+          <w:b/>
+        </w:rPr>
+        <w:t xml:space="preserve">Як увімкнути:</w:t>
+      </w:r>
+    </w:p>
+    <w:p>
+      <w:pPr>
+        <w:numPr>
+          <w:ilvl w:val="0"/>
+          <w:numId w:val="1019"/>
+        </w:numPr>
+        <w:pStyle w:val="Compact"/>
+      </w:pPr>
+      <w:r>
+        <w:t xml:space="preserve">У</w:t>
+      </w:r>
+      <w:r>
+        <w:t xml:space="preserve"> </w:t>
+      </w:r>
+      <w:r>
+        <w:rPr>
+          <w:rStyle w:val="VerbatimChar"/>
+        </w:rPr>
+        <w:t xml:space="preserve">.env</w:t>
+      </w:r>
+      <w:r>
+        <w:t xml:space="preserve"> </w:t>
+      </w:r>
+      <w:r>
+        <w:t xml:space="preserve">додайте підключення для надсилання пошти (SMTP). Якщо скринька та сама, що й для отримання (</w:t>
+      </w:r>
+      <w:r>
+        <w:rPr>
+          <w:rStyle w:val="VerbatimChar"/>
+        </w:rPr>
+        <w:t xml:space="preserve">MAIL_IMAP_*</w:t>
+      </w:r>
+      <w:r>
+        <w:t xml:space="preserve"> </w:t>
+      </w:r>
+      <w:r>
+        <w:t xml:space="preserve">вище), достатньо вказати лише адресу відправника:</w:t>
+      </w:r>
+    </w:p>
+    <w:p>
+      <w:pPr>
+        <w:numPr>
+          <w:ilvl w:val="0"/>
+          <w:numId w:val="1000"/>
+        </w:numPr>
+        <w:pStyle w:val="SourceCode"/>
+      </w:pPr>
+      <w:r>
+        <w:rPr>
+          <w:rStyle w:val="VerbatimChar"/>
+        </w:rPr>
+        <w:t xml:space="preserve">MAIL_SMTP_FROM_EMAIL=support@example.org</w:t>
+      </w:r>
+      <w:r>
+        <w:br/>
+      </w:r>
+      <w:r>
+        <w:rPr>
+          <w:rStyle w:val="VerbatimChar"/>
+        </w:rPr>
+        <w:t xml:space="preserve">MAIL_SMTP_FROM_NAME=Служба підтримки</w:t>
+      </w:r>
+    </w:p>
+    <w:p>
+      <w:pPr>
+        <w:numPr>
+          <w:ilvl w:val="0"/>
+          <w:numId w:val="1000"/>
+        </w:numPr>
+        <w:pStyle w:val="Compact"/>
+      </w:pPr>
+      <w:r>
+        <w:t xml:space="preserve">Сервер, порт, логін і пароль без окремих</w:t>
+      </w:r>
+      <w:r>
+        <w:t xml:space="preserve"> </w:t>
+      </w:r>
+      <w:r>
+        <w:rPr>
+          <w:rStyle w:val="VerbatimChar"/>
+        </w:rPr>
+        <w:t xml:space="preserve">MAIL_SMTP_*</w:t>
+      </w:r>
+      <w:r>
+        <w:t xml:space="preserve"> </w:t>
+      </w:r>
+      <w:r>
+        <w:t xml:space="preserve">успадковуються з</w:t>
+      </w:r>
+      <w:r>
+        <w:t xml:space="preserve"> </w:t>
+      </w:r>
+      <w:r>
+        <w:rPr>
+          <w:rStyle w:val="VerbatimChar"/>
+        </w:rPr>
+        <w:t xml:space="preserve">MAIL_IMAP_*</w:t>
+      </w:r>
+      <w:r>
+        <w:t xml:space="preserve"> </w:t>
+      </w:r>
+      <w:r>
+        <w:t xml:space="preserve">автоматично. Для окремого SMTP-сервера (наприклад, зовнішній релей) вкажіть усе явно:</w:t>
+      </w:r>
+      <w:r>
+        <w:t xml:space="preserve"> </w:t>
+      </w:r>
+      <w:r>
+        <w:rPr>
+          <w:rStyle w:val="VerbatimChar"/>
+        </w:rPr>
+        <w:t xml:space="preserve">MAIL_SMTP_HOST</w:t>
+      </w:r>
+      <w:r>
+        <w:t xml:space="preserve">,</w:t>
+      </w:r>
+      <w:r>
+        <w:t xml:space="preserve"> </w:t>
+      </w:r>
+      <w:r>
+        <w:rPr>
+          <w:rStyle w:val="VerbatimChar"/>
+        </w:rPr>
+        <w:t xml:space="preserve">MAIL_SMTP_PORT</w:t>
+      </w:r>
+      <w:r>
+        <w:t xml:space="preserve">,</w:t>
+      </w:r>
+      <w:r>
+        <w:t xml:space="preserve"> </w:t>
+      </w:r>
+      <w:r>
+        <w:rPr>
+          <w:rStyle w:val="VerbatimChar"/>
+        </w:rPr>
+        <w:t xml:space="preserve">MAIL_SMTP_ENCRYPTION</w:t>
+      </w:r>
+      <w:r>
+        <w:t xml:space="preserve"> </w:t>
+      </w:r>
+      <w:r>
+        <w:t xml:space="preserve">(</w:t>
+      </w:r>
+      <w:r>
+        <w:rPr>
+          <w:rStyle w:val="VerbatimChar"/>
+        </w:rPr>
+        <w:t xml:space="preserve">ssl</w:t>
+      </w:r>
+      <w:r>
+        <w:t xml:space="preserve"> </w:t>
+      </w:r>
+      <w:r>
+        <w:t xml:space="preserve">— порт 465,</w:t>
+      </w:r>
+      <w:r>
+        <w:t xml:space="preserve"> </w:t>
+      </w:r>
+      <w:r>
+        <w:rPr>
+          <w:rStyle w:val="VerbatimChar"/>
+        </w:rPr>
+        <w:t xml:space="preserve">tls</w:t>
+      </w:r>
+      <w:r>
+        <w:t xml:space="preserve">/STARTTLS — порт 587,</w:t>
+      </w:r>
+      <w:r>
+        <w:t xml:space="preserve"> </w:t>
+      </w:r>
+      <w:r>
+        <w:rPr>
+          <w:rStyle w:val="VerbatimChar"/>
+        </w:rPr>
+        <w:t xml:space="preserve">none</w:t>
+      </w:r>
+      <w:r>
+        <w:t xml:space="preserve">),</w:t>
+      </w:r>
+      <w:r>
+        <w:t xml:space="preserve"> </w:t>
+      </w:r>
+      <w:r>
+        <w:rPr>
+          <w:rStyle w:val="VerbatimChar"/>
+        </w:rPr>
+        <w:t xml:space="preserve">MAIL_SMTP_USERNAME</w:t>
+      </w:r>
+      <w:r>
+        <w:t xml:space="preserve">,</w:t>
+      </w:r>
+      <w:r>
+        <w:t xml:space="preserve"> </w:t>
+      </w:r>
+      <w:r>
+        <w:rPr>
+          <w:rStyle w:val="VerbatimChar"/>
+        </w:rPr>
+        <w:t xml:space="preserve">MAIL_SMTP_PASSWORD</w:t>
+      </w:r>
+      <w:r>
+        <w:t xml:space="preserve">. Самопідписаний сертифікат —</w:t>
+      </w:r>
+      <w:r>
+        <w:t xml:space="preserve"> </w:t>
+      </w:r>
+      <w:r>
+        <w:rPr>
+          <w:rStyle w:val="VerbatimChar"/>
+        </w:rPr>
+        <w:t xml:space="preserve">MAIL_SMTP_VERIFY_CERT=false</w:t>
+      </w:r>
+      <w:r>
+        <w:t xml:space="preserve">.</w:t>
+      </w:r>
+    </w:p>
+    <w:p>
+      <w:pPr>
+        <w:numPr>
+          <w:ilvl w:val="0"/>
+          <w:numId w:val="1019"/>
+        </w:numPr>
+        <w:pStyle w:val="Compact"/>
+      </w:pPr>
+      <w:r>
+        <w:t xml:space="preserve">На сторінці «Пошта → тікети» з'явиться друга картка — «Надсилання пошти (SMTP)» зі статусом і кнопками</w:t>
+      </w:r>
+      <w:r>
+        <w:t xml:space="preserve"> </w:t>
+      </w:r>
+      <w:r>
+        <w:rPr>
+          <w:bCs/>
+          <w:b/>
+        </w:rPr>
+        <w:t xml:space="preserve">«Перевірити з'єднання»</w:t>
+      </w:r>
+      <w:r>
+        <w:t xml:space="preserve"> </w:t>
+      </w:r>
+      <w:r>
+        <w:t xml:space="preserve">та</w:t>
+      </w:r>
+      <w:r>
+        <w:t xml:space="preserve"> </w:t>
+      </w:r>
+      <w:r>
+        <w:rPr>
+          <w:bCs/>
+          <w:b/>
+        </w:rPr>
+        <w:t xml:space="preserve">«Надіслати тестовий лист собі»</w:t>
+      </w:r>
+      <w:r>
+        <w:t xml:space="preserve"> </w:t>
+      </w:r>
+      <w:r>
+        <w:t xml:space="preserve">(перевіряє геть усе — з'єднання, автентифікацію, реальну доставку — на вашу власну адресу).</w:t>
+      </w:r>
+    </w:p>
+    <w:p>
+      <w:pPr>
+        <w:numPr>
+          <w:ilvl w:val="0"/>
+          <w:numId w:val="1019"/>
+        </w:numPr>
+        <w:pStyle w:val="Compact"/>
+      </w:pPr>
+      <w:r>
+        <w:t xml:space="preserve">Поставте галочку</w:t>
+      </w:r>
+      <w:r>
+        <w:t xml:space="preserve"> </w:t>
+      </w:r>
+      <w:r>
+        <w:rPr>
+          <w:bCs/>
+          <w:b/>
+        </w:rPr>
+        <w:t xml:space="preserve">«Надсилати автовідповідь заявнику з посиланням для відстеження»</w:t>
+      </w:r>
+      <w:r>
+        <w:t xml:space="preserve"> </w:t>
+      </w:r>
+      <w:r>
+        <w:t xml:space="preserve">й збережіть.</w:t>
+      </w:r>
+    </w:p>
+    <w:p>
+      <w:pPr>
+        <w:pStyle w:val="FirstParagraph"/>
+      </w:pPr>
+      <w:r>
+        <w:rPr>
+          <w:bCs/>
+          <w:b/>
+        </w:rPr>
+        <w:t xml:space="preserve">Домен застосунку.</w:t>
+      </w:r>
+      <w:r>
+        <w:t xml:space="preserve"> </w:t>
+      </w:r>
+      <w:r>
+        <w:t xml:space="preserve">Посилання в листі формується як</w:t>
+      </w:r>
+      <w:r>
+        <w:t xml:space="preserve"> </w:t>
+      </w:r>
+      <w:r>
+        <w:rPr>
+          <w:rStyle w:val="VerbatimChar"/>
+        </w:rPr>
+        <w:t xml:space="preserve">{домен}/support/track/{токен}</w:t>
+      </w:r>
+      <w:r>
+        <w:t xml:space="preserve">. Домен береться з</w:t>
+      </w:r>
+      <w:r>
+        <w:t xml:space="preserve"> </w:t>
+      </w:r>
+      <w:r>
+        <w:rPr>
+          <w:rStyle w:val="VerbatimChar"/>
+        </w:rPr>
+        <w:t xml:space="preserve">APP_URL</w:t>
+      </w:r>
+      <w:r>
+        <w:t xml:space="preserve"> </w:t>
+      </w:r>
+      <w:r>
+        <w:t xml:space="preserve">у</w:t>
+      </w:r>
+      <w:r>
+        <w:t xml:space="preserve"> </w:t>
+      </w:r>
+      <w:r>
+        <w:rPr>
+          <w:rStyle w:val="VerbatimChar"/>
+        </w:rPr>
+        <w:t xml:space="preserve">.env</w:t>
+      </w:r>
+      <w:r>
+        <w:t xml:space="preserve">, а типове значення там —</w:t>
+      </w:r>
+      <w:r>
+        <w:t xml:space="preserve"> </w:t>
+      </w:r>
+      <w:r>
+        <w:rPr>
+          <w:rStyle w:val="VerbatimChar"/>
+        </w:rPr>
+        <w:t xml:space="preserve">http://localhost</w:t>
+      </w:r>
+      <w:r>
+        <w:t xml:space="preserve">, яке нікуди не веде за межами сервера. Щоб цього уникнути, вгорі сторінки «Пошта → тікети» є поле</w:t>
+      </w:r>
+      <w:r>
+        <w:t xml:space="preserve"> </w:t>
+      </w:r>
+      <w:r>
+        <w:rPr>
+          <w:bCs/>
+          <w:b/>
+        </w:rPr>
+        <w:t xml:space="preserve">«Домен застосунку»</w:t>
+      </w:r>
+      <w:r>
+        <w:t xml:space="preserve"> </w:t>
+      </w:r>
+      <w:r>
+        <w:t xml:space="preserve">— вкажіть там реальну адресу (наприклад,</w:t>
+      </w:r>
+      <w:r>
+        <w:t xml:space="preserve"> </w:t>
+      </w:r>
+      <w:r>
+        <w:rPr>
+          <w:rStyle w:val="VerbatimChar"/>
+        </w:rPr>
+        <w:t xml:space="preserve">https://itsm.company.com</w:t>
+      </w:r>
+      <w:r>
+        <w:t xml:space="preserve">) без редагування</w:t>
+      </w:r>
+      <w:r>
+        <w:t xml:space="preserve"> </w:t>
+      </w:r>
+      <w:r>
+        <w:rPr>
+          <w:rStyle w:val="VerbatimChar"/>
+        </w:rPr>
+        <w:t xml:space="preserve">.env</w:t>
+      </w:r>
+      <w:r>
+        <w:t xml:space="preserve">; під полем одразу видно, як саме зараз формується посилання. Порожнє поле — далі використовується</w:t>
+      </w:r>
+      <w:r>
+        <w:t xml:space="preserve"> </w:t>
+      </w:r>
+      <w:r>
+        <w:rPr>
+          <w:rStyle w:val="VerbatimChar"/>
+        </w:rPr>
+        <w:t xml:space="preserve">APP_URL</w:t>
+      </w:r>
+      <w:r>
+        <w:t xml:space="preserve"> </w:t>
+      </w:r>
+      <w:r>
+        <w:t xml:space="preserve">з</w:t>
+      </w:r>
+      <w:r>
+        <w:t xml:space="preserve"> </w:t>
+      </w:r>
+      <w:r>
+        <w:rPr>
+          <w:rStyle w:val="VerbatimChar"/>
+        </w:rPr>
+        <w:t xml:space="preserve">.env</w:t>
+      </w:r>
+      <w:r>
+        <w:t xml:space="preserve">.</w:t>
+      </w:r>
+    </w:p>
+    <w:p>
+      <w:pPr>
+        <w:pStyle w:val="BodyText"/>
+      </w:pPr>
+      <w:r>
+        <w:t xml:space="preserve">Лист надсилається лише при</w:t>
+      </w:r>
+      <w:r>
+        <w:t xml:space="preserve"> </w:t>
+      </w:r>
+      <w:r>
+        <w:rPr>
+          <w:bCs/>
+          <w:b/>
+        </w:rPr>
+        <w:t xml:space="preserve">створенні нового тікета</w:t>
+      </w:r>
+      <w:r>
+        <w:t xml:space="preserve"> </w:t>
+      </w:r>
+      <w:r>
+        <w:t xml:space="preserve">з листа, не на кожну відповідь у гілці. Автовідповідь містить заголовки, що запобігають циклу з автовідповідачами інших поштових систем (</w:t>
+      </w:r>
+      <w:r>
+        <w:rPr>
+          <w:rStyle w:val="VerbatimChar"/>
+        </w:rPr>
+        <w:t xml:space="preserve">Auto-Submitted</w:t>
+      </w:r>
+      <w:r>
+        <w:t xml:space="preserve">,</w:t>
+      </w:r>
+      <w:r>
+        <w:t xml:space="preserve"> </w:t>
+      </w:r>
+      <w:r>
+        <w:rPr>
+          <w:rStyle w:val="VerbatimChar"/>
+        </w:rPr>
+        <w:t xml:space="preserve">X-Auto-Response-Suppress</w:t>
+      </w:r>
+      <w:r>
+        <w:t xml:space="preserve">). Збій надсилання (наприклад, SMTP тимчасово недоступний) ніколи не заважає створенню самого тікета — просто в журналі аудиту (Адмін-панель → Журнал аудиту, розділ 8) з'явиться запис</w:t>
+      </w:r>
+      <w:r>
+        <w:t xml:space="preserve"> </w:t>
+      </w:r>
+      <w:r>
+        <w:rPr>
+          <w:rStyle w:val="VerbatimChar"/>
+        </w:rPr>
+        <w:t xml:space="preserve">autoreply_failed</w:t>
+      </w:r>
+      <w:r>
+        <w:t xml:space="preserve"> </w:t>
+      </w:r>
+      <w:r>
+        <w:t xml:space="preserve">із причиною.</w:t>
+      </w:r>
+    </w:p>
+    <w:bookmarkEnd w:id="45"/>
+    <w:bookmarkStart w:id="46" w:name="email-сповіщення-про-активність"/>
+    <w:p>
+      <w:pPr>
+        <w:pStyle w:val="Heading3"/>
+      </w:pPr>
+      <w:r>
+        <w:t xml:space="preserve">Email-сповіщення про активність</w:t>
+      </w:r>
+    </w:p>
+    <w:p>
+      <w:pPr>
+        <w:pStyle w:val="FirstParagraph"/>
+      </w:pPr>
+      <w:r>
+        <w:t xml:space="preserve">Окрема від автовідповіді функція — сповіщення учасників про зміни в системі, а не лише заявників email-to-ticket. Вмикається тією самою сторінкою «Пошта → тікети», галочкою</w:t>
+      </w:r>
+      <w:r>
+        <w:t xml:space="preserve"> </w:t>
+      </w:r>
+      <w:r>
+        <w:rPr>
+          <w:bCs/>
+          <w:b/>
+        </w:rPr>
+        <w:t xml:space="preserve">«Надсилати email-сповіщення про активність»</w:t>
+      </w:r>
+      <w:r>
+        <w:t xml:space="preserve"> </w:t>
+      </w:r>
+      <w:r>
+        <w:t xml:space="preserve">(потребує того самого налаштованого SMTP, що й автовідповідь вище) — одна галочка охоплює всі типи нижче, окремих перемикачів поки немає.</w:t>
+      </w:r>
+    </w:p>
+    <w:p>
+      <w:pPr>
+        <w:pStyle w:val="BodyText"/>
+      </w:pPr>
+      <w:r>
+        <w:rPr>
+          <w:bCs/>
+          <w:b/>
+        </w:rPr>
+        <w:t xml:space="preserve">Тікети</w:t>
+      </w:r>
+      <w:r>
+        <w:t xml:space="preserve"> </w:t>
+      </w:r>
+      <w:r>
+        <w:t xml:space="preserve">— надсилається «іншій стороні», не тому, хто щойно виконав дію:</w:t>
+      </w:r>
+    </w:p>
+    <w:p>
+      <w:pPr>
+        <w:numPr>
+          <w:ilvl w:val="0"/>
+          <w:numId w:val="1020"/>
+        </w:numPr>
+        <w:pStyle w:val="Compact"/>
+      </w:pPr>
+      <w:r>
+        <w:t xml:space="preserve">нова відповідь (коментар) — якщо відповів оператор, лист іде заявнику; якщо заявник — призначеному оператору (якщо такий є);</w:t>
+      </w:r>
+    </w:p>
+    <w:p>
+      <w:pPr>
+        <w:numPr>
+          <w:ilvl w:val="0"/>
+          <w:numId w:val="1020"/>
+        </w:numPr>
+        <w:pStyle w:val="Compact"/>
+      </w:pPr>
+      <w:r>
+        <w:t xml:space="preserve">зміна статусу — і заявнику, і призначеному оператору, крім того, хто саме цю зміну зробив.</w:t>
+      </w:r>
+    </w:p>
+    <w:p>
+      <w:pPr>
+        <w:pStyle w:val="FirstParagraph"/>
+      </w:pPr>
+      <w:r>
+        <w:t xml:space="preserve">Працює однаково для коментаря через веб-інтерфейс і через email-to-ticket.</w:t>
+      </w:r>
+    </w:p>
+    <w:p>
+      <w:pPr>
+        <w:pStyle w:val="BodyText"/>
+      </w:pPr>
+      <w:r>
+        <w:rPr>
+          <w:bCs/>
+          <w:b/>
+        </w:rPr>
+        <w:t xml:space="preserve">Проєкти й задачі</w:t>
+      </w:r>
+      <w:r>
+        <w:t xml:space="preserve"> </w:t>
+      </w:r>
+      <w:r>
+        <w:t xml:space="preserve">— сповіщається новопризначена людина:</w:t>
+      </w:r>
+    </w:p>
+    <w:p>
+      <w:pPr>
+        <w:numPr>
+          <w:ilvl w:val="0"/>
+          <w:numId w:val="1021"/>
+        </w:numPr>
+        <w:pStyle w:val="Compact"/>
+      </w:pPr>
+      <w:r>
+        <w:t xml:space="preserve">створення проєкту/задачі одразу з вказаним відповідальним/виконавцем — одне сповіщення при створенні;</w:t>
+      </w:r>
+    </w:p>
+    <w:p>
+      <w:pPr>
+        <w:numPr>
+          <w:ilvl w:val="0"/>
+          <w:numId w:val="1021"/>
+        </w:numPr>
+        <w:pStyle w:val="Compact"/>
+      </w:pPr>
+      <w:r>
+        <w:t xml:space="preserve">подальша зміна відповідального/виконавця — сповіщення новому,</w:t>
+      </w:r>
+      <w:r>
+        <w:t xml:space="preserve"> </w:t>
+      </w:r>
+      <w:r>
+        <w:rPr>
+          <w:bCs/>
+          <w:b/>
+        </w:rPr>
+        <w:t xml:space="preserve">лише якщо значення справді змінилось</w:t>
+      </w:r>
+      <w:r>
+        <w:t xml:space="preserve"> </w:t>
+      </w:r>
+      <w:r>
+        <w:t xml:space="preserve">(повторне збереження того самого імені в списку жодного листа не надсилає);</w:t>
+      </w:r>
+    </w:p>
+    <w:p>
+      <w:pPr>
+        <w:numPr>
+          <w:ilvl w:val="0"/>
+          <w:numId w:val="1021"/>
+        </w:numPr>
+        <w:pStyle w:val="Compact"/>
+      </w:pPr>
+      <w:r>
+        <w:t xml:space="preserve">сам собі призначив — лист не надсилається (немає сенсу сповіщати самого себе).</w:t>
+      </w:r>
+    </w:p>
+    <w:p>
+      <w:pPr>
+        <w:pStyle w:val="FirstParagraph"/>
+      </w:pPr>
+      <w:r>
+        <w:rPr>
+          <w:bCs/>
+          <w:b/>
+        </w:rPr>
+        <w:t xml:space="preserve">Нагадування про термін виконання задачі</w:t>
+      </w:r>
+      <w:r>
+        <w:t xml:space="preserve"> </w:t>
+      </w:r>
+      <w:r>
+        <w:t xml:space="preserve">— окремий, третій компонент, з власним запуском за розкладом (одної галочки «Надсилати сповіщення» недостатньо, потрібен ще й cron):</w:t>
+      </w:r>
+    </w:p>
+    <w:p>
+      <w:pPr>
+        <w:pStyle w:val="SourceCode"/>
+      </w:pPr>
+      <w:r>
+        <w:rPr>
+          <w:rStyle w:val="VerbatimChar"/>
+        </w:rPr>
+        <w:t xml:space="preserve">0 8 * * *  www-data  php /var/www/itsm-system/bin/send-reminders.php &gt;&gt; /var/log/itsm-reminders.log 2&gt;&amp;1</w:t>
+      </w:r>
+    </w:p>
+    <w:p>
+      <w:pPr>
+        <w:pStyle w:val="FirstParagraph"/>
+      </w:pPr>
+      <w:r>
+        <w:t xml:space="preserve">Готовий рядок із вашим реальним шляхом з'являється на сторінці «Пошта → тікети» одразу під галочкою сповіщень. Перевіряються незакриті задачі з призначеним виконавцем на три пороги — за 2 дні до терміну, за 1 день, і в день настання (включно з уже простроченими, якщо це нагадування ще не надсилалось). Кожне нагадування надсилається</w:t>
+      </w:r>
+      <w:r>
+        <w:t xml:space="preserve"> </w:t>
+      </w:r>
+      <w:r>
+        <w:rPr>
+          <w:bCs/>
+          <w:b/>
+        </w:rPr>
+        <w:t xml:space="preserve">рівно один раз на задачу</w:t>
+      </w:r>
+      <w:r>
+        <w:t xml:space="preserve"> </w:t>
+      </w:r>
+      <w:r>
+        <w:t xml:space="preserve">— повторні запуски того самого дня нічого не дублюють. Якщо термін задачі переносять, попередні нагадування скидаються — на новий термін нагадування спрацюють заново.</w:t>
+      </w:r>
+    </w:p>
+    <w:p>
+      <w:pPr>
+        <w:pStyle w:val="BodyText"/>
+      </w:pPr>
+      <w:r>
+        <w:rPr>
+          <w:bCs/>
+          <w:b/>
+        </w:rPr>
+        <w:t xml:space="preserve">Діагностика.</w:t>
+      </w:r>
+      <w:r>
+        <w:t xml:space="preserve"> </w:t>
+      </w:r>
+      <w:r>
+        <w:t xml:space="preserve">Кожна невдала спроба надсилання (SMTP недоступний, невірний пароль тощо) фіксується в журналі аудиту (Адмін-панель → Журнал аудиту, розділ 8) з дією</w:t>
+      </w:r>
+      <w:r>
+        <w:t xml:space="preserve"> </w:t>
+      </w:r>
+      <w:r>
+        <w:rPr>
+          <w:rStyle w:val="VerbatimChar"/>
+        </w:rPr>
+        <w:t xml:space="preserve">notification_failed</w:t>
+      </w:r>
+      <w:r>
+        <w:t xml:space="preserve">, адресою одержувача й точною причиною — сама дія (коментар, призначення, створення) при цьому завжди виконується успішно, лист — окремо.</w:t>
       </w:r>
     </w:p>
     <w:p>
@@ -3610,9 +4475,9 @@
         </w:pict>
       </w:r>
     </w:p>
-    <w:bookmarkEnd w:id="44"/>
-    <w:bookmarkEnd w:id="45"/>
-    <w:bookmarkStart w:id="48" w:name="Xfd3b571dc2ba161e01d4de304ef5647943b2305"/>
+    <w:bookmarkEnd w:id="46"/>
+    <w:bookmarkEnd w:id="47"/>
+    <w:bookmarkStart w:id="50" w:name="Xfd3b571dc2ba161e01d4de304ef5647943b2305"/>
     <w:p>
       <w:pPr>
         <w:pStyle w:val="Heading2"/>
@@ -3638,7 +4503,7 @@
         <w:t xml:space="preserve">Черги — це категорії, за якими розподіляються звернення (наприклад, «Загальна підтримка», «Мережева підтримка», «Бухгалтерські системи»). При створенні тікета користувач обирає чергу зі списку.</w:t>
       </w:r>
     </w:p>
-    <w:bookmarkStart w:id="46" w:name="створення-нової-черги"/>
+    <w:bookmarkStart w:id="48" w:name="створення-нової-черги"/>
     <w:p>
       <w:pPr>
         <w:pStyle w:val="Heading3"/>
@@ -3651,7 +4516,7 @@
       <w:pPr>
         <w:numPr>
           <w:ilvl w:val="0"/>
-          <w:numId w:val="1019"/>
+          <w:numId w:val="1022"/>
         </w:numPr>
         <w:pStyle w:val="Compact"/>
       </w:pPr>
@@ -3676,7 +4541,7 @@
       <w:pPr>
         <w:numPr>
           <w:ilvl w:val="0"/>
-          <w:numId w:val="1019"/>
+          <w:numId w:val="1022"/>
         </w:numPr>
         <w:pStyle w:val="Compact"/>
       </w:pPr>
@@ -3688,7 +4553,7 @@
       <w:pPr>
         <w:numPr>
           <w:ilvl w:val="0"/>
-          <w:numId w:val="1019"/>
+          <w:numId w:val="1022"/>
         </w:numPr>
         <w:pStyle w:val="Compact"/>
       </w:pPr>
@@ -3717,8 +4582,8 @@
         <w:t xml:space="preserve">Нова черга одразу з'являється у випадаючому списку на сторінці створення тікета — жодних додаткових дій не потрібно.</w:t>
       </w:r>
     </w:p>
-    <w:bookmarkEnd w:id="46"/>
-    <w:bookmarkStart w:id="47" w:name="sla-нормативи-черги"/>
+    <w:bookmarkEnd w:id="48"/>
+    <w:bookmarkStart w:id="49" w:name="sla-нормативи-черги"/>
     <w:p>
       <w:pPr>
         <w:pStyle w:val="Heading3"/>
@@ -3768,7 +4633,7 @@
       <w:pPr>
         <w:numPr>
           <w:ilvl w:val="0"/>
-          <w:numId w:val="1020"/>
+          <w:numId w:val="1023"/>
         </w:numPr>
         <w:pStyle w:val="Compact"/>
       </w:pPr>
@@ -3796,7 +4661,7 @@
       <w:pPr>
         <w:numPr>
           <w:ilvl w:val="0"/>
-          <w:numId w:val="1020"/>
+          <w:numId w:val="1023"/>
         </w:numPr>
         <w:pStyle w:val="Compact"/>
       </w:pPr>
@@ -3808,7 +4673,7 @@
       <w:pPr>
         <w:numPr>
           <w:ilvl w:val="0"/>
-          <w:numId w:val="1020"/>
+          <w:numId w:val="1023"/>
         </w:numPr>
         <w:pStyle w:val="Compact"/>
       </w:pPr>
@@ -3832,7 +4697,7 @@
       <w:pPr>
         <w:numPr>
           <w:ilvl w:val="0"/>
-          <w:numId w:val="1020"/>
+          <w:numId w:val="1023"/>
         </w:numPr>
         <w:pStyle w:val="Compact"/>
       </w:pPr>
@@ -3855,9 +4720,9 @@
         </w:pict>
       </w:r>
     </w:p>
-    <w:bookmarkEnd w:id="47"/>
-    <w:bookmarkEnd w:id="48"/>
-    <w:bookmarkStart w:id="49" w:name="X1c091a7ac5073a7af3d36fe571c8ef570adddd9"/>
+    <w:bookmarkEnd w:id="49"/>
+    <w:bookmarkEnd w:id="50"/>
+    <w:bookmarkStart w:id="51" w:name="X1c091a7ac5073a7af3d36fe571c8ef570adddd9"/>
     <w:p>
       <w:pPr>
         <w:pStyle w:val="Heading2"/>
@@ -3878,19 +4743,31 @@
       <w:pPr>
         <w:numPr>
           <w:ilvl w:val="0"/>
-          <w:numId w:val="1021"/>
-        </w:numPr>
-        <w:pStyle w:val="Compact"/>
-      </w:pPr>
-      <w:r>
-        <w:t xml:space="preserve">Збереження вкладень (у тікетах з пошти та в порталі): наразі лише перелік імен; подання без облікового запису, оцінка CSAT, SLA-ескалація та email-to-ticket вже реалізовані (розділ 10).</w:t>
-      </w:r>
-    </w:p>
-    <w:p>
-      <w:pPr>
-        <w:numPr>
-          <w:ilvl w:val="0"/>
-          <w:numId w:val="1021"/>
+          <w:numId w:val="1024"/>
+        </w:numPr>
+        <w:pStyle w:val="Compact"/>
+      </w:pPr>
+      <w:r>
+        <w:t xml:space="preserve">Збереження вкладень (у тікетах з пошти та в порталі): наразі лише перелік імен; подання без облікового запису, оцінка CSAT, SLA-ескалація, email-to-ticket, автовідповідь заявнику та email-сповіщення про активність вже реалізовані (розділ 10).</w:t>
+      </w:r>
+    </w:p>
+    <w:p>
+      <w:pPr>
+        <w:numPr>
+          <w:ilvl w:val="0"/>
+          <w:numId w:val="1024"/>
+        </w:numPr>
+        <w:pStyle w:val="Compact"/>
+      </w:pPr>
+      <w:r>
+        <w:t xml:space="preserve">Гранульовані перемикачі email-сповіщень — зараз одна галочка вмикає одразу все (тікети, проєкти, задачі, нагадування про термін), окремо їх не розділити.</w:t>
+      </w:r>
+    </w:p>
+    <w:p>
+      <w:pPr>
+        <w:numPr>
+          <w:ilvl w:val="0"/>
+          <w:numId w:val="1024"/>
         </w:numPr>
         <w:pStyle w:val="Compact"/>
       </w:pPr>
@@ -3902,7 +4779,7 @@
       <w:pPr>
         <w:numPr>
           <w:ilvl w:val="0"/>
-          <w:numId w:val="1021"/>
+          <w:numId w:val="1024"/>
         </w:numPr>
         <w:pStyle w:val="Compact"/>
       </w:pPr>
@@ -3914,12 +4791,12 @@
       <w:pPr>
         <w:numPr>
           <w:ilvl w:val="0"/>
-          <w:numId w:val="1021"/>
-        </w:numPr>
-        <w:pStyle w:val="Compact"/>
-      </w:pPr>
-      <w:r>
-        <w:t xml:space="preserve">Email-сповіщення (зокрема автовідповідь із посиланням для відстеження), вебхуки, REST API.</w:t>
+          <w:numId w:val="1024"/>
+        </w:numPr>
+        <w:pStyle w:val="Compact"/>
+      </w:pPr>
+      <w:r>
+        <w:t xml:space="preserve">Вебхуки, REST API.</w:t>
       </w:r>
     </w:p>
     <w:p>
@@ -3929,8 +4806,8 @@
         </w:pict>
       </w:r>
     </w:p>
-    <w:bookmarkEnd w:id="49"/>
-    <w:bookmarkStart w:id="50" w:name="X15f096bb48513ce1d1cd2a2553b582badd399ba"/>
+    <w:bookmarkEnd w:id="51"/>
+    <w:bookmarkStart w:id="52" w:name="X15f096bb48513ce1d1cd2a2553b582badd399ba"/>
     <w:p>
       <w:pPr>
         <w:pStyle w:val="Heading2"/>
@@ -4011,8 +4888,8 @@
         <w:t xml:space="preserve">Не видаляйте — позначте статус «Архівний» замість цього (розділ 5, «Зміна статусу (архівування)»). Дані, задачі й історія лишаються доступними, але проєкт більше не виглядає активним у списках.</w:t>
       </w:r>
     </w:p>
-    <w:bookmarkEnd w:id="50"/>
-    <w:bookmarkEnd w:id="51"/>
+    <w:bookmarkEnd w:id="52"/>
+    <w:bookmarkEnd w:id="53"/>
     <w:sectPr/>
   </w:body>
 </w:document>
@@ -4452,6 +5329,42 @@
     <w:abstractNumId w:val="991"/>
   </w:num>
   <w:num w:numId="1021">
+    <w:abstractNumId w:val="991"/>
+  </w:num>
+  <w:num w:numId="1022">
+    <w:abstractNumId w:val="99411"/>
+    <w:lvlOverride w:ilvl="0">
+      <w:startOverride w:val="1"/>
+    </w:lvlOverride>
+    <w:lvlOverride w:ilvl="1">
+      <w:startOverride w:val="1"/>
+    </w:lvlOverride>
+    <w:lvlOverride w:ilvl="2">
+      <w:startOverride w:val="1"/>
+    </w:lvlOverride>
+    <w:lvlOverride w:ilvl="3">
+      <w:startOverride w:val="1"/>
+    </w:lvlOverride>
+    <w:lvlOverride w:ilvl="4">
+      <w:startOverride w:val="1"/>
+    </w:lvlOverride>
+    <w:lvlOverride w:ilvl="5">
+      <w:startOverride w:val="1"/>
+    </w:lvlOverride>
+    <w:lvlOverride w:ilvl="6">
+      <w:startOverride w:val="1"/>
+    </w:lvlOverride>
+    <w:lvlOverride w:ilvl="7">
+      <w:startOverride w:val="1"/>
+    </w:lvlOverride>
+    <w:lvlOverride w:ilvl="8">
+      <w:startOverride w:val="1"/>
+    </w:lvlOverride>
+  </w:num>
+  <w:num w:numId="1023">
+    <w:abstractNumId w:val="991"/>
+  </w:num>
+  <w:num w:numId="1024">
     <w:abstractNumId w:val="991"/>
   </w:num>
 </w:numbering>

</xml_diff>

<commit_message>
release 0.2.0 add CSAT
</commit_message>
<xml_diff>
--- a/docs/ITSM_Admin_Guide.docx
+++ b/docs/ITSM_Admin_Guide.docx
@@ -1885,25 +1885,32 @@
         <w:pStyle w:val="Compact"/>
       </w:pPr>
       <w:r>
-        <w:t xml:space="preserve">адміністратору системи.</w:t>
-      </w:r>
-    </w:p>
-    <w:p>
-      <w:pPr>
-        <w:pStyle w:val="BlockText"/>
-      </w:pPr>
-      <w:r>
-        <w:rPr>
-          <w:bCs/>
-          <w:b/>
-        </w:rPr>
-        <w:t xml:space="preserve">Важливий наслідок:</w:t>
-      </w:r>
-      <w:r>
-        <w:t xml:space="preserve"> </w:t>
-      </w:r>
-      <w:r>
-        <w:t xml:space="preserve">оператор служби підтримки чи керівник ІТ-підрозділу (якщо не адміністратор) не бачать чергу непризначених тікетів — лише ті, що вже стосуються їх особисто. Призначити оператора на новий тікет наразі може лише адміністратор системи (розділ 9), оскільки лише він бачить усі тікети одразу.</w:t>
+        <w:t xml:space="preserve">адміністратору системи;</w:t>
+      </w:r>
+    </w:p>
+    <w:p>
+      <w:pPr>
+        <w:numPr>
+          <w:ilvl w:val="0"/>
+          <w:numId w:val="1010"/>
+        </w:numPr>
+        <w:pStyle w:val="Compact"/>
+      </w:pPr>
+      <w:r>
+        <w:t xml:space="preserve">а також —</w:t>
+      </w:r>
+      <w:r>
+        <w:t xml:space="preserve"> </w:t>
+      </w:r>
+      <w:r>
+        <w:rPr>
+          <w:bCs/>
+          <w:b/>
+        </w:rPr>
+        <w:t xml:space="preserve">оператору служби підтримки й керівнику ІТ-підрозділу</w:t>
+      </w:r>
+      <w:r>
+        <w:t xml:space="preserve">, якщо тікет ще нікому не призначений (детальніше в розділі 9).</w:t>
       </w:r>
     </w:p>
     <w:p>
@@ -2680,6 +2687,55 @@
       </w:r>
       <w:r>
         <w:t xml:space="preserve">«Адміністратор системи», «Керівник ІТ-підрозділу» та «Оператор служби підтримки» — звичайний заявник не може призначити оператора (ні собі, ні комусь іншому), бачить лише інформацію, хто вже призначений.</w:t>
+      </w:r>
+    </w:p>
+    <w:p>
+      <w:pPr>
+        <w:pStyle w:val="BlockText"/>
+      </w:pPr>
+      <w:r>
+        <w:rPr>
+          <w:bCs/>
+          <w:b/>
+        </w:rPr>
+        <w:t xml:space="preserve">Видимість непризначених тікетів.</w:t>
+      </w:r>
+      <w:r>
+        <w:t xml:space="preserve"> </w:t>
+      </w:r>
+      <w:r>
+        <w:t xml:space="preserve">Оператор служби підтримки й керівник ІТ-підрозділу бачать у своєму списку</w:t>
+      </w:r>
+      <w:r>
+        <w:t xml:space="preserve"> </w:t>
+      </w:r>
+      <w:r>
+        <w:rPr>
+          <w:rStyle w:val="VerbatimChar"/>
+        </w:rPr>
+        <w:t xml:space="preserve">/tickets</w:t>
+      </w:r>
+      <w:r>
+        <w:t xml:space="preserve"> </w:t>
+      </w:r>
+      <w:r>
+        <w:t xml:space="preserve">не лише тікети, де вони вже заявник чи призначений оператор, а й</w:t>
+      </w:r>
+      <w:r>
+        <w:t xml:space="preserve"> </w:t>
+      </w:r>
+      <w:r>
+        <w:rPr>
+          <w:bCs/>
+          <w:b/>
+        </w:rPr>
+        <w:t xml:space="preserve">усі ще непризначені тікети</w:t>
+      </w:r>
+      <w:r>
+        <w:t xml:space="preserve"> </w:t>
+      </w:r>
+      <w:r>
+        <w:t xml:space="preserve">(від будь-якого заявника) — позначені бейджем «Непризначено» — щоб було з чого обирати, що взяти в роботу. Щойно тікет комусь призначено, він зникає з цього «загального пулу» для решти операторів/керівників і лишається видимим лише заявнику та новопризначеному оператору (чи адміністратору). Звичайного заявника ця видимість не стосується — він, як і раніше, бачить лише власні звернення.</w:t>
       </w:r>
     </w:p>
     <w:p>

</xml_diff>

<commit_message>
release 0.2.3 add new features
</commit_message>
<xml_diff>
--- a/docs/ITSM_Admin_Guide.docx
+++ b/docs/ITSM_Admin_Guide.docx
@@ -3552,7 +3552,39 @@
         <w:t xml:space="preserve"> </w:t>
       </w:r>
       <w:r>
-        <w:t xml:space="preserve">біля учасника (з підтвердженням).</w:t>
+        <w:t xml:space="preserve">біля учасника (з підтвердженням). Учасник може й</w:t>
+      </w:r>
+      <w:r>
+        <w:t xml:space="preserve"> </w:t>
+      </w:r>
+      <w:r>
+        <w:rPr>
+          <w:bCs/>
+          <w:b/>
+        </w:rPr>
+        <w:t xml:space="preserve">сам вийти з проєкту</w:t>
+      </w:r>
+      <w:r>
+        <w:t xml:space="preserve"> </w:t>
+      </w:r>
+      <w:r>
+        <w:t xml:space="preserve">— кнопка</w:t>
+      </w:r>
+      <w:r>
+        <w:t xml:space="preserve"> </w:t>
+      </w:r>
+      <w:r>
+        <w:rPr>
+          <w:bCs/>
+          <w:b/>
+        </w:rPr>
+        <w:t xml:space="preserve">«Вийти з проєкту»</w:t>
+      </w:r>
+      <w:r>
+        <w:t xml:space="preserve"> </w:t>
+      </w:r>
+      <w:r>
+        <w:t xml:space="preserve">в блоці «Доступ до проєкту» (з підтвердженням; автор і відповідальний вийти не можуть — спершу треба змінити відповідального). Після виходу проєкт і його підпроєкти зникають у нього, повернути доступ може автор, відповідальний чи адміністратор.</w:t>
       </w:r>
     </w:p>
     <w:p>
@@ -3648,29 +3680,13 @@
           <w:bCs/>
           <w:b/>
         </w:rPr>
-        <w:t xml:space="preserve">Доступ не успадковується підпроєктами:</w:t>
-      </w:r>
-      <w:r>
-        <w:t xml:space="preserve"> </w:t>
-      </w:r>
-      <w:r>
-        <w:t xml:space="preserve">кожен проєкт має власний перелік учасників. Учасник основного проєкту</w:t>
-      </w:r>
-      <w:r>
-        <w:t xml:space="preserve"> </w:t>
-      </w:r>
-      <w:r>
-        <w:rPr>
-          <w:bCs/>
-          <w:b/>
-        </w:rPr>
-        <w:t xml:space="preserve">не бачить</w:t>
-      </w:r>
-      <w:r>
-        <w:t xml:space="preserve"> </w:t>
-      </w:r>
-      <w:r>
-        <w:t xml:space="preserve">його підпроєктів, доки його не додали й туди.</w:t>
+        <w:t xml:space="preserve">Доступ успадковується підпроєктами:</w:t>
+      </w:r>
+      <w:r>
+        <w:t xml:space="preserve"> </w:t>
+      </w:r>
+      <w:r>
+        <w:t xml:space="preserve">хто має прямий доступ до проєкту (автор, відповідальний чи учасник), той автоматично бачить усі його підпроєкти — і підпроєкти підпроєктів (до 5 рівнів) — та працює з ними як учасник. Додавати його в кожен підпроєкт не треба. Навпаки не діє: доступ лише до підпроєкту не відкриває батьківський проєкт. У підпроєкті на сторінці «Доступ до проєкту» є нагадування про успадкування, а в списку учасників — лише ті, кого додано саме до нього. Забрати успадкований доступ можна тільки в батьківському проєкті.</w:t>
       </w:r>
       <w:r>
         <w:t xml:space="preserve"> </w:t>
@@ -3813,7 +3829,31 @@
         <w:t xml:space="preserve">member_removed</w:t>
       </w:r>
       <w:r>
-        <w:t xml:space="preserve">, поле «Учасник проєкту» з ім’ям).</w:t>
+        <w:t xml:space="preserve">, а коли учасник вийшов сам —</w:t>
+      </w:r>
+      <w:r>
+        <w:t xml:space="preserve"> </w:t>
+      </w:r>
+      <w:r>
+        <w:rPr>
+          <w:rStyle w:val="VerbatimChar"/>
+        </w:rPr>
+        <w:t xml:space="preserve">member_left</w:t>
+      </w:r>
+      <w:r>
+        <w:t xml:space="preserve">; поле «Учасник проєкту» з ім’ям; вебхук для виходу той самий</w:t>
+      </w:r>
+      <w:r>
+        <w:t xml:space="preserve"> </w:t>
+      </w:r>
+      <w:r>
+        <w:rPr>
+          <w:rStyle w:val="VerbatimChar"/>
+        </w:rPr>
+        <w:t xml:space="preserve">project.member_removed</w:t>
+      </w:r>
+      <w:r>
+        <w:t xml:space="preserve">).</w:t>
       </w:r>
       <w:r>
         <w:t xml:space="preserve"> </w:t>
@@ -6998,6 +7038,82 @@
           <w:bCs/>
           <w:b/>
         </w:rPr>
+        <w:t xml:space="preserve">Відписка від окремої теми.</w:t>
+      </w:r>
+      <w:r>
+        <w:t xml:space="preserve"> </w:t>
+      </w:r>
+      <w:r>
+        <w:t xml:space="preserve">На сторінці теми є кнопка</w:t>
+      </w:r>
+      <w:r>
+        <w:t xml:space="preserve"> </w:t>
+      </w:r>
+      <w:r>
+        <w:rPr>
+          <w:bCs/>
+          <w:b/>
+        </w:rPr>
+        <w:t xml:space="preserve">«🔕 Не сповіщати про цю тему»</w:t>
+      </w:r>
+      <w:r>
+        <w:t xml:space="preserve"> </w:t>
+      </w:r>
+      <w:r>
+        <w:t xml:space="preserve">(після натискання — «🔔 Сповіщення про цю тему вимкнено — увімкнути»), а в кожному листі про відповідь — посилання «Відпишіться» на сторінку підтвердження</w:t>
+      </w:r>
+      <w:r>
+        <w:t xml:space="preserve"> </w:t>
+      </w:r>
+      <w:r>
+        <w:rPr>
+          <w:rStyle w:val="VerbatimChar"/>
+        </w:rPr>
+        <w:t xml:space="preserve">/forum/topics/N/mute</w:t>
+      </w:r>
+      <w:r>
+        <w:t xml:space="preserve">. Відписка стосується лише цієї теми: автор і учасники інших тем, а також підписки на розділи не змінюються. Дані — у таблиці</w:t>
+      </w:r>
+      <w:r>
+        <w:t xml:space="preserve"> </w:t>
+      </w:r>
+      <w:r>
+        <w:rPr>
+          <w:rStyle w:val="VerbatimChar"/>
+        </w:rPr>
+        <w:t xml:space="preserve">forum_topic_mutes</w:t>
+      </w:r>
+      <w:r>
+        <w:t xml:space="preserve"> </w:t>
+      </w:r>
+      <w:r>
+        <w:t xml:space="preserve">(міграція 035,</w:t>
+      </w:r>
+      <w:r>
+        <w:t xml:space="preserve"> </w:t>
+      </w:r>
+      <w:r>
+        <w:rPr>
+          <w:rStyle w:val="VerbatimChar"/>
+        </w:rPr>
+        <w:t xml:space="preserve">update.sh</w:t>
+      </w:r>
+      <w:r>
+        <w:t xml:space="preserve"> </w:t>
+      </w:r>
+      <w:r>
+        <w:t xml:space="preserve">крок 35; видаляється разом з користувачем чи темою). Без міграції кнопки немає, листи надходять як раніше.</w:t>
+      </w:r>
+    </w:p>
+    <w:p>
+      <w:pPr>
+        <w:pStyle w:val="BodyText"/>
+      </w:pPr>
+      <w:r>
+        <w:rPr>
+          <w:bCs/>
+          <w:b/>
+        </w:rPr>
         <w:t xml:space="preserve">Вкладення в повідомленнях.</w:t>
       </w:r>
       <w:r>
@@ -7020,7 +7136,80 @@
         <w:t xml:space="preserve"> </w:t>
       </w:r>
       <w:r>
-        <w:t xml:space="preserve">на повідомлення, ті самі типи й ліміт розміру, що в бібліотеці документів (розділ 20). Файли показано під текстом повідомлення (зображення JPG/PNG — мініатюрою), завантажити їх може будь-хто, хто бачить розділ; для інших відповідь «не знайдено». Усі файли перевіряються</w:t>
+        <w:t xml:space="preserve">на повідомлення, ті самі типи й ліміт розміру, що в бібліотеці документів (розділ 20). Файли показано під текстом повідомлення (зображення JPG/PNG — мініатюрою); їх можна вставити й прямо в текст:</w:t>
+      </w:r>
+      <w:r>
+        <w:t xml:space="preserve"> </w:t>
+      </w:r>
+      <w:r>
+        <w:rPr>
+          <w:rStyle w:val="VerbatimChar"/>
+        </w:rPr>
+        <w:t xml:space="preserve">![опис](file:1)</w:t>
+      </w:r>
+      <w:r>
+        <w:t xml:space="preserve"> </w:t>
+      </w:r>
+      <w:r>
+        <w:t xml:space="preserve">показує картинку (JPG/PNG),</w:t>
+      </w:r>
+      <w:r>
+        <w:t xml:space="preserve"> </w:t>
+      </w:r>
+      <w:r>
+        <w:rPr>
+          <w:rStyle w:val="VerbatimChar"/>
+        </w:rPr>
+        <w:t xml:space="preserve">[текст](file:2)</w:t>
+      </w:r>
+      <w:r>
+        <w:t xml:space="preserve"> </w:t>
+      </w:r>
+      <w:r>
+        <w:t xml:space="preserve">дає посилання на файл, де число —</w:t>
+      </w:r>
+      <w:r>
+        <w:t xml:space="preserve"> </w:t>
+      </w:r>
+      <w:r>
+        <w:rPr>
+          <w:bCs/>
+          <w:b/>
+        </w:rPr>
+        <w:t xml:space="preserve">номер файлу за порядком завантаження до цього повідомлення</w:t>
+      </w:r>
+      <w:r>
+        <w:t xml:space="preserve"> </w:t>
+      </w:r>
+      <w:r>
+        <w:t xml:space="preserve">(</w:t>
+      </w:r>
+      <w:r>
+        <w:rPr>
+          <w:rStyle w:val="VerbatimChar"/>
+        </w:rPr>
+        <w:t xml:space="preserve">file:1</w:t>
+      </w:r>
+      <w:r>
+        <w:t xml:space="preserve"> </w:t>
+      </w:r>
+      <w:r>
+        <w:t xml:space="preserve">— перший,</w:t>
+      </w:r>
+      <w:r>
+        <w:t xml:space="preserve"> </w:t>
+      </w:r>
+      <w:r>
+        <w:rPr>
+          <w:rStyle w:val="VerbatimChar"/>
+        </w:rPr>
+        <w:t xml:space="preserve">file:2</w:t>
+      </w:r>
+      <w:r>
+        <w:t xml:space="preserve"> </w:t>
+      </w:r>
+      <w:r>
+        <w:t xml:space="preserve">— другий; посилатися можна лише на файли того самого повідомлення, на інші — «недоступне»). Біля поля «Файли» й біля вже прикріплених файлів є кнопки «Вставити», що додають розмітку на місці курсора; якщо видалити файл, номери наступних зсуваються, завантажити їх може будь-хто, хто бачить розділ; для інших відповідь «не знайдено». Усі файли перевіряються</w:t>
       </w:r>
       <w:r>
         <w:t xml:space="preserve"> </w:t>
@@ -11618,6 +11807,76 @@
         <w:pStyle w:val="Compact"/>
       </w:pPr>
       <w:r>
+        <w:rPr>
+          <w:bCs/>
+          <w:b/>
+        </w:rPr>
+        <w:t xml:space="preserve">Вікі й бібліотека документів</w:t>
+      </w:r>
+      <w:r>
+        <w:t xml:space="preserve"> </w:t>
+      </w:r>
+      <w:r>
+        <w:t xml:space="preserve">використовують той самий механізм: зображення</w:t>
+      </w:r>
+      <w:r>
+        <w:t xml:space="preserve"> </w:t>
+      </w:r>
+      <w:r>
+        <w:rPr>
+          <w:rStyle w:val="VerbatimChar"/>
+        </w:rPr>
+        <w:t xml:space="preserve">![опис](file:N)</w:t>
+      </w:r>
+      <w:r>
+        <w:t xml:space="preserve"> </w:t>
+      </w:r>
+      <w:r>
+        <w:t xml:space="preserve">на сторінці вікі завантажуються як мініатюри (</w:t>
+      </w:r>
+      <w:r>
+        <w:rPr>
+          <w:rStyle w:val="VerbatimChar"/>
+        </w:rPr>
+        <w:t xml:space="preserve">/wiki/files/N?thumb=1</w:t>
+      </w:r>
+      <w:r>
+        <w:t xml:space="preserve">), клік відкриває повний файл; у списку й на сторінці документа бібліотеки та в історії версій біля зображень показується мініатюра (</w:t>
+      </w:r>
+      <w:r>
+        <w:rPr>
+          <w:rStyle w:val="VerbatimChar"/>
+        </w:rPr>
+        <w:t xml:space="preserve">/library/…/download?thumb=1</w:t>
+      </w:r>
+      <w:r>
+        <w:t xml:space="preserve">). Мініатюра створюється при першому перегляді й лежить поряд з оригіналом; права доступу не змінюються,</w:t>
+      </w:r>
+      <w:r>
+        <w:t xml:space="preserve"> </w:t>
+      </w:r>
+      <w:r>
+        <w:rPr>
+          <w:rStyle w:val="VerbatimChar"/>
+        </w:rPr>
+        <w:t xml:space="preserve">?download=1</w:t>
+      </w:r>
+      <w:r>
+        <w:t xml:space="preserve"> </w:t>
+      </w:r>
+      <w:r>
+        <w:t xml:space="preserve">віддає оригінал.</w:t>
+      </w:r>
+    </w:p>
+    <w:p>
+      <w:pPr>
+        <w:numPr>
+          <w:ilvl w:val="0"/>
+          <w:numId w:val="1015"/>
+        </w:numPr>
+        <w:pStyle w:val="Compact"/>
+      </w:pPr>
+      <w:r>
         <w:t xml:space="preserve">Мініатюра не створюється, якщо зображення вже не більше 320 px (показується оригінал), для PDF і для надвеликих зображень (понад 40 млн пікселів — захист пам’яті). JPEG-фото з телефону повертаються за EXIF; прозорість PNG зберігається.</w:t>
       </w:r>
     </w:p>
@@ -15493,29 +15752,7 @@
         <w:t xml:space="preserve"> </w:t>
       </w:r>
       <w:r>
-        <w:t xml:space="preserve">- Для форуму: окрема відписка від сповіщень по одній темі (є підписка на розділ) і вставка вкладеного зображення в текст повідомлення. Для вікі й бібліотеки: мініатюри зображень, картинки з форматів, окрім JPG і PNG.</w:t>
-      </w:r>
-      <w:r>
-        <w:t xml:space="preserve"> </w:t>
-      </w:r>
-      <w:r>
-        <w:t xml:space="preserve">- Кнопка</w:t>
-      </w:r>
-      <w:r>
-        <w:t xml:space="preserve"> </w:t>
-      </w:r>
-      <w:r>
-        <w:rPr>
-          <w:bCs/>
-          <w:b/>
-        </w:rPr>
-        <w:t xml:space="preserve">«Вийти з проєкту»</w:t>
-      </w:r>
-      <w:r>
-        <w:t xml:space="preserve"> </w:t>
-      </w:r>
-      <w:r>
-        <w:t xml:space="preserve">для самого учасника: доступ скасовує лише автор, відповідальний чи адміністратор (розділ 6). Також доступ не успадковується підпроєктами.</w:t>
+        <w:t xml:space="preserve">- Мініатюри для зображень поза JPG і PNG (GIF, WebP).</w:t>
       </w:r>
       <w:r>
         <w:t xml:space="preserve"> </w:t>

</xml_diff>

<commit_message>
release 0.3.0 add new features
</commit_message>
<xml_diff>
--- a/docs/ITSM_Admin_Guide.docx
+++ b/docs/ITSM_Admin_Guide.docx
@@ -6876,10 +6876,29 @@
           <w:bCs/>
           <w:b/>
         </w:rPr>
-        <w:t xml:space="preserve">лише зображення PNG, JPG, GIF і WebP</w:t>
-      </w:r>
-      <w:r>
-        <w:t xml:space="preserve">. Інші вкладення (PDF, документи, архіви) не зберігаються — у тікеті лишається примітка «[Вкладення не збережено в системі: …]» з їх назвами; зображення, що не пройшли перевірку вмісту, названі там само. Додати PDF можна вручну на сторінці тікета.</w:t>
+        <w:t xml:space="preserve">зображення PNG, JPG, GIF і WebP</w:t>
+      </w:r>
+      <w:r>
+        <w:t xml:space="preserve"> </w:t>
+      </w:r>
+      <w:r>
+        <w:t xml:space="preserve">та</w:t>
+      </w:r>
+      <w:r>
+        <w:t xml:space="preserve"> </w:t>
+      </w:r>
+      <w:r>
+        <w:rPr>
+          <w:bCs/>
+          <w:b/>
+        </w:rPr>
+        <w:t xml:space="preserve">документи PDF, DOCX, XLSX, PPTX, ODT, ODS, ODP</w:t>
+      </w:r>
+      <w:r>
+        <w:t xml:space="preserve"> </w:t>
+      </w:r>
+      <w:r>
+        <w:t xml:space="preserve">(до 10 МБ; Office-файли — за наявності міграції 037, без макросів). Вміст перевіряється, а не довіряється назві: підробка або файл із макросами не зберігається. Документи з’являються у вкладеннях тікета (позначка «з електронного листа»), їх можна завантажити (або переглянути як PDF) співробітникам і заявнику на порталі. Інші вкладення (архіви, виконувані файли тощо), а також файли, що не пройшли перевірку, не зберігаються — у тікеті лишається примітка «[Вкладення не збережено в системі: …]» з їх назвами.</w:t>
       </w:r>
       <w:r>
         <w:t xml:space="preserve"> </w:t>
@@ -8285,6 +8304,56 @@
           <w:bCs/>
           <w:b/>
         </w:rPr>
+        <w:t xml:space="preserve">Сповіщення про проблеми зі «Стану системи»</w:t>
+      </w:r>
+      <w:r>
+        <w:t xml:space="preserve"> </w:t>
+      </w:r>
+      <w:r>
+        <w:t xml:space="preserve">— галочка «Сповіщати адміністраторів системи про проблеми зі сторінки „Стан системи“» і окремий запуск за розкладом (щогодини):</w:t>
+      </w:r>
+    </w:p>
+    <w:p>
+      <w:pPr>
+        <w:pStyle w:val="SourceCode"/>
+      </w:pPr>
+      <w:r>
+        <w:rPr>
+          <w:rStyle w:val="VerbatimChar"/>
+        </w:rPr>
+        <w:t xml:space="preserve">15 * * * *  www-data  php /var/www/itsm-system/bin/check-status.php &gt;&gt; /var/log/itsm-status.log 2&gt;&amp;1</w:t>
+      </w:r>
+    </w:p>
+    <w:p>
+      <w:pPr>
+        <w:pStyle w:val="FirstParagraph"/>
+      </w:pPr>
+      <w:r>
+        <w:t xml:space="preserve">Скрипт перевіряє ті самі показники, що й сторінка «Стан системи», і надсилає всім активним адміністраторам системи лист зі списком проблем (рівні «Увага» та «Помилка») і підказками, що робити. Щоб не засипати поштою, лист іде лише коли</w:t>
+      </w:r>
+      <w:r>
+        <w:t xml:space="preserve"> </w:t>
+      </w:r>
+      <w:r>
+        <w:rPr>
+          <w:bCs/>
+          <w:b/>
+        </w:rPr>
+        <w:t xml:space="preserve">набір проблем змінився</w:t>
+      </w:r>
+      <w:r>
+        <w:t xml:space="preserve">; якщо проблеми не усунуто — нагадування раз на 7 днів; коли все усунуто — один лист «проблем немає». Перевірка виконується з консолі (PHP CLI), тому рядки, що залежать від веб-запиту (HTTPS, Opcache), не враховуються, а версія PHP і розширення беруться з CLI — вони можуть відрізнятися від PHP-FPM. Сам запуск скрипта контролюється в розділі «Фонові завдання (cron)» сторінки «Стан системи».</w:t>
+      </w:r>
+    </w:p>
+    <w:p>
+      <w:pPr>
+        <w:pStyle w:val="BodyText"/>
+      </w:pPr>
+      <w:r>
+        <w:rPr>
+          <w:bCs/>
+          <w:b/>
+        </w:rPr>
         <w:t xml:space="preserve">Діагностика.</w:t>
       </w:r>
       <w:r>
@@ -8465,6 +8534,51 @@
         <w:pict>
           <v:rect style="width:0;height:1.5pt" o:hralign="center" o:hrstd="t" o:hr="t"/>
         </w:pict>
+      </w:r>
+    </w:p>
+    <w:p>
+      <w:pPr>
+        <w:pStyle w:val="FirstParagraph"/>
+      </w:pPr>
+      <w:r>
+        <w:rPr>
+          <w:bCs/>
+          <w:b/>
+        </w:rPr>
+        <w:t xml:space="preserve">Пов’язані та дубльовані тікети</w:t>
+      </w:r>
+      <w:r>
+        <w:t xml:space="preserve"> </w:t>
+      </w:r>
+      <w:r>
+        <w:t xml:space="preserve">(міграція 041,</w:t>
+      </w:r>
+      <w:r>
+        <w:t xml:space="preserve"> </w:t>
+      </w:r>
+      <w:r>
+        <w:rPr>
+          <w:rStyle w:val="VerbatimChar"/>
+        </w:rPr>
+        <w:t xml:space="preserve">update.sh</w:t>
+      </w:r>
+      <w:r>
+        <w:t xml:space="preserve"> </w:t>
+      </w:r>
+      <w:r>
+        <w:t xml:space="preserve">застосовує її сам). Таблиця</w:t>
+      </w:r>
+      <w:r>
+        <w:t xml:space="preserve"> </w:t>
+      </w:r>
+      <w:r>
+        <w:rPr>
+          <w:rStyle w:val="VerbatimChar"/>
+        </w:rPr>
+        <w:t xml:space="preserve">ticket_links</w:t>
+      </w:r>
+      <w:r>
+        <w:t xml:space="preserve">: зв’язок «пов’язаний» (симетричний) і «дубль» (спрямований: дубль → оригінал). Керувати зв’язками можуть ті, хто може призначати операторів (адміністратор системи, адміністратор підрозділу, керівник ІТ, оператор підтримки), і лише між тікетами, які вони бачать. Зміни пишуться в журнал аудиту обох тікетів. Зміна статусу оригіналу із галочкою «і для дублів» застосовується до всіх його дублів, видимих користувачу. Детально — посібник користувача, розділ 7.3б. Без міграції блок просто не показується.</w:t>
       </w:r>
     </w:p>
     <w:bookmarkEnd w:id="51"/>
@@ -17199,12 +17313,6 @@
         <w:t xml:space="preserve"> </w:t>
       </w:r>
       <w:r>
-        <w:t xml:space="preserve">- Збереження з листів вкладень, окрім зображень PNG/JPG/GIF/WebP (PDF, документи): вони лише перелічуються в описі тікета (розділ 10).</w:t>
-      </w:r>
-      <w:r>
-        <w:t xml:space="preserve"> </w:t>
-      </w:r>
-      <w:r>
         <w:t xml:space="preserve">- Через REST API не можна видаляти записи, завантажувати вкладення й змінювати поля, окрім перелічених у</w:t>
       </w:r>
       <w:r>
@@ -28711,6 +28819,884 @@
           <w:bCs/>
           <w:b/>
         </w:rPr>
+        <w:t xml:space="preserve">Шифрування, перевірка й перенесення копій.</w:t>
+      </w:r>
+      <w:r>
+        <w:t xml:space="preserve"> </w:t>
+      </w:r>
+      <w:r>
+        <w:t xml:space="preserve">Налаштовується в</w:t>
+      </w:r>
+      <w:r>
+        <w:t xml:space="preserve"> </w:t>
+      </w:r>
+      <w:r>
+        <w:rPr>
+          <w:rStyle w:val="VerbatimChar"/>
+        </w:rPr>
+        <w:t xml:space="preserve">.env</w:t>
+      </w:r>
+      <w:r>
+        <w:t xml:space="preserve"> </w:t>
+      </w:r>
+      <w:r>
+        <w:t xml:space="preserve">(потім копії створюються як завжди — кнопкою чи cron):</w:t>
+      </w:r>
+    </w:p>
+    <w:tbl>
+      <w:tblPr>
+        <w:tblStyle w:val="Table"/>
+        <w:tblW w:type="pct" w:w="5000"/>
+        <w:tblLook w:firstRow="1" w:lastRow="0" w:firstColumn="0" w:lastColumn="0" w:noHBand="0" w:noVBand="0" w:val="0020"/>
+        <w:jc w:val="start"/>
+      </w:tblPr>
+      <w:tblGrid>
+        <w:gridCol w:w="3960"/>
+        <w:gridCol w:w="3960"/>
+      </w:tblGrid>
+      <w:tr>
+        <w:trPr>
+          <w:tblHeader w:val="true"/>
+        </w:trPr>
+        <w:tc>
+          <w:tcPr/>
+          <w:p>
+            <w:pPr>
+              <w:pStyle w:val="Compact"/>
+              <w:jc w:val="left"/>
+            </w:pPr>
+            <w:r>
+              <w:t xml:space="preserve">Змінна</w:t>
+            </w:r>
+          </w:p>
+        </w:tc>
+        <w:tc>
+          <w:tcPr/>
+          <w:p>
+            <w:pPr>
+              <w:pStyle w:val="Compact"/>
+              <w:jc w:val="left"/>
+            </w:pPr>
+            <w:r>
+              <w:t xml:space="preserve">Призначення</w:t>
+            </w:r>
+          </w:p>
+        </w:tc>
+      </w:tr>
+      <w:tr>
+        <w:tc>
+          <w:tcPr/>
+          <w:p>
+            <w:pPr>
+              <w:pStyle w:val="Compact"/>
+              <w:jc w:val="left"/>
+            </w:pPr>
+            <w:r>
+              <w:rPr>
+                <w:rStyle w:val="VerbatimChar"/>
+              </w:rPr>
+              <w:t xml:space="preserve">BACKUP_PASSWORD</w:t>
+            </w:r>
+          </w:p>
+        </w:tc>
+        <w:tc>
+          <w:tcPr/>
+          <w:p>
+            <w:pPr>
+              <w:pStyle w:val="Compact"/>
+              <w:jc w:val="left"/>
+            </w:pPr>
+            <w:r>
+              <w:t xml:space="preserve">Пароль шифрування. Нові копії зберігаються як</w:t>
+            </w:r>
+            <w:r>
+              <w:t xml:space="preserve"> </w:t>
+            </w:r>
+            <w:r>
+              <w:rPr>
+                <w:rStyle w:val="VerbatimChar"/>
+              </w:rPr>
+              <w:t xml:space="preserve">backup-….tar.gz.enc</w:t>
+            </w:r>
+            <w:r>
+              <w:t xml:space="preserve"> </w:t>
+            </w:r>
+            <w:r>
+              <w:t xml:space="preserve">(AES-256-CBC, ключ із пароля через PBKDF2, 200 000 ітерацій); незашифрований архів не лишається.</w:t>
+            </w:r>
+            <w:r>
+              <w:t xml:space="preserve"> </w:t>
+            </w:r>
+            <w:r>
+              <w:rPr>
+                <w:bCs/>
+                <w:b/>
+              </w:rPr>
+              <w:t xml:space="preserve">Збережіть пароль окремо від сервера: без нього копію не відновити.</w:t>
+            </w:r>
+          </w:p>
+        </w:tc>
+      </w:tr>
+      <w:tr>
+        <w:tc>
+          <w:tcPr/>
+          <w:p>
+            <w:pPr>
+              <w:pStyle w:val="Compact"/>
+              <w:jc w:val="left"/>
+            </w:pPr>
+            <w:r>
+              <w:rPr>
+                <w:rStyle w:val="VerbatimChar"/>
+              </w:rPr>
+              <w:t xml:space="preserve">BACKUP_REMOTE_DIR</w:t>
+            </w:r>
+          </w:p>
+        </w:tc>
+        <w:tc>
+          <w:tcPr/>
+          <w:p>
+            <w:pPr>
+              <w:pStyle w:val="Compact"/>
+              <w:jc w:val="left"/>
+            </w:pPr>
+            <w:r>
+              <w:t xml:space="preserve">Каталог для копії на іншому носії — змонтований мережевий диск (NFS/SMB/sshfs). Файл пишеться як</w:t>
+            </w:r>
+            <w:r>
+              <w:t xml:space="preserve"> </w:t>
+            </w:r>
+            <w:r>
+              <w:rPr>
+                <w:rStyle w:val="VerbatimChar"/>
+              </w:rPr>
+              <w:t xml:space="preserve">.part</w:t>
+            </w:r>
+            <w:r>
+              <w:t xml:space="preserve"> </w:t>
+            </w:r>
+            <w:r>
+              <w:t xml:space="preserve">і перейменовується; на носії тримається стільки ж копій, скільки й локально.</w:t>
+            </w:r>
+          </w:p>
+        </w:tc>
+      </w:tr>
+      <w:tr>
+        <w:tc>
+          <w:tcPr/>
+          <w:p>
+            <w:pPr>
+              <w:pStyle w:val="Compact"/>
+              <w:jc w:val="left"/>
+            </w:pPr>
+            <w:r>
+              <w:rPr>
+                <w:rStyle w:val="VerbatimChar"/>
+              </w:rPr>
+              <w:t xml:space="preserve">BACKUP_REMOTE_SCP</w:t>
+            </w:r>
+          </w:p>
+        </w:tc>
+        <w:tc>
+          <w:tcPr/>
+          <w:p>
+            <w:pPr>
+              <w:pStyle w:val="Compact"/>
+              <w:jc w:val="left"/>
+            </w:pPr>
+            <w:r>
+              <w:rPr>
+                <w:rStyle w:val="VerbatimChar"/>
+              </w:rPr>
+              <w:t xml:space="preserve">користувач@хост:/каталог/</w:t>
+            </w:r>
+            <w:r>
+              <w:t xml:space="preserve"> </w:t>
+            </w:r>
+            <w:r>
+              <w:t xml:space="preserve">— перенесення через scp на SFTP/SSH-сервер. Потрібні</w:t>
+            </w:r>
+            <w:r>
+              <w:t xml:space="preserve"> </w:t>
+            </w:r>
+            <w:r>
+              <w:rPr>
+                <w:rStyle w:val="VerbatimChar"/>
+              </w:rPr>
+              <w:t xml:space="preserve">openssh-client</w:t>
+            </w:r>
+            <w:r>
+              <w:t xml:space="preserve">, ключ без пароля (</w:t>
+            </w:r>
+            <w:r>
+              <w:rPr>
+                <w:rStyle w:val="VerbatimChar"/>
+              </w:rPr>
+              <w:t xml:space="preserve">BACKUP_SCP_KEY</w:t>
+            </w:r>
+            <w:r>
+              <w:t xml:space="preserve">, доступний користувачу веб-сервера), необов’язково</w:t>
+            </w:r>
+            <w:r>
+              <w:t xml:space="preserve"> </w:t>
+            </w:r>
+            <w:r>
+              <w:rPr>
+                <w:rStyle w:val="VerbatimChar"/>
+              </w:rPr>
+              <w:t xml:space="preserve">BACKUP_SCP_PORT</w:t>
+            </w:r>
+            <w:r>
+              <w:t xml:space="preserve">. Ключ хоста має бути відомий заздалегідь (один раз підключіться вручну від того ж користувача), увімкнено</w:t>
+            </w:r>
+            <w:r>
+              <w:t xml:space="preserve"> </w:t>
+            </w:r>
+            <w:r>
+              <w:rPr>
+                <w:rStyle w:val="VerbatimChar"/>
+              </w:rPr>
+              <w:t xml:space="preserve">StrictHostKeyChecking</w:t>
+            </w:r>
+            <w:r>
+              <w:t xml:space="preserve">. Старі копії на сервері не видаляються — очищайте самостійно.</w:t>
+            </w:r>
+          </w:p>
+        </w:tc>
+      </w:tr>
+    </w:tbl>
+    <w:p>
+      <w:pPr>
+        <w:pStyle w:val="BodyText"/>
+      </w:pPr>
+      <w:r>
+        <w:t xml:space="preserve">Після створення кожна копія</w:t>
+      </w:r>
+      <w:r>
+        <w:t xml:space="preserve"> </w:t>
+      </w:r>
+      <w:r>
+        <w:rPr>
+          <w:bCs/>
+          <w:b/>
+        </w:rPr>
+        <w:t xml:space="preserve">автоматично перевіряється</w:t>
+      </w:r>
+      <w:r>
+        <w:t xml:space="preserve"> </w:t>
+      </w:r>
+      <w:r>
+        <w:t xml:space="preserve">(цілісність gzip і tar, наявність</w:t>
+      </w:r>
+      <w:r>
+        <w:t xml:space="preserve"> </w:t>
+      </w:r>
+      <w:r>
+        <w:rPr>
+          <w:rStyle w:val="VerbatimChar"/>
+        </w:rPr>
+        <w:t xml:space="preserve">MANIFEST.json</w:t>
+      </w:r>
+      <w:r>
+        <w:t xml:space="preserve"> </w:t>
+      </w:r>
+      <w:r>
+        <w:t xml:space="preserve">і дампа БД; зашифровані розшифровуються у тимчасовий файл, який одразу видаляється), і лише потім переноситься. Результат — у підсумку на сторінці копій, у рядку «Резервна копія» сторінки «Стан системи» (попередження, якщо перевірка чи перенесення не вдались) і в коді виходу</w:t>
+      </w:r>
+      <w:r>
+        <w:t xml:space="preserve"> </w:t>
+      </w:r>
+      <w:r>
+        <w:rPr>
+          <w:rStyle w:val="VerbatimChar"/>
+        </w:rPr>
+        <w:t xml:space="preserve">bin/backup.php</w:t>
+      </w:r>
+      <w:r>
+        <w:t xml:space="preserve"> </w:t>
+      </w:r>
+      <w:r>
+        <w:t xml:space="preserve">(1 — є проблема). Кнопка</w:t>
+      </w:r>
+      <w:r>
+        <w:t xml:space="preserve"> </w:t>
+      </w:r>
+      <w:r>
+        <w:rPr>
+          <w:bCs/>
+          <w:b/>
+        </w:rPr>
+        <w:t xml:space="preserve">«Перевірити»</w:t>
+      </w:r>
+      <w:r>
+        <w:t xml:space="preserve"> </w:t>
+      </w:r>
+      <w:r>
+        <w:t xml:space="preserve">біля кожної копії запускає перевірку вручну. Помилка перенесення не скасовує локальну копію. «Стан системи» також нагадує, що шифрування чи перенесення не налаштовано.</w:t>
+      </w:r>
+    </w:p>
+    <w:p>
+      <w:pPr>
+        <w:pStyle w:val="BodyText"/>
+      </w:pPr>
+      <w:r>
+        <w:rPr>
+          <w:bCs/>
+          <w:b/>
+        </w:rPr>
+        <w:t xml:space="preserve">Відновлення з веб-інтерфейсу</w:t>
+      </w:r>
+      <w:r>
+        <w:t xml:space="preserve"> </w:t>
+      </w:r>
+      <w:r>
+        <w:t xml:space="preserve">(Адмін-панель → Налаштування → Резервні копії → картка</w:t>
+      </w:r>
+      <w:r>
+        <w:t xml:space="preserve"> </w:t>
+      </w:r>
+      <w:r>
+        <w:rPr>
+          <w:bCs/>
+          <w:b/>
+        </w:rPr>
+        <w:t xml:space="preserve">«Відновити з копії»</w:t>
+      </w:r>
+      <w:r>
+        <w:t xml:space="preserve">; лише роль «Адміністратор системи»):</w:t>
+      </w:r>
+    </w:p>
+    <w:p>
+      <w:pPr>
+        <w:numPr>
+          <w:ilvl w:val="0"/>
+          <w:numId w:val="1046"/>
+        </w:numPr>
+        <w:pStyle w:val="Compact"/>
+      </w:pPr>
+      <w:r>
+        <w:t xml:space="preserve">Оберіть джерело:</w:t>
+      </w:r>
+      <w:r>
+        <w:t xml:space="preserve"> </w:t>
+      </w:r>
+      <w:r>
+        <w:rPr>
+          <w:bCs/>
+          <w:b/>
+        </w:rPr>
+        <w:t xml:space="preserve">одну зі створених копій</w:t>
+      </w:r>
+      <w:r>
+        <w:t xml:space="preserve"> </w:t>
+      </w:r>
+      <w:r>
+        <w:t xml:space="preserve">(список із каталогу копій; також кнопка «Відновити…» біля копії в таблиці) або</w:t>
+      </w:r>
+      <w:r>
+        <w:t xml:space="preserve"> </w:t>
+      </w:r>
+      <w:r>
+        <w:rPr>
+          <w:bCs/>
+          <w:b/>
+        </w:rPr>
+        <w:t xml:space="preserve">файл з комп’ютера</w:t>
+      </w:r>
+      <w:r>
+        <w:t xml:space="preserve"> </w:t>
+      </w:r>
+      <w:r>
+        <w:t xml:space="preserve">(</w:t>
+      </w:r>
+      <w:r>
+        <w:rPr>
+          <w:rStyle w:val="VerbatimChar"/>
+        </w:rPr>
+        <w:t xml:space="preserve">.tar.gz</w:t>
+      </w:r>
+      <w:r>
+        <w:t xml:space="preserve"> </w:t>
+      </w:r>
+      <w:r>
+        <w:t xml:space="preserve">/</w:t>
+      </w:r>
+      <w:r>
+        <w:t xml:space="preserve"> </w:t>
+      </w:r>
+      <w:r>
+        <w:rPr>
+          <w:rStyle w:val="VerbatimChar"/>
+        </w:rPr>
+        <w:t xml:space="preserve">.tar.gz.enc</w:t>
+      </w:r>
+      <w:r>
+        <w:t xml:space="preserve">; кнопка вибору файлу).</w:t>
+      </w:r>
+    </w:p>
+    <w:p>
+      <w:pPr>
+        <w:numPr>
+          <w:ilvl w:val="0"/>
+          <w:numId w:val="1046"/>
+        </w:numPr>
+        <w:pStyle w:val="Compact"/>
+      </w:pPr>
+      <w:r>
+        <w:t xml:space="preserve">Для зашифрованої копії з іншого сервера введіть її пароль; порожнє поле — пароль</w:t>
+      </w:r>
+      <w:r>
+        <w:t xml:space="preserve"> </w:t>
+      </w:r>
+      <w:r>
+        <w:rPr>
+          <w:rStyle w:val="VerbatimChar"/>
+        </w:rPr>
+        <w:t xml:space="preserve">BACKUP_PASSWORD</w:t>
+      </w:r>
+      <w:r>
+        <w:t xml:space="preserve"> </w:t>
+      </w:r>
+      <w:r>
+        <w:t xml:space="preserve">з</w:t>
+      </w:r>
+      <w:r>
+        <w:t xml:space="preserve"> </w:t>
+      </w:r>
+      <w:r>
+        <w:rPr>
+          <w:rStyle w:val="VerbatimChar"/>
+        </w:rPr>
+        <w:t xml:space="preserve">.env</w:t>
+      </w:r>
+      <w:r>
+        <w:t xml:space="preserve">.</w:t>
+      </w:r>
+    </w:p>
+    <w:p>
+      <w:pPr>
+        <w:numPr>
+          <w:ilvl w:val="0"/>
+          <w:numId w:val="1046"/>
+        </w:numPr>
+        <w:pStyle w:val="Compact"/>
+      </w:pPr>
+      <w:r>
+        <w:t xml:space="preserve">Залиште позначку «Створити страхувальну копію поточного стану» (рекомендовано) і введіть слово-підтвердження</w:t>
+      </w:r>
+      <w:r>
+        <w:t xml:space="preserve"> </w:t>
+      </w:r>
+      <w:r>
+        <w:rPr>
+          <w:bCs/>
+          <w:b/>
+        </w:rPr>
+        <w:t xml:space="preserve">ВІДНОВИТИ</w:t>
+      </w:r>
+      <w:r>
+        <w:t xml:space="preserve">, потім натисніть «Відновити» й підтвердіть запит браузера.</w:t>
+      </w:r>
+    </w:p>
+    <w:p>
+      <w:pPr>
+        <w:pStyle w:val="FirstParagraph"/>
+      </w:pPr>
+      <w:r>
+        <w:t xml:space="preserve">Система розшифровує й перевіряє архів (пошкоджений або з хибним паролем відхиляється</w:t>
+      </w:r>
+      <w:r>
+        <w:t xml:space="preserve"> </w:t>
+      </w:r>
+      <w:r>
+        <w:rPr>
+          <w:bCs/>
+          <w:b/>
+        </w:rPr>
+        <w:t xml:space="preserve">до</w:t>
+      </w:r>
+      <w:r>
+        <w:t xml:space="preserve"> </w:t>
+      </w:r>
+      <w:r>
+        <w:t xml:space="preserve">будь-яких змін), створює страхувальну копію, замінює базу даних і копіює</w:t>
+      </w:r>
+      <w:r>
+        <w:t xml:space="preserve"> </w:t>
+      </w:r>
+      <w:r>
+        <w:rPr>
+          <w:rStyle w:val="VerbatimChar"/>
+        </w:rPr>
+        <w:t xml:space="preserve">storage/uploads</w:t>
+      </w:r>
+      <w:r>
+        <w:t xml:space="preserve">,</w:t>
+      </w:r>
+      <w:r>
+        <w:t xml:space="preserve"> </w:t>
+      </w:r>
+      <w:r>
+        <w:rPr>
+          <w:rStyle w:val="VerbatimChar"/>
+        </w:rPr>
+        <w:t xml:space="preserve">storage/wiki</w:t>
+      </w:r>
+      <w:r>
+        <w:t xml:space="preserve">. Файли, яких немає в копії, не видаляються (копіювання лише додає й перезаписує). Дії «restore_started» і «restored» потрапляють у журнал аудиту (після заміни бази записи журналу до копії зникають разом з іншими даними). Після відновлення можуть знадобитися повторний вхід (користувачі беруться з копії),</w:t>
+      </w:r>
+      <w:r>
+        <w:t xml:space="preserve"> </w:t>
+      </w:r>
+      <w:r>
+        <w:rPr>
+          <w:rStyle w:val="VerbatimChar"/>
+        </w:rPr>
+        <w:t xml:space="preserve">sudo bash update.sh</w:t>
+      </w:r>
+      <w:r>
+        <w:t xml:space="preserve"> </w:t>
+      </w:r>
+      <w:r>
+        <w:t xml:space="preserve">(права, нові міграції) і перевірка «Стану системи».</w:t>
+      </w:r>
+      <w:r>
+        <w:t xml:space="preserve"> </w:t>
+      </w:r>
+      <w:r>
+        <w:t xml:space="preserve">Обмеження: файл з комп’ютера не більший за</w:t>
+      </w:r>
+      <w:r>
+        <w:t xml:space="preserve"> </w:t>
+      </w:r>
+      <w:r>
+        <w:rPr>
+          <w:rStyle w:val="VerbatimChar"/>
+        </w:rPr>
+        <w:t xml:space="preserve">upload_max_filesize</w:t>
+      </w:r>
+      <w:r>
+        <w:t xml:space="preserve">/</w:t>
+      </w:r>
+      <w:r>
+        <w:rPr>
+          <w:rStyle w:val="VerbatimChar"/>
+        </w:rPr>
+        <w:t xml:space="preserve">post_max_size</w:t>
+      </w:r>
+      <w:r>
+        <w:t xml:space="preserve"> </w:t>
+      </w:r>
+      <w:r>
+        <w:t xml:space="preserve">PHP (розмір показано в картці); більшу копію покладіть у каталог копій на сервері (з’явиться у списку) або скористайтесь</w:t>
+      </w:r>
+      <w:r>
+        <w:t xml:space="preserve"> </w:t>
+      </w:r>
+      <w:r>
+        <w:rPr>
+          <w:rStyle w:val="VerbatimChar"/>
+        </w:rPr>
+        <w:t xml:space="preserve">bin/restore.php</w:t>
+      </w:r>
+      <w:r>
+        <w:t xml:space="preserve">. На сервері потрібні</w:t>
+      </w:r>
+      <w:r>
+        <w:t xml:space="preserve"> </w:t>
+      </w:r>
+      <w:r>
+        <w:rPr>
+          <w:rStyle w:val="VerbatimChar"/>
+        </w:rPr>
+        <w:t xml:space="preserve">mysql</w:t>
+      </w:r>
+      <w:r>
+        <w:t xml:space="preserve"> </w:t>
+      </w:r>
+      <w:r>
+        <w:t xml:space="preserve">(клієнт) і</w:t>
+      </w:r>
+      <w:r>
+        <w:t xml:space="preserve"> </w:t>
+      </w:r>
+      <w:r>
+        <w:rPr>
+          <w:rStyle w:val="VerbatimChar"/>
+        </w:rPr>
+        <w:t xml:space="preserve">tar</w:t>
+      </w:r>
+      <w:r>
+        <w:t xml:space="preserve">; відновлення виконується в межах одного запиту, тож для дуже великих сховищ надійніше</w:t>
+      </w:r>
+      <w:r>
+        <w:t xml:space="preserve"> </w:t>
+      </w:r>
+      <w:r>
+        <w:rPr>
+          <w:rStyle w:val="VerbatimChar"/>
+        </w:rPr>
+        <w:t xml:space="preserve">bin/restore.php</w:t>
+      </w:r>
+      <w:r>
+        <w:t xml:space="preserve">. Тимчасові файли видаляються автоматично.</w:t>
+      </w:r>
+    </w:p>
+    <w:p>
+      <w:pPr>
+        <w:pStyle w:val="BodyText"/>
+      </w:pPr>
+      <w:r>
+        <w:rPr>
+          <w:bCs/>
+          <w:b/>
+        </w:rPr>
+        <w:t xml:space="preserve">Відновлення скриптом</w:t>
+      </w:r>
+      <w:r>
+        <w:rPr>
+          <w:bCs/>
+          <w:b/>
+        </w:rPr>
+        <w:t xml:space="preserve"> </w:t>
+      </w:r>
+      <w:r>
+        <w:rPr>
+          <w:rStyle w:val="VerbatimChar"/>
+          <w:bCs/>
+          <w:b/>
+        </w:rPr>
+        <w:t xml:space="preserve">bin/restore.php</w:t>
+      </w:r>
+      <w:r>
+        <w:t xml:space="preserve"> </w:t>
+      </w:r>
+      <w:r>
+        <w:t xml:space="preserve">(розшифровує, перевіряє цілісність, розпаковує; без</w:t>
+      </w:r>
+      <w:r>
+        <w:t xml:space="preserve"> </w:t>
+      </w:r>
+      <w:r>
+        <w:rPr>
+          <w:rStyle w:val="VerbatimChar"/>
+        </w:rPr>
+        <w:t xml:space="preserve">--apply</w:t>
+      </w:r>
+      <w:r>
+        <w:t xml:space="preserve"> </w:t>
+      </w:r>
+      <w:r>
+        <w:t xml:space="preserve">нічого в системі не змінює):</w:t>
+      </w:r>
+    </w:p>
+    <w:p>
+      <w:pPr>
+        <w:pStyle w:val="SourceCode"/>
+      </w:pPr>
+      <w:r>
+        <w:rPr>
+          <w:rStyle w:val="VerbatimChar"/>
+        </w:rPr>
+        <w:t xml:space="preserve">BACKUP_PASSWORD='…' php bin/restore.php backup-….tar.gz.enc --extract=/tmp/restore       # лише розпакувати й перевірити</w:t>
+      </w:r>
+      <w:r>
+        <w:br/>
+      </w:r>
+      <w:r>
+        <w:rPr>
+          <w:rStyle w:val="VerbatimChar"/>
+        </w:rPr>
+        <w:t xml:space="preserve">BACKUP_PASSWORD='…' php bin/restore.php backup-….tar.gz.enc --apply --yes                # відновити БД і файли</w:t>
+      </w:r>
+    </w:p>
+    <w:p>
+      <w:pPr>
+        <w:pStyle w:val="FirstParagraph"/>
+      </w:pPr>
+      <w:r>
+        <w:rPr>
+          <w:rStyle w:val="VerbatimChar"/>
+        </w:rPr>
+        <w:t xml:space="preserve">--apply --yes</w:t>
+      </w:r>
+      <w:r>
+        <w:t xml:space="preserve"> </w:t>
+      </w:r>
+      <w:r>
+        <w:rPr>
+          <w:bCs/>
+          <w:b/>
+        </w:rPr>
+        <w:t xml:space="preserve">перезаписує</w:t>
+      </w:r>
+      <w:r>
+        <w:t xml:space="preserve"> </w:t>
+      </w:r>
+      <w:r>
+        <w:t xml:space="preserve">базу з</w:t>
+      </w:r>
+      <w:r>
+        <w:t xml:space="preserve"> </w:t>
+      </w:r>
+      <w:r>
+        <w:rPr>
+          <w:rStyle w:val="VerbatimChar"/>
+        </w:rPr>
+        <w:t xml:space="preserve">.env</w:t>
+      </w:r>
+      <w:r>
+        <w:t xml:space="preserve"> </w:t>
+      </w:r>
+      <w:r>
+        <w:t xml:space="preserve">і файли</w:t>
+      </w:r>
+      <w:r>
+        <w:t xml:space="preserve"> </w:t>
+      </w:r>
+      <w:r>
+        <w:rPr>
+          <w:rStyle w:val="VerbatimChar"/>
+        </w:rPr>
+        <w:t xml:space="preserve">storage/uploads</w:t>
+      </w:r>
+      <w:r>
+        <w:t xml:space="preserve">,</w:t>
+      </w:r>
+      <w:r>
+        <w:t xml:space="preserve"> </w:t>
+      </w:r>
+      <w:r>
+        <w:rPr>
+          <w:rStyle w:val="VerbatimChar"/>
+        </w:rPr>
+        <w:t xml:space="preserve">storage/wiki</w:t>
+      </w:r>
+      <w:r>
+        <w:t xml:space="preserve">; потрібні клієнти</w:t>
+      </w:r>
+      <w:r>
+        <w:t xml:space="preserve"> </w:t>
+      </w:r>
+      <w:r>
+        <w:rPr>
+          <w:rStyle w:val="VerbatimChar"/>
+        </w:rPr>
+        <w:t xml:space="preserve">tar</w:t>
+      </w:r>
+      <w:r>
+        <w:t xml:space="preserve"> </w:t>
+      </w:r>
+      <w:r>
+        <w:t xml:space="preserve">і</w:t>
+      </w:r>
+      <w:r>
+        <w:t xml:space="preserve"> </w:t>
+      </w:r>
+      <w:r>
+        <w:rPr>
+          <w:rStyle w:val="VerbatimChar"/>
+        </w:rPr>
+        <w:t xml:space="preserve">mysql</w:t>
+      </w:r>
+      <w:r>
+        <w:t xml:space="preserve">. Перед відновленням скрипт сам створює</w:t>
+      </w:r>
+      <w:r>
+        <w:t xml:space="preserve"> </w:t>
+      </w:r>
+      <w:r>
+        <w:rPr>
+          <w:bCs/>
+          <w:b/>
+        </w:rPr>
+        <w:t xml:space="preserve">страхувальну копію поточного стану</w:t>
+      </w:r>
+      <w:r>
+        <w:t xml:space="preserve"> </w:t>
+      </w:r>
+      <w:r>
+        <w:t xml:space="preserve">(відкат — тим самим скриптом; пропустити:</w:t>
+      </w:r>
+      <w:r>
+        <w:t xml:space="preserve"> </w:t>
+      </w:r>
+      <w:r>
+        <w:rPr>
+          <w:rStyle w:val="VerbatimChar"/>
+        </w:rPr>
+        <w:t xml:space="preserve">--no-safety-backup</w:t>
+      </w:r>
+      <w:r>
+        <w:t xml:space="preserve">). Без</w:t>
+      </w:r>
+      <w:r>
+        <w:t xml:space="preserve"> </w:t>
+      </w:r>
+      <w:r>
+        <w:rPr>
+          <w:rStyle w:val="VerbatimChar"/>
+        </w:rPr>
+        <w:t xml:space="preserve">--extract</w:t>
+      </w:r>
+      <w:r>
+        <w:t xml:space="preserve"> </w:t>
+      </w:r>
+      <w:r>
+        <w:t xml:space="preserve">розпаковка йде в тимчасову теку, яку скрипт видаляє. Копія з іншого сервера: задайте</w:t>
+      </w:r>
+      <w:r>
+        <w:t xml:space="preserve"> </w:t>
+      </w:r>
+      <w:r>
+        <w:rPr>
+          <w:rStyle w:val="VerbatimChar"/>
+        </w:rPr>
+        <w:t xml:space="preserve">BACKUP_PASSWORD</w:t>
+      </w:r>
+      <w:r>
+        <w:t xml:space="preserve"> </w:t>
+      </w:r>
+      <w:r>
+        <w:t xml:space="preserve">у середовищі. Після відновлення —</w:t>
+      </w:r>
+      <w:r>
+        <w:t xml:space="preserve"> </w:t>
+      </w:r>
+      <w:r>
+        <w:rPr>
+          <w:rStyle w:val="VerbatimChar"/>
+        </w:rPr>
+        <w:t xml:space="preserve">sudo bash update.sh</w:t>
+      </w:r>
+      <w:r>
+        <w:t xml:space="preserve"> </w:t>
+      </w:r>
+      <w:r>
+        <w:t xml:space="preserve">і перевірка «Стану системи». Розшифрувати вручну:</w:t>
+      </w:r>
+      <w:r>
+        <w:t xml:space="preserve"> </w:t>
+      </w:r>
+      <w:r>
+        <w:rPr>
+          <w:rStyle w:val="VerbatimChar"/>
+        </w:rPr>
+        <w:t xml:space="preserve">openssl enc -d -aes-256-cbc -pbkdf2 -iter 200000 -md sha256 -in backup-….tar.gz.enc -out backup-….tar.gz</w:t>
+      </w:r>
+      <w:r>
+        <w:t xml:space="preserve">.</w:t>
+      </w:r>
+    </w:p>
+    <w:p>
+      <w:pPr>
+        <w:pStyle w:val="BodyText"/>
+      </w:pPr>
+      <w:r>
+        <w:rPr>
+          <w:bCs/>
+          <w:b/>
+        </w:rPr>
         <w:t xml:space="preserve">Відновлення</w:t>
       </w:r>
       <w:r>
@@ -29225,7 +30211,7 @@
         <w:t xml:space="preserve"> </w:t>
       </w:r>
       <w:r>
-        <w:t xml:space="preserve">Кожен розділ пошуку користується тією самою перевіркою видимості, що й власна сторінка розділу, а не окремою копією правил:</w:t>
+        <w:t xml:space="preserve">Кожен розділ пошуку користується тією самою перевіркою видимості, що й власна сторінка розділу, а не окремою копією правил: Для адміністратора підрозділу є картка «Шаблони проєктів і задач» у «Мій підрозділ → Керування». При додаванні шаблону задачі до проєкту назву задачі можна змінити у формі (необов’язково; порожнє поле — назва з шаблону).</w:t>
       </w:r>
       <w:r>
         <w:t xml:space="preserve"> </w:t>
@@ -31866,6 +32852,36 @@
   </w:num>
   <w:num w:numId="1045">
     <w:abstractNumId w:val="991"/>
+  </w:num>
+  <w:num w:numId="1046">
+    <w:abstractNumId w:val="99411"/>
+    <w:lvlOverride w:ilvl="0">
+      <w:startOverride w:val="1"/>
+    </w:lvlOverride>
+    <w:lvlOverride w:ilvl="1">
+      <w:startOverride w:val="1"/>
+    </w:lvlOverride>
+    <w:lvlOverride w:ilvl="2">
+      <w:startOverride w:val="1"/>
+    </w:lvlOverride>
+    <w:lvlOverride w:ilvl="3">
+      <w:startOverride w:val="1"/>
+    </w:lvlOverride>
+    <w:lvlOverride w:ilvl="4">
+      <w:startOverride w:val="1"/>
+    </w:lvlOverride>
+    <w:lvlOverride w:ilvl="5">
+      <w:startOverride w:val="1"/>
+    </w:lvlOverride>
+    <w:lvlOverride w:ilvl="6">
+      <w:startOverride w:val="1"/>
+    </w:lvlOverride>
+    <w:lvlOverride w:ilvl="7">
+      <w:startOverride w:val="1"/>
+    </w:lvlOverride>
+    <w:lvlOverride w:ilvl="8">
+      <w:startOverride w:val="1"/>
+    </w:lvlOverride>
   </w:num>
 </w:numbering>
 </file>

</xml_diff>

<commit_message>
release 0.3.0 Fixing new minor flaws
</commit_message>
<xml_diff>
--- a/docs/ITSM_Admin_Guide.docx
+++ b/docs/ITSM_Admin_Guide.docx
@@ -2,7 +2,7 @@
 <file path=word/document.xml><?xml version="1.0" encoding="utf-8"?>
 <w:document xmlns:w="http://schemas.openxmlformats.org/wordprocessingml/2006/main" xmlns:m="http://schemas.openxmlformats.org/officeDocument/2006/math" xmlns:r="http://schemas.openxmlformats.org/officeDocument/2006/relationships" xmlns:o="urn:schemas-microsoft-com:office:office" xmlns:v="urn:schemas-microsoft-com:vml" xmlns:w10="urn:schemas-microsoft-com:office:word" xmlns:a="http://schemas.openxmlformats.org/drawingml/2006/main" xmlns:pic="http://schemas.openxmlformats.org/drawingml/2006/picture" xmlns:wp="http://schemas.openxmlformats.org/drawingml/2006/wordprocessingDrawing">
   <w:body>
-    <w:bookmarkStart w:id="153" w:name="гайд-адміністратора-itsm-system"/>
+    <w:bookmarkStart w:id="156" w:name="гайд-адміністратора-itsm-system"/>
     <w:p>
       <w:pPr>
         <w:pStyle w:val="Heading1"/>
@@ -683,6 +683,56 @@
               <w:jc w:val="left"/>
             </w:pPr>
             <w:r>
+              <w:t xml:space="preserve">Автоматичні правила черги</w:t>
+            </w:r>
+          </w:p>
+        </w:tc>
+        <w:tc>
+          <w:tcPr/>
+          <w:p>
+            <w:pPr>
+              <w:pStyle w:val="Compact"/>
+              <w:jc w:val="left"/>
+            </w:pPr>
+            <w:r>
+              <w:t xml:space="preserve">Дії при створенні тікета за ключовими словами: перенести в чергу, призначити оператора, сповістити</w:t>
+            </w:r>
+          </w:p>
+        </w:tc>
+        <w:tc>
+          <w:tcPr/>
+          <w:p>
+            <w:pPr>
+              <w:pStyle w:val="Compact"/>
+              <w:jc w:val="left"/>
+            </w:pPr>
+            <w:r>
+              <w:t xml:space="preserve">10в</w:t>
+            </w:r>
+          </w:p>
+        </w:tc>
+      </w:tr>
+      <w:tr>
+        <w:tc>
+          <w:tcPr/>
+          <w:p>
+            <w:pPr>
+              <w:pStyle w:val="Compact"/>
+              <w:jc w:val="left"/>
+            </w:pPr>
+            <w:r>
+              <w:t xml:space="preserve">Тікети</w:t>
+            </w:r>
+          </w:p>
+        </w:tc>
+        <w:tc>
+          <w:tcPr/>
+          <w:p>
+            <w:pPr>
+              <w:pStyle w:val="Compact"/>
+              <w:jc w:val="left"/>
+            </w:pPr>
+            <w:r>
               <w:t xml:space="preserve">Звіт по тікетах</w:t>
             </w:r>
           </w:p>
@@ -5735,7 +5785,7 @@
       </w:r>
     </w:p>
     <w:bookmarkEnd w:id="45"/>
-    <w:bookmarkStart w:id="54" w:name="робота-з-тікетами-базова-версія"/>
+    <w:bookmarkStart w:id="55" w:name="робота-з-тікетами-базова-версія"/>
     <w:p>
       <w:pPr>
         <w:pStyle w:val="Heading2"/>
@@ -8743,12 +8793,264 @@
       </w:r>
     </w:p>
     <w:bookmarkEnd w:id="51"/>
-    <w:bookmarkStart w:id="52" w:name="б.-облік-часу-по-тікетах"/>
+    <w:bookmarkStart w:id="52" w:name="в.-автоматичні-правила-черги-тікетів"/>
     <w:p>
       <w:pPr>
         <w:pStyle w:val="Heading3"/>
       </w:pPr>
       <w:r>
+        <w:t xml:space="preserve">10в. Автоматичні правила черги тікетів</w:t>
+      </w:r>
+    </w:p>
+    <w:p>
+      <w:pPr>
+        <w:pStyle w:val="FirstParagraph"/>
+      </w:pPr>
+      <w:r>
+        <w:rPr>
+          <w:bCs/>
+          <w:b/>
+        </w:rPr>
+        <w:t xml:space="preserve">Адмін-панель → Керування → Автоматичні правила черги</w:t>
+      </w:r>
+      <w:r>
+        <w:t xml:space="preserve"> </w:t>
+      </w:r>
+      <w:r>
+        <w:t xml:space="preserve">(</w:t>
+      </w:r>
+      <w:r>
+        <w:rPr>
+          <w:rStyle w:val="VerbatimChar"/>
+        </w:rPr>
+        <w:t xml:space="preserve">/admin/ticket-rules</w:t>
+      </w:r>
+      <w:r>
+        <w:t xml:space="preserve">). Правило спрацьовує при</w:t>
+      </w:r>
+      <w:r>
+        <w:t xml:space="preserve"> </w:t>
+      </w:r>
+      <w:r>
+        <w:rPr>
+          <w:bCs/>
+          <w:b/>
+        </w:rPr>
+        <w:t xml:space="preserve">створенні</w:t>
+      </w:r>
+      <w:r>
+        <w:t xml:space="preserve"> </w:t>
+      </w:r>
+      <w:r>
+        <w:t xml:space="preserve">тікета будь-яким шляхом (форма, портал самообслуговування, пошта, API), якщо в темі та/або описі є хоча б одне з ключових слів (без урахування регістру; частина слова теж збігається). Правила перевіряються за порядком (поле «Порядок»: менше число — раніше),</w:t>
+      </w:r>
+      <w:r>
+        <w:t xml:space="preserve"> </w:t>
+      </w:r>
+      <w:r>
+        <w:rPr>
+          <w:bCs/>
+          <w:b/>
+        </w:rPr>
+        <w:t xml:space="preserve">перше правило, що збіглося, виконується</w:t>
+      </w:r>
+      <w:r>
+        <w:t xml:space="preserve">, далі перевірка зупиняється.</w:t>
+      </w:r>
+    </w:p>
+    <w:p>
+      <w:pPr>
+        <w:pStyle w:val="BodyText"/>
+      </w:pPr>
+      <w:r>
+        <w:rPr>
+          <w:bCs/>
+          <w:b/>
+        </w:rPr>
+        <w:t xml:space="preserve">Хто що бачить.</w:t>
+      </w:r>
+      <w:r>
+        <w:t xml:space="preserve"> </w:t>
+      </w:r>
+      <w:r>
+        <w:t xml:space="preserve">Створювати, змінювати, вмикати/вимикати та видаляти правила може</w:t>
+      </w:r>
+      <w:r>
+        <w:t xml:space="preserve"> </w:t>
+      </w:r>
+      <w:r>
+        <w:rPr>
+          <w:bCs/>
+          <w:b/>
+        </w:rPr>
+        <w:t xml:space="preserve">лише адміністратор системи</w:t>
+      </w:r>
+      <w:r>
+        <w:t xml:space="preserve">. Адміністратор підрозділу, менеджер ІТ та оператори мають лише перегляд (кнопка «Правила черги» на сторінці «Тікети»,</w:t>
+      </w:r>
+      <w:r>
+        <w:t xml:space="preserve"> </w:t>
+      </w:r>
+      <w:r>
+        <w:rPr>
+          <w:rStyle w:val="VerbatimChar"/>
+        </w:rPr>
+        <w:t xml:space="preserve">/ticket-rules</w:t>
+      </w:r>
+      <w:r>
+        <w:t xml:space="preserve">; адміністратор підрозділу — ще й</w:t>
+      </w:r>
+      <w:r>
+        <w:t xml:space="preserve"> </w:t>
+      </w:r>
+      <w:r>
+        <w:rPr>
+          <w:rStyle w:val="VerbatimChar"/>
+        </w:rPr>
+        <w:t xml:space="preserve">/unit/ticket-rules</w:t>
+      </w:r>
+      <w:r>
+        <w:t xml:space="preserve">): видно правила, де їх призначено оператором. Адміністратор підрозділу додатково бачить правила своїх працівників і власні раніше створені. Редагування правила, створеного раніше адміністратором підрозділу, зберігає його прив’язку до підрозділу.</w:t>
+      </w:r>
+    </w:p>
+    <w:p>
+      <w:pPr>
+        <w:pStyle w:val="BodyText"/>
+      </w:pPr>
+      <w:r>
+        <w:rPr>
+          <w:bCs/>
+          <w:b/>
+        </w:rPr>
+        <w:t xml:space="preserve">Тікети з пошти.</w:t>
+      </w:r>
+      <w:r>
+        <w:t xml:space="preserve"> </w:t>
+      </w:r>
+      <w:r>
+        <w:t xml:space="preserve">Результат видно в журналі пошти (Налаштування → Пошта → тікети): у примітці до створеного тікета пишеться «правило «…»: чергу змінено…», «жодне правило не збіглося за ключовими словами» або «правило збіглося, але діє лише на заявників підрозділу». Правило адміністратора підрозділу не діє на листи від адрес без облікового запису в системі та від користувачів поза його підрозділом. Невидимі символи й нерозривні пробіли в листах при зіставленні ігноруються.</w:t>
+      </w:r>
+    </w:p>
+    <w:p>
+      <w:pPr>
+        <w:pStyle w:val="BodyText"/>
+      </w:pPr>
+      <w:r>
+        <w:t xml:space="preserve">Умови: ключові слова (через кому чи з нового рядка), де шукати (тема / опис / обидва) і, необов’язково, черга, у яку потрапив тікет. Дії (потрібна хоча б одна):</w:t>
+      </w:r>
+      <w:r>
+        <w:t xml:space="preserve"> </w:t>
+      </w:r>
+      <w:r>
+        <w:t xml:space="preserve">-</w:t>
+      </w:r>
+      <w:r>
+        <w:t xml:space="preserve"> </w:t>
+      </w:r>
+      <w:r>
+        <w:rPr>
+          <w:bCs/>
+          <w:b/>
+        </w:rPr>
+        <w:t xml:space="preserve">перенести в чергу</w:t>
+      </w:r>
+      <w:r>
+        <w:t xml:space="preserve"> </w:t>
+      </w:r>
+      <w:r>
+        <w:t xml:space="preserve">— якщо оператора не задано, призначається оператор за замовчуванням нової черги (розділ 11);</w:t>
+      </w:r>
+      <w:r>
+        <w:t xml:space="preserve"> </w:t>
+      </w:r>
+      <w:r>
+        <w:t xml:space="preserve">-</w:t>
+      </w:r>
+      <w:r>
+        <w:t xml:space="preserve"> </w:t>
+      </w:r>
+      <w:r>
+        <w:rPr>
+          <w:bCs/>
+          <w:b/>
+        </w:rPr>
+        <w:t xml:space="preserve">призначити оператора</w:t>
+      </w:r>
+      <w:r>
+        <w:t xml:space="preserve">;</w:t>
+      </w:r>
+      <w:r>
+        <w:t xml:space="preserve"> </w:t>
+      </w:r>
+      <w:r>
+        <w:t xml:space="preserve">-</w:t>
+      </w:r>
+      <w:r>
+        <w:t xml:space="preserve"> </w:t>
+      </w:r>
+      <w:r>
+        <w:rPr>
+          <w:bCs/>
+          <w:b/>
+        </w:rPr>
+        <w:t xml:space="preserve">сповістити листом</w:t>
+      </w:r>
+      <w:r>
+        <w:t xml:space="preserve"> </w:t>
+      </w:r>
+      <w:r>
+        <w:t xml:space="preserve">на задані адреси та/або призначеному оператору (потрібна налаштована пошта; без неї правило виконується, але листи не йдуть).</w:t>
+      </w:r>
+    </w:p>
+    <w:p>
+      <w:pPr>
+        <w:pStyle w:val="BodyText"/>
+      </w:pPr>
+      <w:r>
+        <w:t xml:space="preserve">Таблиця показує для кожного правила умову, дії, кількість спрацювань і час останнього; правило можна змінити, вимкнути чи видалити. Спрацювання записується в журнал аудиту тікета (</w:t>
+      </w:r>
+      <w:r>
+        <w:rPr>
+          <w:rStyle w:val="VerbatimChar"/>
+        </w:rPr>
+        <w:t xml:space="preserve">rule_applied</w:t>
+      </w:r>
+      <w:r>
+        <w:t xml:space="preserve">), керування правилами — в журнал аудиту («Правило черги тікетів»). Правила не застосовуються до вже створених тікетів. Адміністратор системи бачить і змінює всі правила (глобальні та підрозділів).</w:t>
+      </w:r>
+      <w:r>
+        <w:t xml:space="preserve"> </w:t>
+      </w:r>
+      <w:r>
+        <w:rPr>
+          <w:bCs/>
+          <w:b/>
+        </w:rPr>
+        <w:t xml:space="preserve">Адміністратор підрозділу</w:t>
+      </w:r>
+      <w:r>
+        <w:t xml:space="preserve"> </w:t>
+      </w:r>
+      <w:r>
+        <w:t xml:space="preserve">керує лише своїми: вони діють тільки на тікети заявників його підрозділу (анонімні звернення з порталу підрозділу не належать), а оператором може бути лише працівник підрозділу. Таблицю створює міграція 046 (</w:t>
+      </w:r>
+      <w:r>
+        <w:rPr>
+          <w:rStyle w:val="VerbatimChar"/>
+        </w:rPr>
+        <w:t xml:space="preserve">sudo bash update.sh</w:t>
+      </w:r>
+      <w:r>
+        <w:t xml:space="preserve">).</w:t>
+      </w:r>
+    </w:p>
+    <w:bookmarkEnd w:id="52"/>
+    <w:bookmarkStart w:id="53" w:name="б.-облік-часу-по-тікетах"/>
+    <w:p>
+      <w:pPr>
+        <w:pStyle w:val="Heading3"/>
+      </w:pPr>
+      <w:r>
         <w:t xml:space="preserve">10б. Облік часу по тікетах</w:t>
       </w:r>
     </w:p>
@@ -8948,8 +9250,8 @@
         <w:t xml:space="preserve">: «Облік часу» або «Звіт по тікетах» (останній — для адміністраторів системи й підрозділу; той самий звіт, що в «Керуванні», за обраний тиждень/місяць, у PDF, XLSX чи CSV).</w:t>
       </w:r>
     </w:p>
-    <w:bookmarkEnd w:id="52"/>
-    <w:bookmarkStart w:id="53" w:name="оцінка-якості-обслуговування-csat"/>
+    <w:bookmarkEnd w:id="53"/>
+    <w:bookmarkStart w:id="54" w:name="оцінка-якості-обслуговування-csat"/>
     <w:p>
       <w:pPr>
         <w:pStyle w:val="Heading3"/>
@@ -9154,9 +9456,9 @@
         <w:t xml:space="preserve">: зв’язок «пов’язаний» (симетричний) і «дубль» (спрямований: дубль → оригінал). Керувати зв’язками можуть ті, хто може призначати операторів (адміністратор системи, адміністратор підрозділу, керівник ІТ, оператор підтримки), і лише між тікетами, які вони бачать. Зміни пишуться в журнал аудиту обох тікетів. Зміна статусу оригіналу із галочкою «і для дублів» застосовується до всіх його дублів, видимих користувачу. Детально — посібник користувача, розділ 7.3б. Без міграції блок просто не показується.</w:t>
       </w:r>
     </w:p>
-    <w:bookmarkEnd w:id="53"/>
     <w:bookmarkEnd w:id="54"/>
-    <w:bookmarkStart w:id="58" w:name="Xad5bb3f3af83a0143205fbaa83a57e6d5facee8"/>
+    <w:bookmarkEnd w:id="55"/>
+    <w:bookmarkStart w:id="60" w:name="Xad5bb3f3af83a0143205fbaa83a57e6d5facee8"/>
     <w:p>
       <w:pPr>
         <w:pStyle w:val="Heading2"/>
@@ -9182,7 +9484,7 @@
         <w:t xml:space="preserve">Черги — це категорії, за якими розподіляються звернення (наприклад, «Загальна підтримка», «Мережева підтримка», «Бухгалтерські системи»). При створенні тікета користувач обирає чергу зі списку.</w:t>
       </w:r>
     </w:p>
-    <w:bookmarkStart w:id="55" w:name="створення-нової-черги"/>
+    <w:bookmarkStart w:id="56" w:name="створення-нової-черги"/>
     <w:p>
       <w:pPr>
         <w:pStyle w:val="Heading3"/>
@@ -9261,8 +9563,98 @@
         <w:t xml:space="preserve">Нова черга одразу з’являється у випадаючому списку на сторінці створення тікета — жодних додаткових дій не потрібно.</w:t>
       </w:r>
     </w:p>
-    <w:bookmarkEnd w:id="55"/>
-    <w:bookmarkStart w:id="56" w:name="sla-нормативи-черги"/>
+    <w:bookmarkEnd w:id="56"/>
+    <w:bookmarkStart w:id="57" w:name="зміна-та-видалення-черги"/>
+    <w:p>
+      <w:pPr>
+        <w:pStyle w:val="Heading3"/>
+      </w:pPr>
+      <w:r>
+        <w:t xml:space="preserve">Зміна та видалення черги</w:t>
+      </w:r>
+    </w:p>
+    <w:p>
+      <w:pPr>
+        <w:pStyle w:val="FirstParagraph"/>
+      </w:pPr>
+      <w:r>
+        <w:t xml:space="preserve">Лише</w:t>
+      </w:r>
+      <w:r>
+        <w:t xml:space="preserve"> </w:t>
+      </w:r>
+      <w:r>
+        <w:rPr>
+          <w:bCs/>
+          <w:b/>
+        </w:rPr>
+        <w:t xml:space="preserve">адміністратор системи</w:t>
+      </w:r>
+      <w:r>
+        <w:t xml:space="preserve"> </w:t>
+      </w:r>
+      <w:r>
+        <w:t xml:space="preserve">може змінювати черги. У рядку черги кнопка</w:t>
+      </w:r>
+      <w:r>
+        <w:t xml:space="preserve"> </w:t>
+      </w:r>
+      <w:r>
+        <w:rPr>
+          <w:bCs/>
+          <w:b/>
+        </w:rPr>
+        <w:t xml:space="preserve">«Змінити»</w:t>
+      </w:r>
+      <w:r>
+        <w:t xml:space="preserve"> </w:t>
+      </w:r>
+      <w:r>
+        <w:t xml:space="preserve">відкриває форму з назвою й описом (назва має лишатись унікальною). Зміни пишуться в журнал аудиту (старе → нове значення); тікети, правила й налаштування залишаються прив’язаними до тієї самої черги.</w:t>
+      </w:r>
+    </w:p>
+    <w:p>
+      <w:pPr>
+        <w:pStyle w:val="BodyText"/>
+      </w:pPr>
+      <w:r>
+        <w:t xml:space="preserve">Кнопка</w:t>
+      </w:r>
+      <w:r>
+        <w:t xml:space="preserve"> </w:t>
+      </w:r>
+      <w:r>
+        <w:rPr>
+          <w:bCs/>
+          <w:b/>
+        </w:rPr>
+        <w:t xml:space="preserve">«Видалити»</w:t>
+      </w:r>
+      <w:r>
+        <w:t xml:space="preserve"> </w:t>
+      </w:r>
+      <w:r>
+        <w:t xml:space="preserve">з’являється лише у</w:t>
+      </w:r>
+      <w:r>
+        <w:t xml:space="preserve"> </w:t>
+      </w:r>
+      <w:r>
+        <w:rPr>
+          <w:bCs/>
+          <w:b/>
+        </w:rPr>
+        <w:t xml:space="preserve">порожніх</w:t>
+      </w:r>
+      <w:r>
+        <w:t xml:space="preserve"> </w:t>
+      </w:r>
+      <w:r>
+        <w:t xml:space="preserve">черг (без жодного тікета) і якщо черга не остання. Разом із чергою видаляється її SLA-норматив і правила черги з умовою «лише в цій черзі»; у правилах, що переносять тікети в цю чергу, дія «перенести в чергу» скидається. Чергу з тікетами спершу очистіть (перенесіть тікети в іншу чергу).</w:t>
+      </w:r>
+    </w:p>
+    <w:bookmarkEnd w:id="57"/>
+    <w:bookmarkStart w:id="58" w:name="sla-нормативи-черги"/>
     <w:p>
       <w:pPr>
         <w:pStyle w:val="Heading3"/>
@@ -9384,8 +9776,8 @@
         <w:t xml:space="preserve">Змінені нормативи не «переписують історію»: закриті тікети прострочення не показують за жодних нормативів.</w:t>
       </w:r>
     </w:p>
-    <w:bookmarkEnd w:id="56"/>
-    <w:bookmarkStart w:id="57" w:name="автопризначення-оператора"/>
+    <w:bookmarkEnd w:id="58"/>
+    <w:bookmarkStart w:id="59" w:name="автопризначення-оператора"/>
     <w:p>
       <w:pPr>
         <w:pStyle w:val="Heading3"/>
@@ -9555,9 +9947,9 @@
         </w:pict>
       </w:r>
     </w:p>
-    <w:bookmarkEnd w:id="57"/>
-    <w:bookmarkEnd w:id="58"/>
-    <w:bookmarkStart w:id="63" w:name="X4b87cc7604d91cf485306d13191af064c61aa40"/>
+    <w:bookmarkEnd w:id="59"/>
+    <w:bookmarkEnd w:id="60"/>
+    <w:bookmarkStart w:id="65" w:name="X4b87cc7604d91cf485306d13191af064c61aa40"/>
     <w:p>
       <w:pPr>
         <w:pStyle w:val="Heading2"/>
@@ -9615,7 +10007,7 @@
         <w:t xml:space="preserve">списку користувачів із каталогу. Сторінка доступна лише ролі «Адміністратор системи».</w:t>
       </w:r>
     </w:p>
-    <w:bookmarkStart w:id="59" w:name="як-це-працює"/>
+    <w:bookmarkStart w:id="61" w:name="як-це-працює"/>
     <w:p>
       <w:pPr>
         <w:pStyle w:val="Heading3"/>
@@ -9736,8 +10128,8 @@
         <w:t xml:space="preserve">Змінити пароль AD-користувача в системі не можна — ним керує домен (у профілі й у списку користувачів показано «Керується через AD»).</w:t>
       </w:r>
     </w:p>
-    <w:bookmarkEnd w:id="59"/>
-    <w:bookmarkStart w:id="60" w:name="налаштування-крок-за-кроком"/>
+    <w:bookmarkEnd w:id="61"/>
+    <w:bookmarkStart w:id="62" w:name="налаштування-крок-за-кроком"/>
     <w:p>
       <w:pPr>
         <w:pStyle w:val="Heading3"/>
@@ -11072,8 +11464,8 @@
         <w:t xml:space="preserve">— Адмін-панель → Налаштування → Користувачі: AD-акаунти мають з’явитися в розділі «Active Directory» (згруповані за OU) із правильними ролями. Потім спробуйте увійти одним із них: email із цього запису й доменний пароль.</w:t>
       </w:r>
     </w:p>
-    <w:bookmarkEnd w:id="60"/>
-    <w:bookmarkStart w:id="61" w:name="що-саме-робить-синхронізація"/>
+    <w:bookmarkEnd w:id="62"/>
+    <w:bookmarkStart w:id="63" w:name="що-саме-робить-синхронізація"/>
     <w:p>
       <w:pPr>
         <w:pStyle w:val="Heading3"/>
@@ -11723,8 +12115,8 @@
         <w:t xml:space="preserve">.</w:t>
       </w:r>
     </w:p>
-    <w:bookmarkEnd w:id="61"/>
-    <w:bookmarkStart w:id="62" w:name="діагностика"/>
+    <w:bookmarkEnd w:id="63"/>
+    <w:bookmarkStart w:id="64" w:name="діагностика"/>
     <w:p>
       <w:pPr>
         <w:pStyle w:val="Heading3"/>
@@ -12306,9 +12698,9 @@
         </w:pict>
       </w:r>
     </w:p>
-    <w:bookmarkEnd w:id="62"/>
-    <w:bookmarkEnd w:id="63"/>
-    <w:bookmarkStart w:id="73" w:name="вкладення-файлів-тікети-й-задачі"/>
+    <w:bookmarkEnd w:id="64"/>
+    <w:bookmarkEnd w:id="65"/>
+    <w:bookmarkStart w:id="75" w:name="вкладення-файлів-тікети-й-задачі"/>
     <w:p>
       <w:pPr>
         <w:pStyle w:val="Heading2"/>
@@ -12370,7 +12762,7 @@
         <w:t xml:space="preserve">тікета — у формі для співробітників, на порталі та листом (розділ 10).</w:t>
       </w:r>
     </w:p>
-    <w:bookmarkStart w:id="64" w:name="документи-office-у-задачах"/>
+    <w:bookmarkStart w:id="66" w:name="документи-office-у-задачах"/>
     <w:p>
       <w:pPr>
         <w:pStyle w:val="Heading3"/>
@@ -12508,8 +12900,8 @@
         <w:t xml:space="preserve">Тікети (їх бачать заявники, вони ж надходять поштою) приймають, як і раніше, лише JPG, PNG, GIF, WebP і PDF.</w:t>
       </w:r>
     </w:p>
-    <w:bookmarkEnd w:id="64"/>
-    <w:bookmarkStart w:id="65" w:name="хто-що-може"/>
+    <w:bookmarkEnd w:id="66"/>
+    <w:bookmarkStart w:id="67" w:name="хто-що-може"/>
     <w:p>
       <w:pPr>
         <w:pStyle w:val="Heading3"/>
@@ -12677,8 +13069,8 @@
         <w:t xml:space="preserve">для картинок з пошти.</w:t>
       </w:r>
     </w:p>
-    <w:bookmarkEnd w:id="65"/>
-    <w:bookmarkStart w:id="66" w:name="що-приймається"/>
+    <w:bookmarkEnd w:id="67"/>
+    <w:bookmarkStart w:id="68" w:name="що-приймається"/>
     <w:p>
       <w:pPr>
         <w:pStyle w:val="Heading3"/>
@@ -12915,8 +13307,8 @@
         <w:t xml:space="preserve">), керувальні символи й символи зміни напрямку тексту; довгі назви скорочуються до 150 символів.</w:t>
       </w:r>
     </w:p>
-    <w:bookmarkEnd w:id="66"/>
-    <w:bookmarkStart w:id="67" w:name="Xe239cf769137c6241f760e1dae104bdbe0eef7e"/>
+    <w:bookmarkEnd w:id="68"/>
+    <w:bookmarkStart w:id="69" w:name="Xe239cf769137c6241f760e1dae104bdbe0eef7e"/>
     <w:p>
       <w:pPr>
         <w:pStyle w:val="Heading3"/>
@@ -13111,8 +13503,8 @@
         <w:t xml:space="preserve">.</w:t>
       </w:r>
     </w:p>
-    <w:bookmarkEnd w:id="67"/>
-    <w:bookmarkStart w:id="68" w:name="де-зберігаються-файли-та-резервні-копії"/>
+    <w:bookmarkEnd w:id="69"/>
+    <w:bookmarkStart w:id="70" w:name="де-зберігаються-файли-та-резервні-копії"/>
     <w:p>
       <w:pPr>
         <w:pStyle w:val="Heading3"/>
@@ -13514,8 +13906,8 @@
         <w:t xml:space="preserve">), тож у репозиторій файли не потраплять.</w:t>
       </w:r>
     </w:p>
-    <w:bookmarkEnd w:id="68"/>
-    <w:bookmarkStart w:id="69" w:name="мініатюри-зображень"/>
+    <w:bookmarkEnd w:id="70"/>
+    <w:bookmarkStart w:id="71" w:name="мініатюри-зображень"/>
     <w:p>
       <w:pPr>
         <w:pStyle w:val="Heading3"/>
@@ -13815,8 +14207,8 @@
         <w:t xml:space="preserve">(її можна й не копіювати — відтвориться сама).</w:t>
       </w:r>
     </w:p>
-    <w:bookmarkEnd w:id="69"/>
-    <w:bookmarkStart w:id="70" w:name="видалення"/>
+    <w:bookmarkEnd w:id="71"/>
+    <w:bookmarkStart w:id="72" w:name="видалення"/>
     <w:p>
       <w:pPr>
         <w:pStyle w:val="Heading3"/>
@@ -13899,8 +14291,8 @@
         <w:t xml:space="preserve">Якщо видалити користувача, його вкладення лишаються, а автор буде показаний як «користувача видалено».</w:t>
       </w:r>
     </w:p>
-    <w:bookmarkEnd w:id="70"/>
-    <w:bookmarkStart w:id="71" w:name="журнал-аудиту"/>
+    <w:bookmarkEnd w:id="72"/>
+    <w:bookmarkStart w:id="73" w:name="журнал-аудиту"/>
     <w:p>
       <w:pPr>
         <w:pStyle w:val="Heading3"/>
@@ -13977,8 +14369,8 @@
         <w:t xml:space="preserve">з причиною).</w:t>
       </w:r>
     </w:p>
-    <w:bookmarkEnd w:id="71"/>
-    <w:bookmarkStart w:id="72" w:name="діагностика-1"/>
+    <w:bookmarkEnd w:id="73"/>
+    <w:bookmarkStart w:id="74" w:name="діагностика-1"/>
     <w:p>
       <w:pPr>
         <w:pStyle w:val="Heading3"/>
@@ -14515,9 +14907,9 @@
         </w:pict>
       </w:r>
     </w:p>
-    <w:bookmarkEnd w:id="72"/>
-    <w:bookmarkEnd w:id="73"/>
-    <w:bookmarkStart w:id="85" w:name="вікі-меню-вікі"/>
+    <w:bookmarkEnd w:id="74"/>
+    <w:bookmarkEnd w:id="75"/>
+    <w:bookmarkStart w:id="87" w:name="вікі-меню-вікі"/>
     <w:p>
       <w:pPr>
         <w:pStyle w:val="Heading2"/>
@@ -14563,7 +14955,7 @@
         <w:t xml:space="preserve">бачать усі, хто увійшов.</w:t>
       </w:r>
     </w:p>
-    <w:bookmarkStart w:id="74" w:name="де-зберігається-текст-сторінок"/>
+    <w:bookmarkStart w:id="76" w:name="де-зберігається-текст-сторінок"/>
     <w:p>
       <w:pPr>
         <w:pStyle w:val="Heading3"/>
@@ -14786,8 +15178,8 @@
         <w:t xml:space="preserve">Пошук по вікі читає файли сторінок, видимих користувачеві; для бази знань на сотні сторінок це швидко, для тисяч — повільніше, ніж пошук у БД.</w:t>
       </w:r>
     </w:p>
-    <w:bookmarkEnd w:id="74"/>
-    <w:bookmarkStart w:id="75" w:name="хто-що-може-1"/>
+    <w:bookmarkEnd w:id="76"/>
+    <w:bookmarkStart w:id="77" w:name="хто-що-може-1"/>
     <w:p>
       <w:pPr>
         <w:pStyle w:val="Heading3"/>
@@ -15033,8 +15425,8 @@
         <w:t xml:space="preserve">(зокрема гайда адміністратора).</w:t>
       </w:r>
     </w:p>
-    <w:bookmarkEnd w:id="75"/>
-    <w:bookmarkStart w:id="76" w:name="створення-й-редагування"/>
+    <w:bookmarkEnd w:id="77"/>
+    <w:bookmarkStart w:id="78" w:name="створення-й-редагування"/>
     <w:p>
       <w:pPr>
         <w:pStyle w:val="Heading3"/>
@@ -15409,8 +15801,8 @@
         <w:t xml:space="preserve">Обмеження: назва до 200 символів, текст — до 300 000 символів.</w:t>
       </w:r>
     </w:p>
-    <w:bookmarkEnd w:id="76"/>
-    <w:bookmarkStart w:id="77" w:name="розмітка-markdown"/>
+    <w:bookmarkEnd w:id="78"/>
+    <w:bookmarkStart w:id="79" w:name="розмітка-markdown"/>
     <w:p>
       <w:pPr>
         <w:pStyle w:val="Heading3"/>
@@ -16070,8 +16462,8 @@
         <w:t xml:space="preserve">та подібні не стають посиланнями.</w:t>
       </w:r>
     </w:p>
-    <w:bookmarkEnd w:id="77"/>
-    <w:bookmarkStart w:id="78" w:name="ієрархія-сторінок"/>
+    <w:bookmarkEnd w:id="79"/>
+    <w:bookmarkStart w:id="80" w:name="ієрархія-сторінок"/>
     <w:p>
       <w:pPr>
         <w:pStyle w:val="Heading3"/>
@@ -16241,8 +16633,8 @@
         <w:t xml:space="preserve">Сторінки з імпорту документації лежать на верхньому рівні; їх можна перемістити.</w:t>
       </w:r>
     </w:p>
-    <w:bookmarkEnd w:id="78"/>
-    <w:bookmarkStart w:id="79" w:name="зображення-й-вкладення"/>
+    <w:bookmarkEnd w:id="80"/>
+    <w:bookmarkStart w:id="81" w:name="зображення-й-вкладення"/>
     <w:p>
       <w:pPr>
         <w:pStyle w:val="Heading3"/>
@@ -16623,8 +17015,8 @@
         <w:t xml:space="preserve">- Видалення сторінки видаляє і її файли.</w:t>
       </w:r>
     </w:p>
-    <w:bookmarkEnd w:id="79"/>
-    <w:bookmarkStart w:id="80" w:name="версії-та-одночасне-редагування"/>
+    <w:bookmarkEnd w:id="81"/>
+    <w:bookmarkStart w:id="82" w:name="версії-та-одночасне-редагування"/>
     <w:p>
       <w:pPr>
         <w:pStyle w:val="Heading3"/>
@@ -16817,8 +17209,8 @@
         <w:t xml:space="preserve">— це незворотно (з підтвердженням). Файли, що були на сторінці, в історії старих версій показуватись не будуть.</w:t>
       </w:r>
     </w:p>
-    <w:bookmarkEnd w:id="80"/>
-    <w:bookmarkStart w:id="81" w:name="пошук"/>
+    <w:bookmarkEnd w:id="82"/>
+    <w:bookmarkStart w:id="83" w:name="пошук"/>
     <w:p>
       <w:pPr>
         <w:pStyle w:val="Heading3"/>
@@ -16865,8 +17257,8 @@
         <w:t xml:space="preserve">шукаються буквально). Збіги в назві — вгорі; під кожним результатом — фрагмент тексту з виділенням. Шукаються лише сторінки, видимі вам.</w:t>
       </w:r>
     </w:p>
-    <w:bookmarkEnd w:id="81"/>
-    <w:bookmarkStart w:id="82" w:name="гайди-користувача-й-адміністратора"/>
+    <w:bookmarkEnd w:id="83"/>
+    <w:bookmarkStart w:id="84" w:name="гайди-користувача-й-адміністратора"/>
     <w:p>
       <w:pPr>
         <w:pStyle w:val="Heading3"/>
@@ -17187,8 +17579,8 @@
         <w:t xml:space="preserve">.</w:t>
       </w:r>
     </w:p>
-    <w:bookmarkEnd w:id="82"/>
-    <w:bookmarkStart w:id="83" w:name="журнал-аудиту-1"/>
+    <w:bookmarkEnd w:id="84"/>
+    <w:bookmarkStart w:id="85" w:name="журнал-аудиту-1"/>
     <w:p>
       <w:pPr>
         <w:pStyle w:val="Heading3"/>
@@ -17283,8 +17675,8 @@
         <w:t xml:space="preserve">з іменем файлу; у записах про створення й видалення — батьківська сторінка чи кількість видалених файлів).</w:t>
       </w:r>
     </w:p>
-    <w:bookmarkEnd w:id="83"/>
-    <w:bookmarkStart w:id="84" w:name="діагностика-2"/>
+    <w:bookmarkEnd w:id="85"/>
+    <w:bookmarkStart w:id="86" w:name="діагностика-2"/>
     <w:p>
       <w:pPr>
         <w:pStyle w:val="Heading3"/>
@@ -17858,9 +18250,9 @@
         </w:pict>
       </w:r>
     </w:p>
-    <w:bookmarkEnd w:id="84"/>
-    <w:bookmarkEnd w:id="85"/>
-    <w:bookmarkStart w:id="86" w:name="X3e5ed6a3803716ec9e3910f32ae1df57910a11a"/>
+    <w:bookmarkEnd w:id="86"/>
+    <w:bookmarkEnd w:id="87"/>
+    <w:bookmarkStart w:id="88" w:name="X3e5ed6a3803716ec9e3910f32ae1df57910a11a"/>
     <w:p>
       <w:pPr>
         <w:pStyle w:val="Heading2"/>
@@ -17935,8 +18327,8 @@
         </w:pict>
       </w:r>
     </w:p>
-    <w:bookmarkEnd w:id="86"/>
-    <w:bookmarkStart w:id="87" w:name="типові-адміністративні-сценарії"/>
+    <w:bookmarkEnd w:id="88"/>
+    <w:bookmarkStart w:id="89" w:name="типові-адміністративні-сценарії"/>
     <w:p>
       <w:pPr>
         <w:pStyle w:val="Heading2"/>
@@ -18671,8 +19063,8 @@
         </w:pict>
       </w:r>
     </w:p>
-    <w:bookmarkEnd w:id="87"/>
-    <w:bookmarkStart w:id="91" w:name="X5252d2ceb1ff2d80edc0009821d24961f7fbcc3"/>
+    <w:bookmarkEnd w:id="89"/>
+    <w:bookmarkStart w:id="93" w:name="X5252d2ceb1ff2d80edc0009821d24961f7fbcc3"/>
     <w:p>
       <w:pPr>
         <w:pStyle w:val="Heading2"/>
@@ -18733,7 +19125,7 @@
         <w:t xml:space="preserve">). Помилки, які застосунок обробляє сам («Доступ обмежено», «Сторінку не знайдено», повідомлення форм), цю сторінку не викликають.</w:t>
       </w:r>
     </w:p>
-    <w:bookmarkStart w:id="88" w:name="що-бачить-адміністратор-і-що-решта"/>
+    <w:bookmarkStart w:id="90" w:name="що-бачить-адміністратор-і-що-решта"/>
     <w:p>
       <w:pPr>
         <w:pStyle w:val="Heading3"/>
@@ -18913,8 +19305,8 @@
         <w:t xml:space="preserve">.</w:t>
       </w:r>
     </w:p>
-    <w:bookmarkEnd w:id="88"/>
-    <w:bookmarkStart w:id="89" w:name="журнал-помилок"/>
+    <w:bookmarkEnd w:id="90"/>
+    <w:bookmarkStart w:id="91" w:name="журнал-помилок"/>
     <w:p>
       <w:pPr>
         <w:pStyle w:val="Heading3"/>
@@ -19135,8 +19527,8 @@
         <w:t xml:space="preserve">).</w:t>
       </w:r>
     </w:p>
-    <w:bookmarkEnd w:id="89"/>
-    <w:bookmarkStart w:id="90" w:name="типові-причини-й-що-робити"/>
+    <w:bookmarkEnd w:id="91"/>
+    <w:bookmarkStart w:id="92" w:name="типові-причини-й-що-робити"/>
     <w:p>
       <w:pPr>
         <w:pStyle w:val="Heading3"/>
@@ -19782,9 +20174,9 @@
         </w:pict>
       </w:r>
     </w:p>
-    <w:bookmarkEnd w:id="90"/>
-    <w:bookmarkEnd w:id="91"/>
-    <w:bookmarkStart w:id="98" w:name="rest-api-адмін-панель-налаштування-api"/>
+    <w:bookmarkEnd w:id="92"/>
+    <w:bookmarkEnd w:id="93"/>
+    <w:bookmarkStart w:id="100" w:name="rest-api-адмін-панель-налаштування-api"/>
     <w:p>
       <w:pPr>
         <w:pStyle w:val="Heading2"/>
@@ -19835,7 +20227,7 @@
         <w:t xml:space="preserve">.</w:t>
       </w:r>
     </w:p>
-    <w:bookmarkStart w:id="92" w:name="основні-принципи"/>
+    <w:bookmarkStart w:id="94" w:name="основні-принципи"/>
     <w:p>
       <w:pPr>
         <w:pStyle w:val="Heading3"/>
@@ -20028,8 +20420,8 @@
         <w:t xml:space="preserve">(Адмін-панель → Налаштування → Журнал аудиту): на дії стоїть позначка «Через: api», а автором є власник токена.</w:t>
       </w:r>
     </w:p>
-    <w:bookmarkEnd w:id="92"/>
-    <w:bookmarkStart w:id="93" w:name="увімкнення-й-налаштування"/>
+    <w:bookmarkEnd w:id="94"/>
+    <w:bookmarkStart w:id="95" w:name="увімкнення-й-налаштування"/>
     <w:p>
       <w:pPr>
         <w:pStyle w:val="Heading3"/>
@@ -20200,8 +20592,8 @@
         <w:t xml:space="preserve">).</w:t>
       </w:r>
     </w:p>
-    <w:bookmarkEnd w:id="93"/>
-    <w:bookmarkStart w:id="94" w:name="хто-й-як-створює-токени"/>
+    <w:bookmarkEnd w:id="95"/>
+    <w:bookmarkStart w:id="96" w:name="хто-й-як-створює-токени"/>
     <w:p>
       <w:pPr>
         <w:pStyle w:val="Heading3"/>
@@ -20304,8 +20696,8 @@
         <w:t xml:space="preserve">Не видавайте інтеграції власний токен адміністратора. Створіть окремого користувача («Моніторинг Zabbix», «Бот месенджера») із мінімально потрібною роллю — для створення тікетів достатньо «Заявник» — і видайте токен йому, із терміном дії й правом лише того рівня, який потрібен. У тікетах і журналі аудиту видно, що дію виконала саме інтеграція.</w:t>
       </w:r>
     </w:p>
-    <w:bookmarkEnd w:id="94"/>
-    <w:bookmarkStart w:id="95" w:name="таблиця-всіх-токенів"/>
+    <w:bookmarkEnd w:id="96"/>
+    <w:bookmarkStart w:id="97" w:name="таблиця-всіх-токенів"/>
     <w:p>
       <w:pPr>
         <w:pStyle w:val="Heading3"/>
@@ -20504,8 +20896,8 @@
         <w:t xml:space="preserve">(з підтвердженням) вимикає токен назавжди, і програма, що ним користується, одразу починає отримувати 401. Колонка «Востаннє» допомагає знайти токени, якими ніхто не користується, — їх варто відкликати.</w:t>
       </w:r>
     </w:p>
-    <w:bookmarkEnd w:id="95"/>
-    <w:bookmarkStart w:id="96" w:name="налаштування-веб-сервера"/>
+    <w:bookmarkEnd w:id="97"/>
+    <w:bookmarkStart w:id="98" w:name="налаштування-веб-сервера"/>
     <w:p>
       <w:pPr>
         <w:pStyle w:val="Heading3"/>
@@ -20676,8 +21068,8 @@
         <w:t xml:space="preserve">.</w:t>
       </w:r>
     </w:p>
-    <w:bookmarkEnd w:id="96"/>
-    <w:bookmarkStart w:id="97" w:name="діагностика-3"/>
+    <w:bookmarkEnd w:id="98"/>
+    <w:bookmarkStart w:id="99" w:name="діагностика-3"/>
     <w:p>
       <w:pPr>
         <w:pStyle w:val="Heading3"/>
@@ -21115,9 +21507,9 @@
         </w:pict>
       </w:r>
     </w:p>
-    <w:bookmarkEnd w:id="97"/>
-    <w:bookmarkEnd w:id="98"/>
-    <w:bookmarkStart w:id="105" w:name="X4e8d9a481e0c7a8974994922224a7e01adc5a1a"/>
+    <w:bookmarkEnd w:id="99"/>
+    <w:bookmarkEnd w:id="100"/>
+    <w:bookmarkStart w:id="107" w:name="X4e8d9a481e0c7a8974994922224a7e01adc5a1a"/>
     <w:p>
       <w:pPr>
         <w:pStyle w:val="Heading2"/>
@@ -21168,7 +21560,7 @@
         <w:t xml:space="preserve">, розділ 4.</w:t>
       </w:r>
     </w:p>
-    <w:bookmarkStart w:id="99" w:name="створення-вебхука"/>
+    <w:bookmarkStart w:id="101" w:name="створення-вебхука"/>
     <w:p>
       <w:pPr>
         <w:pStyle w:val="Heading3"/>
@@ -21443,8 +21835,8 @@
         <w:t xml:space="preserve">. Перенаправлення (3xx) система не виконує.</w:t>
       </w:r>
     </w:p>
-    <w:bookmarkEnd w:id="99"/>
-    <w:bookmarkStart w:id="100" w:name="перевірка"/>
+    <w:bookmarkEnd w:id="101"/>
+    <w:bookmarkStart w:id="102" w:name="перевірка"/>
     <w:p>
       <w:pPr>
         <w:pStyle w:val="Heading3"/>
@@ -21492,8 +21884,8 @@
         <w:t xml:space="preserve">одразу, навіть на вимкнений вебхук (щоб перевірити до вмикання), і показує результат: «Тест успішний: одержувач відповів 200» або причину збою. Тестова подія підписана справжнім секретом, тож одержувач може перевірити й підпис.</w:t>
       </w:r>
     </w:p>
-    <w:bookmarkEnd w:id="100"/>
-    <w:bookmarkStart w:id="101" w:name="як-відбувається-доставка"/>
+    <w:bookmarkEnd w:id="102"/>
+    <w:bookmarkStart w:id="103" w:name="як-відбувається-доставка"/>
     <w:p>
       <w:pPr>
         <w:pStyle w:val="Heading3"/>
@@ -21772,8 +22164,8 @@
         <w:t xml:space="preserve">доставки старші за 30 днів видаляються; ті, що понад 3 доби стоять у черзі до вимкненого вебхука, позначаються як невдалі.</w:t>
       </w:r>
     </w:p>
-    <w:bookmarkEnd w:id="101"/>
-    <w:bookmarkStart w:id="102" w:name="журнал-доставок"/>
+    <w:bookmarkEnd w:id="103"/>
+    <w:bookmarkStart w:id="104" w:name="журнал-доставок"/>
     <w:p>
       <w:pPr>
         <w:pStyle w:val="Heading3"/>
@@ -21806,8 +22198,8 @@
         <w:t xml:space="preserve">відправляє невдалу чи очікувану доставку знову одразу й показує результат.</w:t>
       </w:r>
     </w:p>
-    <w:bookmarkEnd w:id="102"/>
-    <w:bookmarkStart w:id="103" w:name="безпека"/>
+    <w:bookmarkEnd w:id="104"/>
+    <w:bookmarkStart w:id="105" w:name="безпека"/>
     <w:p>
       <w:pPr>
         <w:pStyle w:val="Heading3"/>
@@ -21884,8 +22276,8 @@
         <w:t xml:space="preserve">Створення, зміна, вмикання/вимикання, заміна секрету, видалення й автовимкнення вебхуків записуються в журнал аудиту (тип «webhook_endpoint»).</w:t>
       </w:r>
     </w:p>
-    <w:bookmarkEnd w:id="103"/>
-    <w:bookmarkStart w:id="104" w:name="діагностика-4"/>
+    <w:bookmarkEnd w:id="105"/>
+    <w:bookmarkStart w:id="106" w:name="діагностика-4"/>
     <w:p>
       <w:pPr>
         <w:pStyle w:val="Heading3"/>
@@ -22366,9 +22758,9 @@
         </w:pict>
       </w:r>
     </w:p>
-    <w:bookmarkEnd w:id="104"/>
-    <w:bookmarkEnd w:id="105"/>
-    <w:bookmarkStart w:id="115" w:name="бібліотека-документів-меню-документи"/>
+    <w:bookmarkEnd w:id="106"/>
+    <w:bookmarkEnd w:id="107"/>
+    <w:bookmarkStart w:id="117" w:name="бібліотека-документів-меню-документи"/>
     <w:p>
       <w:pPr>
         <w:pStyle w:val="Heading2"/>
@@ -22385,7 +22777,7 @@
         <w:t xml:space="preserve">Спільне сховище файлів, не прив’язаних до тікета чи задачі: регламенти, інструкції, форми, шаблони. Читають усі, хто увійшов (з урахуванням видимості документа); керують адміністратор і керівник ІТ.</w:t>
       </w:r>
     </w:p>
-    <w:bookmarkStart w:id="106" w:name="хто-що-може-2"/>
+    <w:bookmarkStart w:id="108" w:name="хто-що-може-2"/>
     <w:p>
       <w:pPr>
         <w:pStyle w:val="Heading3"/>
@@ -22609,8 +23001,8 @@
         <w:t xml:space="preserve">— ті самі три рівні, що у вікі («Усі, хто увійшов», «Персонал (без заявників)», «Лише адміністратор»). Документ, недоступний користувачеві, не показується ні в списках, ні в пошуку, ні в лічильниках розділів, а за прямою адресою відповідає «не знайдено».</w:t>
       </w:r>
     </w:p>
-    <w:bookmarkEnd w:id="106"/>
-    <w:bookmarkStart w:id="107" w:name="Xba25517d5ef7506ac6c7cd2265f2b945060bb63"/>
+    <w:bookmarkEnd w:id="108"/>
+    <w:bookmarkStart w:id="109" w:name="Xba25517d5ef7506ac6c7cd2265f2b945060bb63"/>
     <w:p>
       <w:pPr>
         <w:pStyle w:val="Heading3"/>
@@ -22764,8 +23156,8 @@
         <w:t xml:space="preserve">фільтрує список. У журналі аудиту видимість документа фіксується при створенні та зміні.</w:t>
       </w:r>
     </w:p>
-    <w:bookmarkEnd w:id="107"/>
-    <w:bookmarkStart w:id="108" w:name="перегляд-word-і-excel-у-браузері-pdf"/>
+    <w:bookmarkEnd w:id="109"/>
+    <w:bookmarkStart w:id="110" w:name="перегляд-word-і-excel-у-браузері-pdf"/>
     <w:p>
       <w:pPr>
         <w:pStyle w:val="Heading3"/>
@@ -23384,8 +23776,8 @@
         <w:t xml:space="preserve">Якщо конвертація не вдалася (файл пошкоджений, завеликий), відкривається коротке повідомлення; завантаження оригіналу працює завжди.</w:t>
       </w:r>
     </w:p>
-    <w:bookmarkEnd w:id="108"/>
-    <w:bookmarkStart w:id="109" w:name="як-це-влаштовано"/>
+    <w:bookmarkEnd w:id="110"/>
+    <w:bookmarkStart w:id="111" w:name="як-це-влаштовано"/>
     <w:p>
       <w:pPr>
         <w:pStyle w:val="Heading3"/>
@@ -23473,8 +23865,8 @@
         <w:t xml:space="preserve">— за назвою й описом, у межах обраного розділу; список розбито на сторінки по 30.</w:t>
       </w:r>
     </w:p>
-    <w:bookmarkEnd w:id="109"/>
-    <w:bookmarkStart w:id="110" w:name="що-приймається-1"/>
+    <w:bookmarkEnd w:id="111"/>
+    <w:bookmarkStart w:id="112" w:name="що-приймається-1"/>
     <w:p>
       <w:pPr>
         <w:pStyle w:val="Heading3"/>
@@ -23553,8 +23945,8 @@
         <w:t xml:space="preserve">).</w:t>
       </w:r>
     </w:p>
-    <w:bookmarkEnd w:id="110"/>
-    <w:bookmarkStart w:id="111" w:name="розмір-і-php-налаштування"/>
+    <w:bookmarkEnd w:id="112"/>
+    <w:bookmarkStart w:id="113" w:name="розмір-і-php-налаштування"/>
     <w:p>
       <w:pPr>
         <w:pStyle w:val="Heading3"/>
@@ -23656,8 +24048,8 @@
         <w:t xml:space="preserve">, система повертає на форму з поясненням, а не з порожньою сторінкою (текст полів у такому разі треба ввести заново).</w:t>
       </w:r>
     </w:p>
-    <w:bookmarkEnd w:id="111"/>
-    <w:bookmarkStart w:id="112" w:name="де-зберігаються-файли-й-резервні-копії"/>
+    <w:bookmarkEnd w:id="113"/>
+    <w:bookmarkStart w:id="114" w:name="де-зберігаються-файли-й-резервні-копії"/>
     <w:p>
       <w:pPr>
         <w:pStyle w:val="Heading3"/>
@@ -23729,8 +24121,8 @@
         <w:t xml:space="preserve">, міграція 024); поки їх немає, сторінка «Документи» показує пояснення «не підготовлено», а решта системи працює.</w:t>
       </w:r>
     </w:p>
-    <w:bookmarkEnd w:id="112"/>
-    <w:bookmarkStart w:id="113" w:name="журнал-аудиту-2"/>
+    <w:bookmarkEnd w:id="114"/>
+    <w:bookmarkStart w:id="115" w:name="журнал-аудиту-2"/>
     <w:p>
       <w:pPr>
         <w:pStyle w:val="Heading3"/>
@@ -23747,8 +24139,8 @@
         <w:t xml:space="preserve">Тип «Документ бібліотеки»: створення, зміна, додавання й видалення версій, видалення документа (з назвою документа й розділом).</w:t>
       </w:r>
     </w:p>
-    <w:bookmarkEnd w:id="113"/>
-    <w:bookmarkStart w:id="114" w:name="діагностика-5"/>
+    <w:bookmarkEnd w:id="115"/>
+    <w:bookmarkStart w:id="116" w:name="діагностика-5"/>
     <w:p>
       <w:pPr>
         <w:pStyle w:val="Heading3"/>
@@ -24203,9 +24595,9 @@
         </w:pict>
       </w:r>
     </w:p>
-    <w:bookmarkEnd w:id="114"/>
-    <w:bookmarkEnd w:id="115"/>
-    <w:bookmarkStart w:id="123" w:name="форум-меню-форум"/>
+    <w:bookmarkEnd w:id="116"/>
+    <w:bookmarkEnd w:id="117"/>
+    <w:bookmarkStart w:id="125" w:name="форум-меню-форум"/>
     <w:p>
       <w:pPr>
         <w:pStyle w:val="Heading2"/>
@@ -24222,7 +24614,7 @@
         <w:t xml:space="preserve">Обговорення між співробітниками: розділи → теми → повідомлення (Markdown, без картинок і HTML). Читають і пишуть усі, хто бачить розділ; модерують адміністратор і керівник ІТ.</w:t>
       </w:r>
     </w:p>
-    <w:bookmarkStart w:id="116" w:name="хто-що-може-3"/>
+    <w:bookmarkStart w:id="118" w:name="хто-що-може-3"/>
     <w:p>
       <w:pPr>
         <w:pStyle w:val="Heading3"/>
@@ -24392,8 +24784,8 @@
         </w:tc>
       </w:tr>
     </w:tbl>
-    <w:bookmarkEnd w:id="116"/>
-    <w:bookmarkStart w:id="117" w:name="розділи"/>
+    <w:bookmarkEnd w:id="118"/>
+    <w:bookmarkStart w:id="119" w:name="розділи"/>
     <w:p>
       <w:pPr>
         <w:pStyle w:val="Heading3"/>
@@ -24500,8 +24892,8 @@
         <w:t xml:space="preserve">: прихований розділ не потрапляє ні в списки, ні в пошук, ні в лічильники, а за прямою адресою відповідає «не знайдено». Видалення розділу видаляє всі його теми й повідомлення (з підтвердженням) — незворотно.</w:t>
       </w:r>
     </w:p>
-    <w:bookmarkEnd w:id="117"/>
-    <w:bookmarkStart w:id="118" w:name="теми-й-повідомлення"/>
+    <w:bookmarkEnd w:id="119"/>
+    <w:bookmarkStart w:id="120" w:name="теми-й-повідомлення"/>
     <w:p>
       <w:pPr>
         <w:pStyle w:val="Heading3"/>
@@ -24594,8 +24986,8 @@
         <w:t xml:space="preserve">— за заголовками й текстом, лише в доступних користувачеві розділах.</w:t>
       </w:r>
     </w:p>
-    <w:bookmarkEnd w:id="118"/>
-    <w:bookmarkStart w:id="119" w:name="захист-від-засмічення"/>
+    <w:bookmarkEnd w:id="120"/>
+    <w:bookmarkStart w:id="121" w:name="захист-від-засмічення"/>
     <w:p>
       <w:pPr>
         <w:pStyle w:val="Heading3"/>
@@ -24656,8 +25048,8 @@
         <w:t xml:space="preserve">, розділ 22). Ліміт рахується за користувачем, а не за IP. Модератори підпадають під нього так само.</w:t>
       </w:r>
     </w:p>
-    <w:bookmarkEnd w:id="119"/>
-    <w:bookmarkStart w:id="120" w:name="email-сповіщення"/>
+    <w:bookmarkEnd w:id="121"/>
+    <w:bookmarkStart w:id="122" w:name="email-сповіщення"/>
     <w:p>
       <w:pPr>
         <w:pStyle w:val="Heading3"/>
@@ -24674,8 +25066,8 @@
         <w:t xml:space="preserve">Окрема галочка «Сповіщення про форум» на сторінці «Пошта → тікети» (розділ 10, блок «Email-сповіщення про активність»): лист про нову відповідь отримують автор теми й ті, хто в ній писав, а про нову тему — підписники розділу. Вимкнено за замовчуванням і заблоковано, поки не налаштовано SMTP.</w:t>
       </w:r>
     </w:p>
-    <w:bookmarkEnd w:id="120"/>
-    <w:bookmarkStart w:id="121" w:name="журнал-аудиту-3"/>
+    <w:bookmarkEnd w:id="122"/>
+    <w:bookmarkStart w:id="123" w:name="журнал-аудиту-3"/>
     <w:p>
       <w:pPr>
         <w:pStyle w:val="Heading3"/>
@@ -24692,8 +25084,8 @@
         <w:t xml:space="preserve">Типи «Тема форуму» і «Розділ форуму»: створення, зміни, закріплення, закриття, перенесення (з назвами розділів «З розділу»/«До розділу»), видалення тем і повідомлень, невдалі сповіщення.</w:t>
       </w:r>
     </w:p>
-    <w:bookmarkEnd w:id="121"/>
-    <w:bookmarkStart w:id="122" w:name="діагностика-6"/>
+    <w:bookmarkEnd w:id="123"/>
+    <w:bookmarkStart w:id="124" w:name="діагностика-6"/>
     <w:p>
       <w:pPr>
         <w:pStyle w:val="Heading3"/>
@@ -25048,9 +25440,9 @@
         </w:pict>
       </w:r>
     </w:p>
-    <w:bookmarkEnd w:id="122"/>
-    <w:bookmarkEnd w:id="123"/>
-    <w:bookmarkStart w:id="129" w:name="обмеження-частоти-запитів-rate-limiting"/>
+    <w:bookmarkEnd w:id="124"/>
+    <w:bookmarkEnd w:id="125"/>
+    <w:bookmarkStart w:id="131" w:name="обмеження-частоти-запитів-rate-limiting"/>
     <w:p>
       <w:pPr>
         <w:pStyle w:val="Heading2"/>
@@ -25121,7 +25513,7 @@
         <w:t xml:space="preserve">.</w:t>
       </w:r>
     </w:p>
-    <w:bookmarkStart w:id="124" w:name="що-обмежується"/>
+    <w:bookmarkStart w:id="126" w:name="що-обмежується"/>
     <w:p>
       <w:pPr>
         <w:pStyle w:val="Heading3"/>
@@ -25475,8 +25867,8 @@
         <w:t xml:space="preserve">правила дії. Це «фіксоване вікно»: після закінчення вікна лічильник скидається. Для IPv6 враховується підмережа /64 (одна «домашня» мережа — одне джерело).</w:t>
       </w:r>
     </w:p>
-    <w:bookmarkEnd w:id="124"/>
-    <w:bookmarkStart w:id="125" w:name="що-бачить-користувач"/>
+    <w:bookmarkEnd w:id="126"/>
+    <w:bookmarkStart w:id="127" w:name="що-бачить-користувач"/>
     <w:p>
       <w:pPr>
         <w:pStyle w:val="Heading3"/>
@@ -25520,8 +25912,8 @@
         <w:t xml:space="preserve">ця сторінка показується навіть для правильного посилання — до кінця вікна). Форум показує помилку у формі, а введений текст не втрачається.</w:t>
       </w:r>
     </w:p>
-    <w:bookmarkEnd w:id="125"/>
-    <w:bookmarkStart w:id="126" w:name="налаштування-в-.env"/>
+    <w:bookmarkEnd w:id="127"/>
+    <w:bookmarkStart w:id="128" w:name="налаштування-в-.env"/>
     <w:p>
       <w:pPr>
         <w:pStyle w:val="Heading3"/>
@@ -25773,8 +26165,8 @@
         <w:t xml:space="preserve">).</w:t>
       </w:r>
     </w:p>
-    <w:bookmarkEnd w:id="126"/>
-    <w:bookmarkStart w:id="127" w:name="збій-лічильника"/>
+    <w:bookmarkEnd w:id="128"/>
+    <w:bookmarkStart w:id="129" w:name="збій-лічильника"/>
     <w:p>
       <w:pPr>
         <w:pStyle w:val="Heading3"/>
@@ -25846,8 +26238,8 @@
         <w:t xml:space="preserve">, міграція 023).</w:t>
       </w:r>
     </w:p>
-    <w:bookmarkEnd w:id="127"/>
-    <w:bookmarkStart w:id="128" w:name="діагностика-7"/>
+    <w:bookmarkEnd w:id="129"/>
+    <w:bookmarkStart w:id="130" w:name="діагностика-7"/>
     <w:p>
       <w:pPr>
         <w:pStyle w:val="Heading3"/>
@@ -26136,9 +26528,9 @@
         </w:pict>
       </w:r>
     </w:p>
-    <w:bookmarkEnd w:id="128"/>
-    <w:bookmarkEnd w:id="129"/>
-    <w:bookmarkStart w:id="138" w:name="X859f047d3505a4eefc6135ede04b1f1a15af0ff"/>
+    <w:bookmarkEnd w:id="130"/>
+    <w:bookmarkEnd w:id="131"/>
+    <w:bookmarkStart w:id="140" w:name="X859f047d3505a4eefc6135ede04b1f1a15af0ff"/>
     <w:p>
       <w:pPr>
         <w:pStyle w:val="Heading2"/>
@@ -26171,7 +26563,7 @@
         <w:t xml:space="preserve">— за своїм обліковим записом Windows (Kerberos/SPNEGO, «інтегрована автентифікація»). Вхід формою з email і паролем лишається завжди: SSO — додаткова кнопка, а не заміна.</w:t>
       </w:r>
     </w:p>
-    <w:bookmarkStart w:id="130" w:name="як-це-влаштовано-1"/>
+    <w:bookmarkStart w:id="132" w:name="як-це-влаштовано-1"/>
     <w:p>
       <w:pPr>
         <w:pStyle w:val="Heading3"/>
@@ -26419,8 +26811,8 @@
         <w:t xml:space="preserve">.</w:t>
       </w:r>
     </w:p>
-    <w:bookmarkEnd w:id="130"/>
-    <w:bookmarkStart w:id="131" w:name="вимоги"/>
+    <w:bookmarkEnd w:id="132"/>
+    <w:bookmarkStart w:id="133" w:name="вимоги"/>
     <w:p>
       <w:pPr>
         <w:pStyle w:val="Heading3"/>
@@ -26552,8 +26944,8 @@
         <w:t xml:space="preserve">і keytab-файл.</w:t>
       </w:r>
     </w:p>
-    <w:bookmarkEnd w:id="131"/>
-    <w:bookmarkStart w:id="132" w:name="X35d31196181d4ce29e9dad33b3c9d4656f6aa07"/>
+    <w:bookmarkEnd w:id="133"/>
+    <w:bookmarkStart w:id="134" w:name="X35d31196181d4ce29e9dad33b3c9d4656f6aa07"/>
     <w:p>
       <w:pPr>
         <w:pStyle w:val="Heading3"/>
@@ -26676,8 +27068,8 @@
         <w:t xml:space="preserve">.</w:t>
       </w:r>
     </w:p>
-    <w:bookmarkEnd w:id="132"/>
-    <w:bookmarkStart w:id="133" w:name="крок-2.-apache"/>
+    <w:bookmarkEnd w:id="134"/>
+    <w:bookmarkStart w:id="135" w:name="крок-2.-apache"/>
     <w:p>
       <w:pPr>
         <w:pStyle w:val="Heading3"/>
@@ -26843,8 +27235,8 @@
         <w:t xml:space="preserve">.</w:t>
       </w:r>
     </w:p>
-    <w:bookmarkEnd w:id="133"/>
-    <w:bookmarkStart w:id="134" w:name="крок-3.-застосунок"/>
+    <w:bookmarkEnd w:id="135"/>
+    <w:bookmarkStart w:id="136" w:name="крок-3.-застосунок"/>
     <w:p>
       <w:pPr>
         <w:pStyle w:val="Heading3"/>
@@ -26962,8 +27354,8 @@
         <w:t xml:space="preserve">діє одразу (перезапуск PHP-FPM зазвичай не потрібен).</w:t>
       </w:r>
     </w:p>
-    <w:bookmarkEnd w:id="134"/>
-    <w:bookmarkStart w:id="135" w:name="крок-4.-браузери"/>
+    <w:bookmarkEnd w:id="136"/>
+    <w:bookmarkStart w:id="137" w:name="крок-4.-браузери"/>
     <w:p>
       <w:pPr>
         <w:pStyle w:val="Heading3"/>
@@ -27079,8 +27471,8 @@
         <w:t xml:space="preserve">(теж можна політикою).</w:t>
       </w:r>
     </w:p>
-    <w:bookmarkEnd w:id="135"/>
-    <w:bookmarkStart w:id="136" w:name="діагностика-8"/>
+    <w:bookmarkEnd w:id="137"/>
+    <w:bookmarkStart w:id="138" w:name="діагностика-8"/>
     <w:p>
       <w:pPr>
         <w:pStyle w:val="Heading3"/>
@@ -27453,8 +27845,8 @@
         </w:tc>
       </w:tr>
     </w:tbl>
-    <w:bookmarkEnd w:id="136"/>
-    <w:bookmarkStart w:id="137" w:name="безпека-1"/>
+    <w:bookmarkEnd w:id="138"/>
+    <w:bookmarkStart w:id="139" w:name="безпека-1"/>
     <w:p>
       <w:pPr>
         <w:pStyle w:val="Heading3"/>
@@ -27607,9 +27999,9 @@
         </w:pict>
       </w:r>
     </w:p>
-    <w:bookmarkEnd w:id="137"/>
-    <w:bookmarkEnd w:id="138"/>
-    <w:bookmarkStart w:id="145" w:name="роль-адміністратор-підрозділу"/>
+    <w:bookmarkEnd w:id="139"/>
+    <w:bookmarkEnd w:id="140"/>
+    <w:bookmarkStart w:id="147" w:name="роль-адміністратор-підрозділу"/>
     <w:p>
       <w:pPr>
         <w:pStyle w:val="Heading2"/>
@@ -27654,7 +28046,7 @@
         <w:t xml:space="preserve">.</w:t>
       </w:r>
     </w:p>
-    <w:bookmarkStart w:id="139" w:name="що-таке-свій-підрозділ"/>
+    <w:bookmarkStart w:id="141" w:name="що-таке-свій-підрозділ"/>
     <w:p>
       <w:pPr>
         <w:pStyle w:val="Heading3"/>
@@ -27884,8 +28276,8 @@
         <w:t xml:space="preserve">, один OU з такою назвою) не вважається вкладеною в «Kyiv».</w:t>
       </w:r>
     </w:p>
-    <w:bookmarkEnd w:id="139"/>
-    <w:bookmarkStart w:id="140" w:name="X7393d07096a0a36ea35625d8e0d303dbf85b0ba"/>
+    <w:bookmarkEnd w:id="141"/>
+    <w:bookmarkStart w:id="142" w:name="X7393d07096a0a36ea35625d8e0d303dbf85b0ba"/>
     <w:p>
       <w:pPr>
         <w:pStyle w:val="Heading3"/>
@@ -27955,7 +28347,7 @@
         <w:t xml:space="preserve">/unit/manage</w:t>
       </w:r>
       <w:r>
-        <w:t xml:space="preserve">) — Проєкти; Задачі, Канбан, Гант, Облік часу; Тікети, Черги тікетів, Звіт по тікетах, CSAT.</w:t>
+        <w:t xml:space="preserve">) — Проєкти; Задачі, Канбан, Гант, Облік часу; Тікети, Черги тікетів, Автоматичні правила черги, Звіт по тікетах, CSAT.</w:t>
       </w:r>
     </w:p>
     <w:p>
@@ -28079,8 +28471,8 @@
         <w:t xml:space="preserve">(автор, відповідальний, учасники, виконавці й автори задач, ті, хто вів облік часу). Якщо проєкт створено не вами і в ньому є хоч одна людина з іншого підрозділу, замість кнопки показано пояснення — такий проєкт видаляє лише адміністратор системи. Видалення потрапляє в журнал аудиту.</w:t>
       </w:r>
     </w:p>
-    <w:bookmarkEnd w:id="140"/>
-    <w:bookmarkStart w:id="141" w:name="що-бачить-і-може"/>
+    <w:bookmarkEnd w:id="142"/>
+    <w:bookmarkStart w:id="143" w:name="що-бачить-і-може"/>
     <w:p>
       <w:pPr>
         <w:pStyle w:val="Heading3"/>
@@ -28339,6 +28731,70 @@
               <w:jc w:val="left"/>
             </w:pPr>
             <w:r>
+              <w:t xml:space="preserve">Автоматичні правила черги</w:t>
+            </w:r>
+          </w:p>
+        </w:tc>
+        <w:tc>
+          <w:tcPr/>
+          <w:p>
+            <w:pPr>
+              <w:pStyle w:val="Compact"/>
+              <w:jc w:val="left"/>
+            </w:pPr>
+            <w:r>
+              <w:t xml:space="preserve">Картка</w:t>
+            </w:r>
+            <w:r>
+              <w:t xml:space="preserve"> </w:t>
+            </w:r>
+            <w:r>
+              <w:rPr>
+                <w:bCs/>
+                <w:b/>
+              </w:rPr>
+              <w:t xml:space="preserve">«Керування → Автоматичні правила черги»</w:t>
+            </w:r>
+            <w:r>
+              <w:t xml:space="preserve"> </w:t>
+            </w:r>
+            <w:r>
+              <w:t xml:space="preserve">(</w:t>
+            </w:r>
+            <w:r>
+              <w:rPr>
+                <w:rStyle w:val="VerbatimChar"/>
+              </w:rPr>
+              <w:t xml:space="preserve">/unit/ticket-rules</w:t>
+            </w:r>
+            <w:r>
+              <w:t xml:space="preserve">) —</w:t>
+            </w:r>
+            <w:r>
+              <w:t xml:space="preserve"> </w:t>
+            </w:r>
+            <w:r>
+              <w:rPr>
+                <w:bCs/>
+                <w:b/>
+              </w:rPr>
+              <w:t xml:space="preserve">лише перегляд</w:t>
+            </w:r>
+            <w:r>
+              <w:t xml:space="preserve">: правила створює, змінює й видаляє тільки адміністратор системи. Тут видно правила, налаштовані на вас і на працівників вашого підрозділу (оператор у правилі — з вашого підрозділу), а також ваші раніше створені правила (вони продовжують діяти; змінити їх може адміністратор системи).</w:t>
+            </w:r>
+          </w:p>
+        </w:tc>
+      </w:tr>
+      <w:tr>
+        <w:tc>
+          <w:tcPr/>
+          <w:p>
+            <w:pPr>
+              <w:pStyle w:val="Compact"/>
+              <w:jc w:val="left"/>
+            </w:pPr>
+            <w:r>
               <w:t xml:space="preserve">Звіт по тікетах</w:t>
             </w:r>
           </w:p>
@@ -28613,8 +29069,8 @@
         </w:tc>
       </w:tr>
     </w:tbl>
-    <w:bookmarkEnd w:id="141"/>
-    <w:bookmarkStart w:id="142" w:name="керування-користувачами-підрозділу-межі"/>
+    <w:bookmarkEnd w:id="143"/>
+    <w:bookmarkStart w:id="144" w:name="керування-користувачами-підрозділу-межі"/>
     <w:p>
       <w:pPr>
         <w:pStyle w:val="Heading3"/>
@@ -28864,8 +29320,8 @@
         <w:t xml:space="preserve">.</w:t>
       </w:r>
     </w:p>
-    <w:bookmarkEnd w:id="142"/>
-    <w:bookmarkStart w:id="143" w:name="як-призначити-роль"/>
+    <w:bookmarkEnd w:id="144"/>
+    <w:bookmarkStart w:id="145" w:name="як-призначити-роль"/>
     <w:p>
       <w:pPr>
         <w:pStyle w:val="Heading3"/>
@@ -28957,8 +29413,8 @@
         <w:t xml:space="preserve">) із роллю «Адміністратор Підрозділу». Роль виставляється синхронізацією; межі підрозділу беруться з OU самого користувача.</w:t>
       </w:r>
     </w:p>
-    <w:bookmarkEnd w:id="143"/>
-    <w:bookmarkStart w:id="144" w:name="відомі-обмеження"/>
+    <w:bookmarkEnd w:id="145"/>
+    <w:bookmarkStart w:id="146" w:name="відомі-обмеження"/>
     <w:p>
       <w:pPr>
         <w:pStyle w:val="Heading3"/>
@@ -29046,9 +29502,9 @@
         </w:pict>
       </w:r>
     </w:p>
-    <w:bookmarkEnd w:id="144"/>
-    <w:bookmarkEnd w:id="145"/>
-    <w:bookmarkStart w:id="146" w:name="X476eabd95593f1face329201dc8285c1cf57860"/>
+    <w:bookmarkEnd w:id="146"/>
+    <w:bookmarkEnd w:id="147"/>
+    <w:bookmarkStart w:id="148" w:name="X476eabd95593f1face329201dc8285c1cf57860"/>
     <w:p>
       <w:pPr>
         <w:pStyle w:val="Heading2"/>
@@ -30485,8 +30941,8 @@
         </w:pict>
       </w:r>
     </w:p>
-    <w:bookmarkEnd w:id="146"/>
-    <w:bookmarkStart w:id="147" w:name="часовий-пояс"/>
+    <w:bookmarkEnd w:id="148"/>
+    <w:bookmarkStart w:id="149" w:name="часовий-пояс"/>
     <w:p>
       <w:pPr>
         <w:pStyle w:val="Heading2"/>
@@ -30790,8 +31246,8 @@
         </w:pict>
       </w:r>
     </w:p>
-    <w:bookmarkEnd w:id="147"/>
-    <w:bookmarkStart w:id="148" w:name="глобальний-пошук"/>
+    <w:bookmarkEnd w:id="149"/>
+    <w:bookmarkStart w:id="150" w:name="глобальний-пошук"/>
     <w:p>
       <w:pPr>
         <w:pStyle w:val="Heading2"/>
@@ -30970,8 +31426,8 @@
         </w:pict>
       </w:r>
     </w:p>
-    <w:bookmarkEnd w:id="148"/>
-    <w:bookmarkStart w:id="149" w:name="підзадачі-та-чек-листи"/>
+    <w:bookmarkEnd w:id="150"/>
+    <w:bookmarkStart w:id="151" w:name="підзадачі-та-чек-листи"/>
     <w:p>
       <w:pPr>
         <w:pStyle w:val="Heading2"/>
@@ -31264,8 +31720,8 @@
         </w:pict>
       </w:r>
     </w:p>
-    <w:bookmarkEnd w:id="149"/>
-    <w:bookmarkStart w:id="150" w:name="шаблони-проєктів-і-задач"/>
+    <w:bookmarkEnd w:id="151"/>
+    <w:bookmarkStart w:id="152" w:name="шаблони-проєктів-і-задач"/>
     <w:p>
       <w:pPr>
         <w:pStyle w:val="Heading2"/>
@@ -31497,8 +31953,8 @@
         </w:pict>
       </w:r>
     </w:p>
-    <w:bookmarkEnd w:id="150"/>
-    <w:bookmarkStart w:id="151" w:name="активні-сесії-та-журнал-входів"/>
+    <w:bookmarkEnd w:id="152"/>
+    <w:bookmarkStart w:id="153" w:name="активні-сесії-та-журнал-входів"/>
     <w:p>
       <w:pPr>
         <w:pStyle w:val="Heading2"/>
@@ -31907,8 +32363,8 @@
         </w:pict>
       </w:r>
     </w:p>
-    <w:bookmarkEnd w:id="151"/>
-    <w:bookmarkStart w:id="152" w:name="міграції-бд-і-структура-update.sh"/>
+    <w:bookmarkEnd w:id="153"/>
+    <w:bookmarkStart w:id="154" w:name="міграції-бд-і-структура-update.sh"/>
     <w:p>
       <w:pPr>
         <w:pStyle w:val="Heading2"/>
@@ -32827,8 +33283,211 @@
         <w:t xml:space="preserve">зупиниться з відповідним повідомленням.</w:t>
       </w:r>
     </w:p>
-    <w:bookmarkEnd w:id="152"/>
-    <w:bookmarkEnd w:id="153"/>
+    <w:bookmarkEnd w:id="154"/>
+    <w:bookmarkStart w:id="155" w:name="X7a40e65be9a3fe1c19754e51655eecca92cf480"/>
+    <w:p>
+      <w:pPr>
+        <w:pStyle w:val="Heading2"/>
+      </w:pPr>
+      <w:r>
+        <w:t xml:space="preserve">32. Реєстр обладнання й ПЗ (меню «Активи» (адреса</w:t>
+      </w:r>
+      <w:r>
+        <w:t xml:space="preserve"> </w:t>
+      </w:r>
+      <w:r>
+        <w:rPr>
+          <w:rStyle w:val="VerbatimChar"/>
+        </w:rPr>
+        <w:t xml:space="preserve">/it-assets</w:t>
+      </w:r>
+      <w:r>
+        <w:t xml:space="preserve">))</w:t>
+      </w:r>
+    </w:p>
+    <w:p>
+      <w:pPr>
+        <w:pStyle w:val="FirstParagraph"/>
+      </w:pPr>
+      <w:r>
+        <w:t xml:space="preserve">Мінімальний облік ІТ-активів. Доступ: адміністратор, менеджер ІТ, оператори підтримки — усі активи; адміністратор підрозділу — активи, власники яких у його підрозділі, та створені ним; інші ролі — 403. Видаляти картки можуть лише адміністратор і менеджер ІТ.</w:t>
+      </w:r>
+    </w:p>
+    <w:p>
+      <w:pPr>
+        <w:pStyle w:val="BodyText"/>
+      </w:pPr>
+      <w:r>
+        <w:rPr>
+          <w:bCs/>
+          <w:b/>
+        </w:rPr>
+        <w:t xml:space="preserve">Картка:</w:t>
+      </w:r>
+      <w:r>
+        <w:t xml:space="preserve"> </w:t>
+      </w:r>
+      <w:r>
+        <w:t xml:space="preserve">тип (комп’ютер, ноутбук, сервер, мережеве обладнання, принтер/МФП, монітор, ДБЖ, мобільний пристрій, ПЗ, інше), назва, інвентарний № (унікальний), серійний №, виробник, модель, статус (використовується / на складі / ремонт / списано), власник, місце, ІП (IP-адреса, ім’я хоста, MAC), дата придбання, гарантія до, примітки.</w:t>
+      </w:r>
+    </w:p>
+    <w:p>
+      <w:pPr>
+        <w:pStyle w:val="BodyText"/>
+      </w:pPr>
+      <w:r>
+        <w:rPr>
+          <w:bCs/>
+          <w:b/>
+        </w:rPr>
+        <w:t xml:space="preserve">Зв’язки:</w:t>
+      </w:r>
+      <w:r>
+        <w:t xml:space="preserve"> </w:t>
+      </w:r>
+      <w:r>
+        <w:t xml:space="preserve">«підключено до», «встановлено на», «входить до» — у картці активу; зворотний зв’язок показується автоматично.</w:t>
+      </w:r>
+    </w:p>
+    <w:p>
+      <w:pPr>
+        <w:pStyle w:val="BodyText"/>
+      </w:pPr>
+      <w:r>
+        <w:rPr>
+          <w:bCs/>
+          <w:b/>
+        </w:rPr>
+        <w:t xml:space="preserve">Тікети:</w:t>
+      </w:r>
+      <w:r>
+        <w:t xml:space="preserve"> </w:t>
+      </w:r>
+      <w:r>
+        <w:t xml:space="preserve">актив прив’язується до тікета з картки активу або з блоку «Активи» на сторінці тікета; подія пишеться в журнал обох об’єктів.</w:t>
+      </w:r>
+    </w:p>
+    <w:p>
+      <w:pPr>
+        <w:pStyle w:val="BodyText"/>
+      </w:pPr>
+      <w:r>
+        <w:rPr>
+          <w:bCs/>
+          <w:b/>
+        </w:rPr>
+        <w:t xml:space="preserve">Журнал змін:</w:t>
+      </w:r>
+      <w:r>
+        <w:t xml:space="preserve"> </w:t>
+      </w:r>
+      <w:r>
+        <w:t xml:space="preserve">у картці — що, коли і ким змінено (старе → нове значення).</w:t>
+      </w:r>
+    </w:p>
+    <w:p>
+      <w:pPr>
+        <w:pStyle w:val="BodyText"/>
+      </w:pPr>
+      <w:r>
+        <w:rPr>
+          <w:bCs/>
+          <w:b/>
+        </w:rPr>
+        <w:t xml:space="preserve">Імпорт/експорт:</w:t>
+      </w:r>
+      <w:r>
+        <w:t xml:space="preserve"> </w:t>
+      </w:r>
+      <w:r>
+        <w:t xml:space="preserve">«Експорт» (XLSX/CSV, з урахуванням фільтрів), «Шаблон», «Імпорт» (.xlsx або .csv UTF-8/Windows-1251,</w:t>
+      </w:r>
+      <w:r>
+        <w:t xml:space="preserve"> </w:t>
+      </w:r>
+      <w:r>
+        <w:rPr>
+          <w:rStyle w:val="VerbatimChar"/>
+        </w:rPr>
+        <w:t xml:space="preserve">;</w:t>
+      </w:r>
+      <w:r>
+        <w:t xml:space="preserve"> </w:t>
+      </w:r>
+      <w:r>
+        <w:t xml:space="preserve">або</w:t>
+      </w:r>
+      <w:r>
+        <w:t xml:space="preserve"> </w:t>
+      </w:r>
+      <w:r>
+        <w:rPr>
+          <w:rStyle w:val="VerbatimChar"/>
+        </w:rPr>
+        <w:t xml:space="preserve">,</w:t>
+      </w:r>
+      <w:r>
+        <w:t xml:space="preserve">, до 2000 рядків). Рядок з наявним інвентарним № оновлює картку, інакше створює нову; помилки показуються по рядках. Тип і статус — як у довіднику (наприклад «Принтер / МФП»), власник — за email. Адмін підрозділу не може імпортувати чужі картки та власників поза підрозділом.</w:t>
+      </w:r>
+    </w:p>
+    <w:p>
+      <w:pPr>
+        <w:pStyle w:val="BodyText"/>
+      </w:pPr>
+      <w:r>
+        <w:rPr>
+          <w:bCs/>
+          <w:b/>
+        </w:rPr>
+        <w:t xml:space="preserve">Імпорт ПЗ:</w:t>
+      </w:r>
+      <w:r>
+        <w:t xml:space="preserve"> </w:t>
+      </w:r>
+      <w:r>
+        <w:t xml:space="preserve">на сторінці імпорту є окрема картка «Імпорт ПЗ» зі своїм шаблоном (Назва, Версія, Виробник, Інвентарний №, Ліцензійний ключ / серійний №, Статус, Власник, Встановлено на (інв. № пристрою), Дата придбання, Ліцензія до, Примітки). Усі рядки створюються з типом «ПЗ»; версія пишеться в «Модель», «Ліцензія до» — у «Гарантія до»; якщо вказано інв. № пристрою, автоматично додається зв’язок «встановлено на». Рядок з наявним інв. № ПЗ оновлюється.</w:t>
+      </w:r>
+    </w:p>
+    <w:p>
+      <w:pPr>
+        <w:pStyle w:val="BodyText"/>
+      </w:pPr>
+      <w:r>
+        <w:t xml:space="preserve">Обмеження: ПЗ — лише тип картки (без обліку ліцензій), сповіщень про завершення гарантії немає (фільтр «гарантія спливає/сплила» у списку).</w:t>
+      </w:r>
+    </w:p>
+    <w:p>
+      <w:pPr>
+        <w:pStyle w:val="BodyText"/>
+      </w:pPr>
+      <w:r>
+        <w:rPr>
+          <w:bCs/>
+          <w:b/>
+        </w:rPr>
+        <w:t xml:space="preserve">Особисте меню.</w:t>
+      </w:r>
+      <w:r>
+        <w:t xml:space="preserve"> </w:t>
+      </w:r>
+      <w:r>
+        <w:t xml:space="preserve">Кожен користувач може сховати з верхнього меню розділи Активи, Архів, Вікі, Документи, Форум (Профіль → Меню, міграція 048, таблиця</w:t>
+      </w:r>
+      <w:r>
+        <w:t xml:space="preserve"> </w:t>
+      </w:r>
+      <w:r>
+        <w:rPr>
+          <w:rStyle w:val="VerbatimChar"/>
+        </w:rPr>
+        <w:t xml:space="preserve">user_menu_prefs</w:t>
+      </w:r>
+      <w:r>
+        <w:t xml:space="preserve">). Це не обмеження доступу — лише відображення пункту меню.</w:t>
+      </w:r>
+    </w:p>
+    <w:bookmarkEnd w:id="155"/>
+    <w:bookmarkEnd w:id="156"/>
     <w:sectPr/>
   </w:body>
 </w:document>

</xml_diff>